<commit_message>
finished preventive maintenance creation
</commit_message>
<xml_diff>
--- a/public/IEPMC.docx
+++ b/public/IEPMC.docx
@@ -125,6 +125,7 @@
         </w:rPr>
         <w:t>{</w:t>
       </w:r>
+      <w:proofErr w:type="spellStart"/>
       <w:r>
         <w:rPr>
           <w:rFonts w:ascii="Times New Roman" w:eastAsia="Times New Roman" w:hAnsi="Times New Roman" w:cs="Times New Roman"/>
@@ -135,6 +136,7 @@
         </w:rPr>
         <w:t>document_number</w:t>
       </w:r>
+      <w:proofErr w:type="spellEnd"/>
       <w:r>
         <w:rPr>
           <w:rFonts w:ascii="Times New Roman" w:eastAsia="Times New Roman" w:hAnsi="Times New Roman" w:cs="Times New Roman"/>
@@ -172,15 +174,6 @@
         </w:rPr>
         <w:tab/>
       </w:r>
-      <w:r>
-        <w:rPr>
-          <w:rFonts w:ascii="Times New Roman" w:eastAsia="Times New Roman" w:hAnsi="Times New Roman" w:cs="Times New Roman"/>
-          <w:sz w:val="24"/>
-          <w:szCs w:val="24"/>
-          <w:lang w:eastAsia="en-PH"/>
-        </w:rPr>
-        <w:tab/>
-      </w:r>
     </w:p>
     <w:p>
       <w:pPr>
@@ -261,6 +254,7 @@
         </w:rPr>
         <w:t>{</w:t>
       </w:r>
+      <w:proofErr w:type="spellStart"/>
       <w:r>
         <w:rPr>
           <w:rFonts w:ascii="Times New Roman" w:eastAsia="Times New Roman" w:hAnsi="Times New Roman" w:cs="Times New Roman"/>
@@ -271,6 +265,7 @@
         </w:rPr>
         <w:t>property_number</w:t>
       </w:r>
+      <w:proofErr w:type="spellEnd"/>
       <w:r>
         <w:rPr>
           <w:rFonts w:ascii="Times New Roman" w:eastAsia="Times New Roman" w:hAnsi="Times New Roman" w:cs="Times New Roman"/>
@@ -347,7 +342,29 @@
           <w:u w:val="single"/>
           <w:lang w:eastAsia="en-PH"/>
         </w:rPr>
-        <w:t>{issued_to}</w:t>
+        <w:t>{</w:t>
+      </w:r>
+      <w:proofErr w:type="spellStart"/>
+      <w:r>
+        <w:rPr>
+          <w:rFonts w:ascii="Times New Roman" w:eastAsia="Times New Roman" w:hAnsi="Times New Roman" w:cs="Times New Roman"/>
+          <w:sz w:val="24"/>
+          <w:szCs w:val="24"/>
+          <w:u w:val="single"/>
+          <w:lang w:eastAsia="en-PH"/>
+        </w:rPr>
+        <w:t>issued_to</w:t>
+      </w:r>
+      <w:proofErr w:type="spellEnd"/>
+      <w:r>
+        <w:rPr>
+          <w:rFonts w:ascii="Times New Roman" w:eastAsia="Times New Roman" w:hAnsi="Times New Roman" w:cs="Times New Roman"/>
+          <w:sz w:val="24"/>
+          <w:szCs w:val="24"/>
+          <w:u w:val="single"/>
+          <w:lang w:eastAsia="en-PH"/>
+        </w:rPr>
+        <w:t>}</w:t>
       </w:r>
     </w:p>
     <w:p>
@@ -408,6 +425,7 @@
         </w:rPr>
         <w:t>{</w:t>
       </w:r>
+      <w:proofErr w:type="spellStart"/>
       <w:r>
         <w:rPr>
           <w:rFonts w:ascii="Times New Roman" w:eastAsia="Times New Roman" w:hAnsi="Times New Roman" w:cs="Times New Roman"/>
@@ -418,6 +436,7 @@
         </w:rPr>
         <w:t>computer_name</w:t>
       </w:r>
+      <w:proofErr w:type="spellEnd"/>
       <w:r>
         <w:rPr>
           <w:rFonts w:ascii="Times New Roman" w:eastAsia="Times New Roman" w:hAnsi="Times New Roman" w:cs="Times New Roman"/>
@@ -496,6 +515,7 @@
         </w:rPr>
         <w:t>{</w:t>
       </w:r>
+      <w:proofErr w:type="spellStart"/>
       <w:r>
         <w:rPr>
           <w:rFonts w:ascii="Times New Roman" w:eastAsia="Times New Roman" w:hAnsi="Times New Roman" w:cs="Times New Roman"/>
@@ -506,6 +526,7 @@
         </w:rPr>
         <w:t>brand_model</w:t>
       </w:r>
+      <w:proofErr w:type="spellEnd"/>
       <w:r>
         <w:rPr>
           <w:rFonts w:ascii="Times New Roman" w:eastAsia="Times New Roman" w:hAnsi="Times New Roman" w:cs="Times New Roman"/>
@@ -566,7 +587,27 @@
           <w:szCs w:val="24"/>
           <w:u w:val="single"/>
         </w:rPr>
-        <w:t>{mac_address}</w:t>
+        <w:t>{</w:t>
+      </w:r>
+      <w:proofErr w:type="spellStart"/>
+      <w:r>
+        <w:rPr>
+          <w:rFonts w:ascii="Times New Roman" w:hAnsi="Times New Roman" w:cs="Times New Roman"/>
+          <w:sz w:val="24"/>
+          <w:szCs w:val="24"/>
+          <w:u w:val="single"/>
+        </w:rPr>
+        <w:t>mac_address</w:t>
+      </w:r>
+      <w:proofErr w:type="spellEnd"/>
+      <w:r>
+        <w:rPr>
+          <w:rFonts w:ascii="Times New Roman" w:hAnsi="Times New Roman" w:cs="Times New Roman"/>
+          <w:sz w:val="24"/>
+          <w:szCs w:val="24"/>
+          <w:u w:val="single"/>
+        </w:rPr>
+        <w:t>}</w:t>
       </w:r>
     </w:p>
     <w:p>
@@ -637,6 +678,7 @@
         </w:rPr>
         <w:t>{</w:t>
       </w:r>
+      <w:proofErr w:type="spellStart"/>
       <w:r>
         <w:rPr>
           <w:rFonts w:ascii="Times New Roman" w:hAnsi="Times New Roman" w:cs="Times New Roman"/>
@@ -646,6 +688,7 @@
         </w:rPr>
         <w:t>serial_number</w:t>
       </w:r>
+      <w:proofErr w:type="spellEnd"/>
       <w:r>
         <w:rPr>
           <w:rFonts w:ascii="Times New Roman" w:hAnsi="Times New Roman" w:cs="Times New Roman"/>
@@ -721,7 +764,25 @@
           <w:sz w:val="24"/>
           <w:szCs w:val="24"/>
         </w:rPr>
-        <w:t>{unit_location}</w:t>
+        <w:t>{</w:t>
+      </w:r>
+      <w:proofErr w:type="spellStart"/>
+      <w:r>
+        <w:rPr>
+          <w:rFonts w:ascii="Times New Roman" w:hAnsi="Times New Roman" w:cs="Times New Roman"/>
+          <w:sz w:val="24"/>
+          <w:szCs w:val="24"/>
+        </w:rPr>
+        <w:t>unit_location</w:t>
+      </w:r>
+      <w:proofErr w:type="spellEnd"/>
+      <w:r>
+        <w:rPr>
+          <w:rFonts w:ascii="Times New Roman" w:hAnsi="Times New Roman" w:cs="Times New Roman"/>
+          <w:sz w:val="24"/>
+          <w:szCs w:val="24"/>
+        </w:rPr>
+        <w:t>}</w:t>
       </w:r>
     </w:p>
     <w:p>
@@ -781,8 +842,9 @@
           <w:szCs w:val="24"/>
           <w:u w:val="single"/>
         </w:rPr>
-        <w:t>{ assigned</w:t>
-      </w:r>
+        <w:t>{</w:t>
+      </w:r>
+      <w:proofErr w:type="spellStart"/>
       <w:r>
         <w:rPr>
           <w:rFonts w:ascii="Times New Roman" w:hAnsi="Times New Roman" w:cs="Times New Roman"/>
@@ -790,6 +852,15 @@
           <w:szCs w:val="24"/>
           <w:u w:val="single"/>
         </w:rPr>
+        <w:t>assigned</w:t>
+      </w:r>
+      <w:r>
+        <w:rPr>
+          <w:rFonts w:ascii="Times New Roman" w:hAnsi="Times New Roman" w:cs="Times New Roman"/>
+          <w:sz w:val="24"/>
+          <w:szCs w:val="24"/>
+          <w:u w:val="single"/>
+        </w:rPr>
         <w:t>_</w:t>
       </w:r>
       <w:r>
@@ -799,7 +870,17 @@
           <w:szCs w:val="24"/>
           <w:u w:val="single"/>
         </w:rPr>
-        <w:t>to}</w:t>
+        <w:t>to</w:t>
+      </w:r>
+      <w:proofErr w:type="spellEnd"/>
+      <w:r>
+        <w:rPr>
+          <w:rFonts w:ascii="Times New Roman" w:hAnsi="Times New Roman" w:cs="Times New Roman"/>
+          <w:sz w:val="24"/>
+          <w:szCs w:val="24"/>
+          <w:u w:val="single"/>
+        </w:rPr>
+        <w:t>}</w:t>
       </w:r>
     </w:p>
     <w:p>
@@ -810,6 +891,7 @@
           <w:rFonts w:ascii="Times New Roman" w:hAnsi="Times New Roman" w:cs="Times New Roman"/>
           <w:sz w:val="24"/>
           <w:szCs w:val="24"/>
+          <w:u w:val="single"/>
         </w:rPr>
       </w:pPr>
       <w:r>
@@ -844,8 +926,9 @@
           <w:szCs w:val="24"/>
           <w:u w:val="single"/>
         </w:rPr>
-        <w:t>{monitor_brand</w:t>
-      </w:r>
+        <w:t>{</w:t>
+      </w:r>
+      <w:proofErr w:type="spellStart"/>
       <w:r>
         <w:rPr>
           <w:rFonts w:ascii="Times New Roman" w:hAnsi="Times New Roman" w:cs="Times New Roman"/>
@@ -853,8 +936,9 @@
           <w:szCs w:val="24"/>
           <w:u w:val="single"/>
         </w:rPr>
-        <w:t>_model</w:t>
-      </w:r>
+        <w:t>monitor_brand_model</w:t>
+      </w:r>
+      <w:proofErr w:type="spellEnd"/>
       <w:r>
         <w:rPr>
           <w:rFonts w:ascii="Times New Roman" w:hAnsi="Times New Roman" w:cs="Times New Roman"/>
@@ -915,8 +999,9 @@
           <w:szCs w:val="24"/>
           <w:u w:val="single"/>
         </w:rPr>
-        <w:t>{ups_brand</w:t>
-      </w:r>
+        <w:t>{</w:t>
+      </w:r>
+      <w:proofErr w:type="spellStart"/>
       <w:r>
         <w:rPr>
           <w:rFonts w:ascii="Times New Roman" w:hAnsi="Times New Roman" w:cs="Times New Roman"/>
@@ -924,8 +1009,18 @@
           <w:szCs w:val="24"/>
           <w:u w:val="single"/>
         </w:rPr>
+        <w:t>ups_brand</w:t>
+      </w:r>
+      <w:r>
+        <w:rPr>
+          <w:rFonts w:ascii="Times New Roman" w:hAnsi="Times New Roman" w:cs="Times New Roman"/>
+          <w:sz w:val="24"/>
+          <w:szCs w:val="24"/>
+          <w:u w:val="single"/>
+        </w:rPr>
         <w:t>_model</w:t>
       </w:r>
+      <w:proofErr w:type="spellEnd"/>
       <w:r>
         <w:rPr>
           <w:rFonts w:ascii="Times New Roman" w:hAnsi="Times New Roman" w:cs="Times New Roman"/>
@@ -1055,7 +1150,27 @@
           <w:szCs w:val="24"/>
           <w:u w:val="single"/>
         </w:rPr>
-        <w:t>{printer_serial_number}</w:t>
+        <w:t>{</w:t>
+      </w:r>
+      <w:proofErr w:type="spellStart"/>
+      <w:r>
+        <w:rPr>
+          <w:rFonts w:ascii="Times New Roman" w:hAnsi="Times New Roman" w:cs="Times New Roman"/>
+          <w:sz w:val="24"/>
+          <w:szCs w:val="24"/>
+          <w:u w:val="single"/>
+        </w:rPr>
+        <w:t>printer_serial_number</w:t>
+      </w:r>
+      <w:proofErr w:type="spellEnd"/>
+      <w:r>
+        <w:rPr>
+          <w:rFonts w:ascii="Times New Roman" w:hAnsi="Times New Roman" w:cs="Times New Roman"/>
+          <w:sz w:val="24"/>
+          <w:szCs w:val="24"/>
+          <w:u w:val="single"/>
+        </w:rPr>
+        <w:t>}</w:t>
       </w:r>
     </w:p>
     <w:p>
@@ -1108,7 +1223,27 @@
           <w:szCs w:val="24"/>
           <w:u w:val="single"/>
         </w:rPr>
-        <w:t>{ups_serial_number}</w:t>
+        <w:t>{</w:t>
+      </w:r>
+      <w:proofErr w:type="spellStart"/>
+      <w:r>
+        <w:rPr>
+          <w:rFonts w:ascii="Times New Roman" w:hAnsi="Times New Roman" w:cs="Times New Roman"/>
+          <w:sz w:val="24"/>
+          <w:szCs w:val="24"/>
+          <w:u w:val="single"/>
+        </w:rPr>
+        <w:t>ups_serial_number</w:t>
+      </w:r>
+      <w:proofErr w:type="spellEnd"/>
+      <w:r>
+        <w:rPr>
+          <w:rFonts w:ascii="Times New Roman" w:hAnsi="Times New Roman" w:cs="Times New Roman"/>
+          <w:sz w:val="24"/>
+          <w:szCs w:val="24"/>
+          <w:u w:val="single"/>
+        </w:rPr>
+        <w:t>}</w:t>
       </w:r>
     </w:p>
     <w:p>
@@ -1153,7 +1288,27 @@
           <w:szCs w:val="24"/>
           <w:u w:val="single"/>
         </w:rPr>
-        <w:t>{monitor_serial_number}</w:t>
+        <w:t>{</w:t>
+      </w:r>
+      <w:proofErr w:type="spellStart"/>
+      <w:r>
+        <w:rPr>
+          <w:rFonts w:ascii="Times New Roman" w:hAnsi="Times New Roman" w:cs="Times New Roman"/>
+          <w:sz w:val="24"/>
+          <w:szCs w:val="24"/>
+          <w:u w:val="single"/>
+        </w:rPr>
+        <w:t>monitor_serial_number</w:t>
+      </w:r>
+      <w:proofErr w:type="spellEnd"/>
+      <w:r>
+        <w:rPr>
+          <w:rFonts w:ascii="Times New Roman" w:hAnsi="Times New Roman" w:cs="Times New Roman"/>
+          <w:sz w:val="24"/>
+          <w:szCs w:val="24"/>
+          <w:u w:val="single"/>
+        </w:rPr>
+        <w:t>}</w:t>
       </w:r>
     </w:p>
     <w:p>
@@ -1206,7 +1361,27 @@
           <w:szCs w:val="24"/>
           <w:u w:val="single"/>
         </w:rPr>
-        <w:t>{date_last_maintenance}</w:t>
+        <w:t>{</w:t>
+      </w:r>
+      <w:proofErr w:type="spellStart"/>
+      <w:r>
+        <w:rPr>
+          <w:rFonts w:ascii="Times New Roman" w:hAnsi="Times New Roman" w:cs="Times New Roman"/>
+          <w:sz w:val="24"/>
+          <w:szCs w:val="24"/>
+          <w:u w:val="single"/>
+        </w:rPr>
+        <w:t>date_last_maintenance</w:t>
+      </w:r>
+      <w:proofErr w:type="spellEnd"/>
+      <w:r>
+        <w:rPr>
+          <w:rFonts w:ascii="Times New Roman" w:hAnsi="Times New Roman" w:cs="Times New Roman"/>
+          <w:sz w:val="24"/>
+          <w:szCs w:val="24"/>
+          <w:u w:val="single"/>
+        </w:rPr>
+        <w:t>}</w:t>
       </w:r>
     </w:p>
     <w:p>
@@ -1267,7 +1442,27 @@
           <w:szCs w:val="24"/>
           <w:u w:val="single"/>
         </w:rPr>
-        <w:t>{date_maintenance}</w:t>
+        <w:t>{</w:t>
+      </w:r>
+      <w:proofErr w:type="spellStart"/>
+      <w:r>
+        <w:rPr>
+          <w:rFonts w:ascii="Times New Roman" w:hAnsi="Times New Roman" w:cs="Times New Roman"/>
+          <w:sz w:val="24"/>
+          <w:szCs w:val="24"/>
+          <w:u w:val="single"/>
+        </w:rPr>
+        <w:t>date_maintenance</w:t>
+      </w:r>
+      <w:proofErr w:type="spellEnd"/>
+      <w:r>
+        <w:rPr>
+          <w:rFonts w:ascii="Times New Roman" w:hAnsi="Times New Roman" w:cs="Times New Roman"/>
+          <w:sz w:val="24"/>
+          <w:szCs w:val="24"/>
+          <w:u w:val="single"/>
+        </w:rPr>
+        <w:t>}</w:t>
       </w:r>
     </w:p>
     <w:p>
@@ -1348,6 +1543,7 @@
         </w:rPr>
         <w:t>{</w:t>
       </w:r>
+      <w:proofErr w:type="spellStart"/>
       <w:r>
         <w:rPr>
           <w:rFonts w:ascii="Times New Roman" w:eastAsia="Times New Roman" w:hAnsi="Times New Roman" w:cs="Times New Roman"/>
@@ -1358,6 +1554,7 @@
         </w:rPr>
         <w:t>inspected_by</w:t>
       </w:r>
+      <w:proofErr w:type="spellEnd"/>
       <w:r>
         <w:rPr>
           <w:rFonts w:ascii="Times New Roman" w:eastAsia="Times New Roman" w:hAnsi="Times New Roman" w:cs="Times New Roman"/>
@@ -1406,8 +1603,8 @@
         <w:tblLook w:val="04A0" w:firstRow="1" w:lastRow="0" w:firstColumn="1" w:lastColumn="0" w:noHBand="0" w:noVBand="1"/>
       </w:tblPr>
       <w:tblGrid>
-        <w:gridCol w:w="689"/>
-        <w:gridCol w:w="8851"/>
+        <w:gridCol w:w="567"/>
+        <w:gridCol w:w="8973"/>
       </w:tblGrid>
       <w:tr>
         <w:trPr>
@@ -1417,12 +1614,6 @@
           <w:tcPr>
             <w:tcW w:w="9540" w:type="dxa"/>
             <w:gridSpan w:val="2"/>
-            <w:tcBorders>
-              <w:top w:val="nil"/>
-              <w:left w:val="nil"/>
-              <w:bottom w:val="nil"/>
-              <w:right w:val="nil"/>
-            </w:tcBorders>
             <w:vAlign w:val="center"/>
             <w:hideMark/>
           </w:tcPr>
@@ -1460,7 +1651,7 @@
         </w:trPr>
         <w:tc>
           <w:tcPr>
-            <w:tcW w:w="311" w:type="dxa"/>
+            <w:tcW w:w="0" w:type="dxa"/>
             <w:tcBorders>
               <w:top w:val="single" w:sz="4" w:space="0" w:color="auto"/>
               <w:left w:val="single" w:sz="4" w:space="0" w:color="auto"/>
@@ -1468,35 +1659,37 @@
               <w:right w:val="single" w:sz="4" w:space="0" w:color="auto"/>
             </w:tcBorders>
             <w:noWrap/>
-            <w:vAlign w:val="bottom"/>
+            <w:vAlign w:val="center"/>
           </w:tcPr>
           <w:p>
             <w:pPr>
               <w:spacing w:after="0" w:line="240" w:lineRule="auto"/>
-              <w:rPr>
-                <w:rFonts w:ascii="Segoe UI Symbol" w:eastAsia="Times New Roman" w:hAnsi="Segoe UI Symbol" w:cs="Calibri"/>
-                <w:color w:val="000000"/>
-                <w:lang w:eastAsia="en-PH"/>
-              </w:rPr>
-            </w:pPr>
-            <w:r>
-              <w:rPr>
-                <w:rFonts w:ascii="Segoe UI Symbol" w:eastAsia="Times New Roman" w:hAnsi="Segoe UI Symbol" w:cs="Calibri"/>
-                <w:color w:val="000000"/>
-                <w:lang w:eastAsia="en-PH"/>
-              </w:rPr>
-              <w:t>{cb1}</w:t>
+              <w:jc w:val="center"/>
+              <w:rPr>
+                <w:rFonts w:ascii="Segoe UI Symbol" w:eastAsia="Times New Roman" w:hAnsi="Segoe UI Symbol" w:cs="Calibri"/>
+                <w:color w:val="000000"/>
+                <w:sz w:val="18"/>
+                <w:szCs w:val="18"/>
+                <w:lang w:eastAsia="en-PH"/>
+              </w:rPr>
+            </w:pPr>
+            <w:r>
+              <w:rPr>
+                <w:rFonts w:ascii="Segoe UI Symbol" w:eastAsia="Times New Roman" w:hAnsi="Segoe UI Symbol" w:cs="Calibri"/>
+                <w:color w:val="000000"/>
+                <w:sz w:val="18"/>
+                <w:szCs w:val="18"/>
+                <w:lang w:eastAsia="en-PH"/>
+              </w:rPr>
+              <w:t>{a}</w:t>
             </w:r>
           </w:p>
         </w:tc>
         <w:tc>
           <w:tcPr>
-            <w:tcW w:w="9229" w:type="dxa"/>
+            <w:tcW w:w="8973" w:type="dxa"/>
             <w:tcBorders>
-              <w:top w:val="nil"/>
-              <w:left w:val="nil"/>
-              <w:bottom w:val="nil"/>
-              <w:right w:val="nil"/>
+              <w:left w:val="single" w:sz="4" w:space="0" w:color="auto"/>
             </w:tcBorders>
             <w:noWrap/>
             <w:vAlign w:val="center"/>
@@ -1522,7 +1715,17 @@
                 <w:szCs w:val="14"/>
                 <w:lang w:eastAsia="en-PH"/>
               </w:rPr>
-              <w:t xml:space="preserve">      </w:t>
+              <w:t>    </w:t>
+            </w:r>
+            <w:r>
+              <w:rPr>
+                <w:rFonts w:ascii="Times New Roman" w:eastAsia="Times New Roman" w:hAnsi="Times New Roman" w:cs="Times New Roman"/>
+                <w:color w:val="000000"/>
+                <w:sz w:val="14"/>
+                <w:szCs w:val="14"/>
+                <w:lang w:eastAsia="en-PH"/>
+              </w:rPr>
+              <w:t xml:space="preserve"> </w:t>
             </w:r>
             <w:r>
               <w:rPr>
@@ -1543,59 +1746,45 @@
         </w:trPr>
         <w:tc>
           <w:tcPr>
-            <w:tcW w:w="311" w:type="dxa"/>
+            <w:tcW w:w="0" w:type="auto"/>
             <w:tcBorders>
-              <w:top w:val="nil"/>
+              <w:top w:val="single" w:sz="4" w:space="0" w:color="auto"/>
               <w:left w:val="single" w:sz="4" w:space="0" w:color="auto"/>
               <w:bottom w:val="single" w:sz="4" w:space="0" w:color="auto"/>
               <w:right w:val="single" w:sz="4" w:space="0" w:color="auto"/>
             </w:tcBorders>
             <w:noWrap/>
-            <w:vAlign w:val="bottom"/>
+            <w:vAlign w:val="center"/>
           </w:tcPr>
           <w:p>
             <w:pPr>
               <w:spacing w:after="0" w:line="240" w:lineRule="auto"/>
-              <w:rPr>
-                <w:rFonts w:ascii="Segoe UI Symbol" w:eastAsia="Times New Roman" w:hAnsi="Segoe UI Symbol" w:cs="Calibri"/>
-                <w:color w:val="000000"/>
-                <w:lang w:eastAsia="en-PH"/>
-              </w:rPr>
-            </w:pPr>
-            <w:r>
-              <w:rPr>
-                <w:rFonts w:ascii="Segoe UI Symbol" w:eastAsia="Times New Roman" w:hAnsi="Segoe UI Symbol" w:cs="Calibri"/>
-                <w:color w:val="000000"/>
-                <w:lang w:eastAsia="en-PH"/>
-              </w:rPr>
-              <w:t>{cb</w:t>
-            </w:r>
-            <w:r>
-              <w:rPr>
-                <w:rFonts w:ascii="Segoe UI Symbol" w:eastAsia="Times New Roman" w:hAnsi="Segoe UI Symbol" w:cs="Calibri"/>
-                <w:color w:val="000000"/>
-                <w:lang w:eastAsia="en-PH"/>
-              </w:rPr>
-              <w:t>2</w:t>
-            </w:r>
-            <w:r>
-              <w:rPr>
-                <w:rFonts w:ascii="Segoe UI Symbol" w:eastAsia="Times New Roman" w:hAnsi="Segoe UI Symbol" w:cs="Calibri"/>
-                <w:color w:val="000000"/>
-                <w:lang w:eastAsia="en-PH"/>
-              </w:rPr>
-              <w:t>}</w:t>
+              <w:jc w:val="center"/>
+              <w:rPr>
+                <w:rFonts w:ascii="Segoe UI Symbol" w:eastAsia="Times New Roman" w:hAnsi="Segoe UI Symbol" w:cs="Calibri"/>
+                <w:color w:val="000000"/>
+                <w:sz w:val="18"/>
+                <w:szCs w:val="18"/>
+                <w:lang w:eastAsia="en-PH"/>
+              </w:rPr>
+            </w:pPr>
+            <w:r>
+              <w:rPr>
+                <w:rFonts w:ascii="Segoe UI Symbol" w:eastAsia="Times New Roman" w:hAnsi="Segoe UI Symbol" w:cs="Calibri"/>
+                <w:color w:val="000000"/>
+                <w:sz w:val="18"/>
+                <w:szCs w:val="18"/>
+                <w:lang w:eastAsia="en-PH"/>
+              </w:rPr>
+              <w:t>{b}</w:t>
             </w:r>
           </w:p>
         </w:tc>
         <w:tc>
           <w:tcPr>
-            <w:tcW w:w="9229" w:type="dxa"/>
+            <w:tcW w:w="8973" w:type="dxa"/>
             <w:tcBorders>
-              <w:top w:val="nil"/>
-              <w:left w:val="nil"/>
-              <w:bottom w:val="nil"/>
-              <w:right w:val="nil"/>
+              <w:left w:val="single" w:sz="4" w:space="0" w:color="auto"/>
             </w:tcBorders>
             <w:noWrap/>
             <w:vAlign w:val="center"/>
@@ -1642,45 +1831,54 @@
         </w:trPr>
         <w:tc>
           <w:tcPr>
-            <w:tcW w:w="311" w:type="dxa"/>
+            <w:tcW w:w="0" w:type="auto"/>
             <w:tcBorders>
-              <w:top w:val="nil"/>
+              <w:top w:val="single" w:sz="4" w:space="0" w:color="auto"/>
               <w:left w:val="single" w:sz="4" w:space="0" w:color="auto"/>
               <w:bottom w:val="single" w:sz="4" w:space="0" w:color="auto"/>
               <w:right w:val="single" w:sz="4" w:space="0" w:color="auto"/>
             </w:tcBorders>
             <w:noWrap/>
-            <w:vAlign w:val="bottom"/>
+            <w:vAlign w:val="center"/>
           </w:tcPr>
           <w:p>
             <w:pPr>
               <w:spacing w:after="0" w:line="240" w:lineRule="auto"/>
-              <w:rPr>
-                <w:rFonts w:ascii="Segoe UI Symbol" w:eastAsia="Times New Roman" w:hAnsi="Segoe UI Symbol" w:cs="Calibri"/>
-                <w:color w:val="000000"/>
-                <w:lang w:eastAsia="en-PH"/>
-              </w:rPr>
-            </w:pPr>
-            <w:r>
-              <w:rPr>
-                <w:rFonts w:ascii="Segoe UI Symbol" w:eastAsia="Times New Roman" w:hAnsi="Segoe UI Symbol" w:cs="Calibri"/>
-                <w:color w:val="000000"/>
-                <w:lang w:eastAsia="en-PH"/>
-              </w:rPr>
-              <w:t>{cb</w:t>
-            </w:r>
-            <w:r>
-              <w:rPr>
-                <w:rFonts w:ascii="Segoe UI Symbol" w:eastAsia="Times New Roman" w:hAnsi="Segoe UI Symbol" w:cs="Calibri"/>
-                <w:color w:val="000000"/>
-                <w:lang w:eastAsia="en-PH"/>
-              </w:rPr>
-              <w:t>3</w:t>
-            </w:r>
-            <w:r>
-              <w:rPr>
-                <w:rFonts w:ascii="Segoe UI Symbol" w:eastAsia="Times New Roman" w:hAnsi="Segoe UI Symbol" w:cs="Calibri"/>
-                <w:color w:val="000000"/>
+              <w:jc w:val="center"/>
+              <w:rPr>
+                <w:rFonts w:ascii="Segoe UI Symbol" w:eastAsia="Times New Roman" w:hAnsi="Segoe UI Symbol" w:cs="Calibri"/>
+                <w:color w:val="000000"/>
+                <w:sz w:val="18"/>
+                <w:szCs w:val="18"/>
+                <w:lang w:eastAsia="en-PH"/>
+              </w:rPr>
+            </w:pPr>
+            <w:r>
+              <w:rPr>
+                <w:rFonts w:ascii="Segoe UI Symbol" w:eastAsia="Times New Roman" w:hAnsi="Segoe UI Symbol" w:cs="Calibri"/>
+                <w:color w:val="000000"/>
+                <w:sz w:val="18"/>
+                <w:szCs w:val="18"/>
+                <w:lang w:eastAsia="en-PH"/>
+              </w:rPr>
+              <w:t>{</w:t>
+            </w:r>
+            <w:r>
+              <w:rPr>
+                <w:rFonts w:ascii="Segoe UI Symbol" w:eastAsia="Times New Roman" w:hAnsi="Segoe UI Symbol" w:cs="Calibri"/>
+                <w:color w:val="000000"/>
+                <w:sz w:val="18"/>
+                <w:szCs w:val="18"/>
+                <w:lang w:eastAsia="en-PH"/>
+              </w:rPr>
+              <w:t>c</w:t>
+            </w:r>
+            <w:r>
+              <w:rPr>
+                <w:rFonts w:ascii="Segoe UI Symbol" w:eastAsia="Times New Roman" w:hAnsi="Segoe UI Symbol" w:cs="Calibri"/>
+                <w:color w:val="000000"/>
+                <w:sz w:val="18"/>
+                <w:szCs w:val="18"/>
                 <w:lang w:eastAsia="en-PH"/>
               </w:rPr>
               <w:t>}</w:t>
@@ -1689,12 +1887,9 @@
         </w:tc>
         <w:tc>
           <w:tcPr>
-            <w:tcW w:w="9229" w:type="dxa"/>
+            <w:tcW w:w="8973" w:type="dxa"/>
             <w:tcBorders>
-              <w:top w:val="nil"/>
-              <w:left w:val="nil"/>
-              <w:bottom w:val="nil"/>
-              <w:right w:val="nil"/>
+              <w:left w:val="single" w:sz="4" w:space="0" w:color="auto"/>
             </w:tcBorders>
             <w:noWrap/>
             <w:vAlign w:val="center"/>
@@ -1741,59 +1936,45 @@
         </w:trPr>
         <w:tc>
           <w:tcPr>
-            <w:tcW w:w="311" w:type="dxa"/>
+            <w:tcW w:w="0" w:type="auto"/>
             <w:tcBorders>
-              <w:top w:val="nil"/>
+              <w:top w:val="single" w:sz="4" w:space="0" w:color="auto"/>
               <w:left w:val="single" w:sz="4" w:space="0" w:color="auto"/>
               <w:bottom w:val="single" w:sz="4" w:space="0" w:color="auto"/>
               <w:right w:val="single" w:sz="4" w:space="0" w:color="auto"/>
             </w:tcBorders>
             <w:noWrap/>
-            <w:vAlign w:val="bottom"/>
+            <w:vAlign w:val="center"/>
           </w:tcPr>
           <w:p>
             <w:pPr>
               <w:spacing w:after="0" w:line="240" w:lineRule="auto"/>
-              <w:rPr>
-                <w:rFonts w:ascii="Segoe UI Symbol" w:eastAsia="Times New Roman" w:hAnsi="Segoe UI Symbol" w:cs="Calibri"/>
-                <w:color w:val="000000"/>
-                <w:lang w:eastAsia="en-PH"/>
-              </w:rPr>
-            </w:pPr>
-            <w:r>
-              <w:rPr>
-                <w:rFonts w:ascii="Segoe UI Symbol" w:eastAsia="Times New Roman" w:hAnsi="Segoe UI Symbol" w:cs="Calibri"/>
-                <w:color w:val="000000"/>
-                <w:lang w:eastAsia="en-PH"/>
-              </w:rPr>
-              <w:t>{cb</w:t>
-            </w:r>
-            <w:r>
-              <w:rPr>
-                <w:rFonts w:ascii="Segoe UI Symbol" w:eastAsia="Times New Roman" w:hAnsi="Segoe UI Symbol" w:cs="Calibri"/>
-                <w:color w:val="000000"/>
-                <w:lang w:eastAsia="en-PH"/>
-              </w:rPr>
-              <w:t>3a</w:t>
-            </w:r>
-            <w:r>
-              <w:rPr>
-                <w:rFonts w:ascii="Segoe UI Symbol" w:eastAsia="Times New Roman" w:hAnsi="Segoe UI Symbol" w:cs="Calibri"/>
-                <w:color w:val="000000"/>
-                <w:lang w:eastAsia="en-PH"/>
-              </w:rPr>
-              <w:t>}</w:t>
+              <w:jc w:val="center"/>
+              <w:rPr>
+                <w:rFonts w:ascii="Segoe UI Symbol" w:eastAsia="Times New Roman" w:hAnsi="Segoe UI Symbol" w:cs="Calibri"/>
+                <w:color w:val="000000"/>
+                <w:sz w:val="18"/>
+                <w:szCs w:val="18"/>
+                <w:lang w:eastAsia="en-PH"/>
+              </w:rPr>
+            </w:pPr>
+            <w:r>
+              <w:rPr>
+                <w:rFonts w:ascii="Segoe UI Symbol" w:eastAsia="Times New Roman" w:hAnsi="Segoe UI Symbol" w:cs="Calibri"/>
+                <w:color w:val="000000"/>
+                <w:sz w:val="18"/>
+                <w:szCs w:val="18"/>
+                <w:lang w:eastAsia="en-PH"/>
+              </w:rPr>
+              <w:t>{d}</w:t>
             </w:r>
           </w:p>
         </w:tc>
         <w:tc>
           <w:tcPr>
-            <w:tcW w:w="9229" w:type="dxa"/>
+            <w:tcW w:w="8973" w:type="dxa"/>
             <w:tcBorders>
-              <w:top w:val="nil"/>
-              <w:left w:val="nil"/>
-              <w:bottom w:val="nil"/>
-              <w:right w:val="nil"/>
+              <w:left w:val="single" w:sz="4" w:space="0" w:color="auto"/>
             </w:tcBorders>
             <w:noWrap/>
             <w:vAlign w:val="center"/>
@@ -1840,59 +2021,45 @@
         </w:trPr>
         <w:tc>
           <w:tcPr>
-            <w:tcW w:w="311" w:type="dxa"/>
+            <w:tcW w:w="0" w:type="auto"/>
             <w:tcBorders>
-              <w:top w:val="nil"/>
+              <w:top w:val="single" w:sz="4" w:space="0" w:color="auto"/>
               <w:left w:val="single" w:sz="4" w:space="0" w:color="auto"/>
               <w:bottom w:val="single" w:sz="4" w:space="0" w:color="auto"/>
               <w:right w:val="single" w:sz="4" w:space="0" w:color="auto"/>
             </w:tcBorders>
             <w:noWrap/>
-            <w:vAlign w:val="bottom"/>
+            <w:vAlign w:val="center"/>
           </w:tcPr>
           <w:p>
             <w:pPr>
               <w:spacing w:after="0" w:line="240" w:lineRule="auto"/>
-              <w:rPr>
-                <w:rFonts w:ascii="Segoe UI Symbol" w:eastAsia="Times New Roman" w:hAnsi="Segoe UI Symbol" w:cs="Calibri"/>
-                <w:color w:val="000000"/>
-                <w:lang w:eastAsia="en-PH"/>
-              </w:rPr>
-            </w:pPr>
-            <w:r>
-              <w:rPr>
-                <w:rFonts w:ascii="Segoe UI Symbol" w:eastAsia="Times New Roman" w:hAnsi="Segoe UI Symbol" w:cs="Calibri"/>
-                <w:color w:val="000000"/>
-                <w:lang w:eastAsia="en-PH"/>
-              </w:rPr>
-              <w:t>{cb</w:t>
-            </w:r>
-            <w:r>
-              <w:rPr>
-                <w:rFonts w:ascii="Segoe UI Symbol" w:eastAsia="Times New Roman" w:hAnsi="Segoe UI Symbol" w:cs="Calibri"/>
-                <w:color w:val="000000"/>
-                <w:lang w:eastAsia="en-PH"/>
-              </w:rPr>
-              <w:t>4</w:t>
-            </w:r>
-            <w:r>
-              <w:rPr>
-                <w:rFonts w:ascii="Segoe UI Symbol" w:eastAsia="Times New Roman" w:hAnsi="Segoe UI Symbol" w:cs="Calibri"/>
-                <w:color w:val="000000"/>
-                <w:lang w:eastAsia="en-PH"/>
-              </w:rPr>
-              <w:t>}</w:t>
+              <w:jc w:val="center"/>
+              <w:rPr>
+                <w:rFonts w:ascii="Segoe UI Symbol" w:eastAsia="Times New Roman" w:hAnsi="Segoe UI Symbol" w:cs="Calibri"/>
+                <w:color w:val="000000"/>
+                <w:sz w:val="18"/>
+                <w:szCs w:val="18"/>
+                <w:lang w:eastAsia="en-PH"/>
+              </w:rPr>
+            </w:pPr>
+            <w:r>
+              <w:rPr>
+                <w:rFonts w:ascii="Segoe UI Symbol" w:eastAsia="Times New Roman" w:hAnsi="Segoe UI Symbol" w:cs="Calibri"/>
+                <w:color w:val="000000"/>
+                <w:sz w:val="18"/>
+                <w:szCs w:val="18"/>
+                <w:lang w:eastAsia="en-PH"/>
+              </w:rPr>
+              <w:t>{e}</w:t>
             </w:r>
           </w:p>
         </w:tc>
         <w:tc>
           <w:tcPr>
-            <w:tcW w:w="9229" w:type="dxa"/>
+            <w:tcW w:w="8973" w:type="dxa"/>
             <w:tcBorders>
-              <w:top w:val="nil"/>
-              <w:left w:val="nil"/>
-              <w:bottom w:val="nil"/>
-              <w:right w:val="nil"/>
+              <w:left w:val="single" w:sz="4" w:space="0" w:color="auto"/>
             </w:tcBorders>
             <w:noWrap/>
             <w:vAlign w:val="center"/>
@@ -1939,12 +2106,9 @@
         </w:trPr>
         <w:tc>
           <w:tcPr>
-            <w:tcW w:w="311" w:type="dxa"/>
+            <w:tcW w:w="567" w:type="dxa"/>
             <w:tcBorders>
-              <w:top w:val="nil"/>
-              <w:left w:val="nil"/>
-              <w:bottom w:val="nil"/>
-              <w:right w:val="nil"/>
+              <w:top w:val="single" w:sz="4" w:space="0" w:color="auto"/>
             </w:tcBorders>
             <w:noWrap/>
             <w:vAlign w:val="bottom"/>
@@ -1966,13 +2130,7 @@
         </w:tc>
         <w:tc>
           <w:tcPr>
-            <w:tcW w:w="9229" w:type="dxa"/>
-            <w:tcBorders>
-              <w:top w:val="nil"/>
-              <w:left w:val="nil"/>
-              <w:bottom w:val="nil"/>
-              <w:right w:val="nil"/>
-            </w:tcBorders>
+            <w:tcW w:w="8973" w:type="dxa"/>
             <w:noWrap/>
             <w:vAlign w:val="center"/>
             <w:hideMark/>
@@ -1989,8 +2147,6 @@
             <w:r>
               <w:rPr>
                 <w:rFonts w:ascii="Times New Roman" w:hAnsi="Times New Roman" w:cs="Times New Roman"/>
-                <w:b/>
-                <w:bCs/>
                 <w:color w:val="000000"/>
                 <w:lang w:val="pt-BR"/>
               </w:rPr>
@@ -2004,6 +2160,14 @@
               </w:rPr>
               <w:t>:</w:t>
             </w:r>
+            <w:r>
+              <w:rPr>
+                <w:rFonts w:ascii="Times New Roman" w:hAnsi="Times New Roman" w:cs="Times New Roman"/>
+                <w:color w:val="000000"/>
+                <w:lang w:val="pt-BR"/>
+              </w:rPr>
+              <w:t xml:space="preserve"> {processor}</w:t>
+            </w:r>
           </w:p>
           <w:p>
             <w:pPr>
@@ -2028,7 +2192,15 @@
                 <w:color w:val="000000"/>
                 <w:lang w:val="pt-BR"/>
               </w:rPr>
-              <w:t xml:space="preserve"> Windows 10 Home</w:t>
+              <w:t xml:space="preserve"> </w:t>
+            </w:r>
+            <w:r>
+              <w:rPr>
+                <w:rFonts w:ascii="Times New Roman" w:hAnsi="Times New Roman" w:cs="Times New Roman"/>
+                <w:color w:val="000000"/>
+                <w:lang w:val="pt-BR"/>
+              </w:rPr>
+              <w:t>{operating_system}</w:t>
             </w:r>
           </w:p>
           <w:p>
@@ -2054,7 +2226,7 @@
                 <w:color w:val="000000"/>
                 <w:lang w:val="pt-BR"/>
               </w:rPr>
-              <w:t>Microsoft Office 2016</w:t>
+              <w:t xml:space="preserve"> {office_version}</w:t>
             </w:r>
           </w:p>
           <w:p>
@@ -2080,7 +2252,15 @@
                 <w:color w:val="000000"/>
                 <w:lang w:val="pt-BR"/>
               </w:rPr>
-              <w:t xml:space="preserve"> Google Chrome</w:t>
+              <w:t xml:space="preserve"> </w:t>
+            </w:r>
+            <w:r>
+              <w:rPr>
+                <w:rFonts w:ascii="Times New Roman" w:hAnsi="Times New Roman" w:cs="Times New Roman"/>
+                <w:color w:val="000000"/>
+                <w:lang w:val="pt-BR"/>
+              </w:rPr>
+              <w:t>{primary_browser}</w:t>
             </w:r>
           </w:p>
         </w:tc>
@@ -2093,12 +2273,6 @@
           <w:tcPr>
             <w:tcW w:w="9540" w:type="dxa"/>
             <w:gridSpan w:val="2"/>
-            <w:tcBorders>
-              <w:top w:val="nil"/>
-              <w:left w:val="nil"/>
-              <w:bottom w:val="nil"/>
-              <w:right w:val="nil"/>
-            </w:tcBorders>
             <w:vAlign w:val="center"/>
             <w:hideMark/>
           </w:tcPr>
@@ -2136,7 +2310,7 @@
         </w:trPr>
         <w:tc>
           <w:tcPr>
-            <w:tcW w:w="311" w:type="dxa"/>
+            <w:tcW w:w="567" w:type="dxa"/>
             <w:tcBorders>
               <w:top w:val="single" w:sz="4" w:space="0" w:color="auto"/>
               <w:left w:val="single" w:sz="4" w:space="0" w:color="auto"/>
@@ -2144,37 +2318,46 @@
               <w:right w:val="single" w:sz="4" w:space="0" w:color="auto"/>
             </w:tcBorders>
             <w:noWrap/>
-            <w:vAlign w:val="bottom"/>
+            <w:vAlign w:val="center"/>
           </w:tcPr>
           <w:p>
             <w:pPr>
               <w:spacing w:after="0" w:line="240" w:lineRule="auto"/>
-              <w:rPr>
-                <w:rFonts w:ascii="Segoe UI Symbol" w:eastAsia="Times New Roman" w:hAnsi="Segoe UI Symbol" w:cs="Calibri"/>
-                <w:color w:val="000000"/>
-                <w:lang w:eastAsia="en-PH"/>
-              </w:rPr>
-            </w:pPr>
-            <w:r>
-              <w:rPr>
-                <w:rFonts w:ascii="Segoe UI Symbol" w:eastAsia="Times New Roman" w:hAnsi="Segoe UI Symbol" w:cs="Calibri"/>
-                <w:color w:val="000000"/>
-                <w:lang w:eastAsia="en-PH"/>
-              </w:rPr>
-              <w:t>{cb</w:t>
-            </w:r>
-            <w:r>
-              <w:rPr>
-                <w:rFonts w:ascii="Segoe UI Symbol" w:eastAsia="Times New Roman" w:hAnsi="Segoe UI Symbol" w:cs="Calibri"/>
-                <w:color w:val="000000"/>
-                <w:lang w:eastAsia="en-PH"/>
-              </w:rPr>
-              <w:t>5</w:t>
-            </w:r>
-            <w:r>
-              <w:rPr>
-                <w:rFonts w:ascii="Segoe UI Symbol" w:eastAsia="Times New Roman" w:hAnsi="Segoe UI Symbol" w:cs="Calibri"/>
-                <w:color w:val="000000"/>
+              <w:jc w:val="center"/>
+              <w:rPr>
+                <w:rFonts w:ascii="Segoe UI Symbol" w:eastAsia="Times New Roman" w:hAnsi="Segoe UI Symbol" w:cs="Calibri"/>
+                <w:color w:val="000000"/>
+                <w:sz w:val="18"/>
+                <w:szCs w:val="18"/>
+                <w:lang w:eastAsia="en-PH"/>
+              </w:rPr>
+            </w:pPr>
+            <w:r>
+              <w:rPr>
+                <w:rFonts w:ascii="Segoe UI Symbol" w:eastAsia="Times New Roman" w:hAnsi="Segoe UI Symbol" w:cs="Calibri"/>
+                <w:color w:val="000000"/>
+                <w:sz w:val="18"/>
+                <w:szCs w:val="18"/>
+                <w:lang w:eastAsia="en-PH"/>
+              </w:rPr>
+              <w:t>{</w:t>
+            </w:r>
+            <w:r>
+              <w:rPr>
+                <w:rFonts w:ascii="Segoe UI Symbol" w:eastAsia="Times New Roman" w:hAnsi="Segoe UI Symbol" w:cs="Calibri"/>
+                <w:color w:val="000000"/>
+                <w:sz w:val="18"/>
+                <w:szCs w:val="18"/>
+                <w:lang w:eastAsia="en-PH"/>
+              </w:rPr>
+              <w:t>f</w:t>
+            </w:r>
+            <w:r>
+              <w:rPr>
+                <w:rFonts w:ascii="Segoe UI Symbol" w:eastAsia="Times New Roman" w:hAnsi="Segoe UI Symbol" w:cs="Calibri"/>
+                <w:color w:val="000000"/>
+                <w:sz w:val="18"/>
+                <w:szCs w:val="18"/>
                 <w:lang w:eastAsia="en-PH"/>
               </w:rPr>
               <w:t>}</w:t>
@@ -2183,12 +2366,9 @@
         </w:tc>
         <w:tc>
           <w:tcPr>
-            <w:tcW w:w="9229" w:type="dxa"/>
+            <w:tcW w:w="8973" w:type="dxa"/>
             <w:tcBorders>
-              <w:top w:val="nil"/>
-              <w:left w:val="nil"/>
-              <w:bottom w:val="nil"/>
-              <w:right w:val="nil"/>
+              <w:left w:val="single" w:sz="4" w:space="0" w:color="auto"/>
             </w:tcBorders>
             <w:noWrap/>
             <w:vAlign w:val="center"/>
@@ -2235,45 +2415,54 @@
         </w:trPr>
         <w:tc>
           <w:tcPr>
-            <w:tcW w:w="311" w:type="dxa"/>
+            <w:tcW w:w="567" w:type="dxa"/>
             <w:tcBorders>
-              <w:top w:val="nil"/>
+              <w:top w:val="single" w:sz="4" w:space="0" w:color="auto"/>
               <w:left w:val="single" w:sz="4" w:space="0" w:color="auto"/>
               <w:bottom w:val="single" w:sz="4" w:space="0" w:color="auto"/>
               <w:right w:val="single" w:sz="4" w:space="0" w:color="auto"/>
             </w:tcBorders>
             <w:noWrap/>
-            <w:vAlign w:val="bottom"/>
+            <w:vAlign w:val="center"/>
           </w:tcPr>
           <w:p>
             <w:pPr>
               <w:spacing w:after="0" w:line="240" w:lineRule="auto"/>
-              <w:rPr>
-                <w:rFonts w:ascii="Segoe UI Symbol" w:eastAsia="Times New Roman" w:hAnsi="Segoe UI Symbol" w:cs="Calibri"/>
-                <w:color w:val="000000"/>
-                <w:lang w:eastAsia="en-PH"/>
-              </w:rPr>
-            </w:pPr>
-            <w:r>
-              <w:rPr>
-                <w:rFonts w:ascii="Segoe UI Symbol" w:eastAsia="Times New Roman" w:hAnsi="Segoe UI Symbol" w:cs="Calibri"/>
-                <w:color w:val="000000"/>
-                <w:lang w:eastAsia="en-PH"/>
-              </w:rPr>
-              <w:t>{cb</w:t>
-            </w:r>
-            <w:r>
-              <w:rPr>
-                <w:rFonts w:ascii="Segoe UI Symbol" w:eastAsia="Times New Roman" w:hAnsi="Segoe UI Symbol" w:cs="Calibri"/>
-                <w:color w:val="000000"/>
-                <w:lang w:eastAsia="en-PH"/>
-              </w:rPr>
-              <w:t>6</w:t>
-            </w:r>
-            <w:r>
-              <w:rPr>
-                <w:rFonts w:ascii="Segoe UI Symbol" w:eastAsia="Times New Roman" w:hAnsi="Segoe UI Symbol" w:cs="Calibri"/>
-                <w:color w:val="000000"/>
+              <w:jc w:val="center"/>
+              <w:rPr>
+                <w:rFonts w:ascii="Segoe UI Symbol" w:eastAsia="Times New Roman" w:hAnsi="Segoe UI Symbol" w:cs="Calibri"/>
+                <w:color w:val="000000"/>
+                <w:sz w:val="18"/>
+                <w:szCs w:val="18"/>
+                <w:lang w:eastAsia="en-PH"/>
+              </w:rPr>
+            </w:pPr>
+            <w:r>
+              <w:rPr>
+                <w:rFonts w:ascii="Segoe UI Symbol" w:eastAsia="Times New Roman" w:hAnsi="Segoe UI Symbol" w:cs="Calibri"/>
+                <w:color w:val="000000"/>
+                <w:sz w:val="18"/>
+                <w:szCs w:val="18"/>
+                <w:lang w:eastAsia="en-PH"/>
+              </w:rPr>
+              <w:t>{</w:t>
+            </w:r>
+            <w:r>
+              <w:rPr>
+                <w:rFonts w:ascii="Segoe UI Symbol" w:eastAsia="Times New Roman" w:hAnsi="Segoe UI Symbol" w:cs="Calibri"/>
+                <w:color w:val="000000"/>
+                <w:sz w:val="18"/>
+                <w:szCs w:val="18"/>
+                <w:lang w:eastAsia="en-PH"/>
+              </w:rPr>
+              <w:t>g</w:t>
+            </w:r>
+            <w:r>
+              <w:rPr>
+                <w:rFonts w:ascii="Segoe UI Symbol" w:eastAsia="Times New Roman" w:hAnsi="Segoe UI Symbol" w:cs="Calibri"/>
+                <w:color w:val="000000"/>
+                <w:sz w:val="18"/>
+                <w:szCs w:val="18"/>
                 <w:lang w:eastAsia="en-PH"/>
               </w:rPr>
               <w:t>}</w:t>
@@ -2282,12 +2471,9 @@
         </w:tc>
         <w:tc>
           <w:tcPr>
-            <w:tcW w:w="9229" w:type="dxa"/>
+            <w:tcW w:w="8973" w:type="dxa"/>
             <w:tcBorders>
-              <w:top w:val="nil"/>
-              <w:left w:val="nil"/>
-              <w:bottom w:val="nil"/>
-              <w:right w:val="nil"/>
+              <w:left w:val="single" w:sz="4" w:space="0" w:color="auto"/>
             </w:tcBorders>
             <w:noWrap/>
             <w:vAlign w:val="center"/>
@@ -2334,45 +2520,54 @@
         </w:trPr>
         <w:tc>
           <w:tcPr>
-            <w:tcW w:w="311" w:type="dxa"/>
+            <w:tcW w:w="567" w:type="dxa"/>
             <w:tcBorders>
-              <w:top w:val="nil"/>
+              <w:top w:val="single" w:sz="4" w:space="0" w:color="auto"/>
               <w:left w:val="single" w:sz="4" w:space="0" w:color="auto"/>
               <w:bottom w:val="single" w:sz="4" w:space="0" w:color="auto"/>
               <w:right w:val="single" w:sz="4" w:space="0" w:color="auto"/>
             </w:tcBorders>
             <w:noWrap/>
-            <w:vAlign w:val="bottom"/>
+            <w:vAlign w:val="center"/>
           </w:tcPr>
           <w:p>
             <w:pPr>
               <w:spacing w:after="0" w:line="240" w:lineRule="auto"/>
-              <w:rPr>
-                <w:rFonts w:ascii="Segoe UI Symbol" w:eastAsia="Times New Roman" w:hAnsi="Segoe UI Symbol" w:cs="Calibri"/>
-                <w:color w:val="000000"/>
-                <w:lang w:eastAsia="en-PH"/>
-              </w:rPr>
-            </w:pPr>
-            <w:r>
-              <w:rPr>
-                <w:rFonts w:ascii="Segoe UI Symbol" w:eastAsia="Times New Roman" w:hAnsi="Segoe UI Symbol" w:cs="Calibri"/>
-                <w:color w:val="000000"/>
-                <w:lang w:eastAsia="en-PH"/>
-              </w:rPr>
-              <w:t>{cb</w:t>
-            </w:r>
-            <w:r>
-              <w:rPr>
-                <w:rFonts w:ascii="Segoe UI Symbol" w:eastAsia="Times New Roman" w:hAnsi="Segoe UI Symbol" w:cs="Calibri"/>
-                <w:color w:val="000000"/>
-                <w:lang w:eastAsia="en-PH"/>
-              </w:rPr>
-              <w:t>7</w:t>
-            </w:r>
-            <w:r>
-              <w:rPr>
-                <w:rFonts w:ascii="Segoe UI Symbol" w:eastAsia="Times New Roman" w:hAnsi="Segoe UI Symbol" w:cs="Calibri"/>
-                <w:color w:val="000000"/>
+              <w:jc w:val="center"/>
+              <w:rPr>
+                <w:rFonts w:ascii="Segoe UI Symbol" w:eastAsia="Times New Roman" w:hAnsi="Segoe UI Symbol" w:cs="Calibri"/>
+                <w:color w:val="000000"/>
+                <w:sz w:val="18"/>
+                <w:szCs w:val="18"/>
+                <w:lang w:eastAsia="en-PH"/>
+              </w:rPr>
+            </w:pPr>
+            <w:r>
+              <w:rPr>
+                <w:rFonts w:ascii="Segoe UI Symbol" w:eastAsia="Times New Roman" w:hAnsi="Segoe UI Symbol" w:cs="Calibri"/>
+                <w:color w:val="000000"/>
+                <w:sz w:val="18"/>
+                <w:szCs w:val="18"/>
+                <w:lang w:eastAsia="en-PH"/>
+              </w:rPr>
+              <w:t>{</w:t>
+            </w:r>
+            <w:r>
+              <w:rPr>
+                <w:rFonts w:ascii="Segoe UI Symbol" w:eastAsia="Times New Roman" w:hAnsi="Segoe UI Symbol" w:cs="Calibri"/>
+                <w:color w:val="000000"/>
+                <w:sz w:val="18"/>
+                <w:szCs w:val="18"/>
+                <w:lang w:eastAsia="en-PH"/>
+              </w:rPr>
+              <w:t>h</w:t>
+            </w:r>
+            <w:r>
+              <w:rPr>
+                <w:rFonts w:ascii="Segoe UI Symbol" w:eastAsia="Times New Roman" w:hAnsi="Segoe UI Symbol" w:cs="Calibri"/>
+                <w:color w:val="000000"/>
+                <w:sz w:val="18"/>
+                <w:szCs w:val="18"/>
                 <w:lang w:eastAsia="en-PH"/>
               </w:rPr>
               <w:t>}</w:t>
@@ -2381,12 +2576,9 @@
         </w:tc>
         <w:tc>
           <w:tcPr>
-            <w:tcW w:w="9229" w:type="dxa"/>
+            <w:tcW w:w="8973" w:type="dxa"/>
             <w:tcBorders>
-              <w:top w:val="nil"/>
-              <w:left w:val="nil"/>
-              <w:bottom w:val="nil"/>
-              <w:right w:val="nil"/>
+              <w:left w:val="single" w:sz="4" w:space="0" w:color="auto"/>
             </w:tcBorders>
             <w:noWrap/>
             <w:vAlign w:val="center"/>
@@ -2453,45 +2645,56 @@
         </w:trPr>
         <w:tc>
           <w:tcPr>
-            <w:tcW w:w="311" w:type="dxa"/>
+            <w:tcW w:w="567" w:type="dxa"/>
             <w:tcBorders>
-              <w:top w:val="nil"/>
+              <w:top w:val="single" w:sz="4" w:space="0" w:color="auto"/>
               <w:left w:val="single" w:sz="4" w:space="0" w:color="auto"/>
               <w:bottom w:val="single" w:sz="4" w:space="0" w:color="auto"/>
               <w:right w:val="single" w:sz="4" w:space="0" w:color="auto"/>
             </w:tcBorders>
             <w:noWrap/>
-            <w:vAlign w:val="bottom"/>
+            <w:vAlign w:val="center"/>
           </w:tcPr>
           <w:p>
             <w:pPr>
               <w:spacing w:after="0" w:line="240" w:lineRule="auto"/>
+              <w:jc w:val="center"/>
               <w:rPr>
                 <w:rFonts w:ascii="Calibri" w:eastAsia="Times New Roman" w:hAnsi="Calibri" w:cs="Calibri"/>
                 <w:color w:val="000000"/>
-                <w:lang w:eastAsia="en-PH"/>
-              </w:rPr>
-            </w:pPr>
-            <w:r>
-              <w:rPr>
-                <w:rFonts w:ascii="Segoe UI Symbol" w:eastAsia="Times New Roman" w:hAnsi="Segoe UI Symbol" w:cs="Calibri"/>
-                <w:color w:val="000000"/>
-                <w:lang w:eastAsia="en-PH"/>
-              </w:rPr>
-              <w:t>{cb</w:t>
-            </w:r>
-            <w:r>
-              <w:rPr>
-                <w:rFonts w:ascii="Segoe UI Symbol" w:eastAsia="Times New Roman" w:hAnsi="Segoe UI Symbol" w:cs="Calibri"/>
-                <w:color w:val="000000"/>
-                <w:lang w:eastAsia="en-PH"/>
-              </w:rPr>
-              <w:t>8</w:t>
-            </w:r>
-            <w:r>
-              <w:rPr>
-                <w:rFonts w:ascii="Segoe UI Symbol" w:eastAsia="Times New Roman" w:hAnsi="Segoe UI Symbol" w:cs="Calibri"/>
-                <w:color w:val="000000"/>
+                <w:sz w:val="18"/>
+                <w:szCs w:val="18"/>
+                <w:lang w:eastAsia="en-PH"/>
+              </w:rPr>
+            </w:pPr>
+            <w:r>
+              <w:rPr>
+                <w:rFonts w:ascii="Calibri" w:eastAsia="Times New Roman" w:hAnsi="Calibri" w:cs="Calibri"/>
+                <w:color w:val="000000"/>
+                <w:sz w:val="18"/>
+                <w:szCs w:val="18"/>
+                <w:lang w:eastAsia="en-PH"/>
+              </w:rPr>
+              <w:t>{</w:t>
+            </w:r>
+            <w:proofErr w:type="spellStart"/>
+            <w:r>
+              <w:rPr>
+                <w:rFonts w:ascii="Calibri" w:eastAsia="Times New Roman" w:hAnsi="Calibri" w:cs="Calibri"/>
+                <w:color w:val="000000"/>
+                <w:sz w:val="18"/>
+                <w:szCs w:val="18"/>
+                <w:lang w:eastAsia="en-PH"/>
+              </w:rPr>
+              <w:t>i</w:t>
+            </w:r>
+            <w:proofErr w:type="spellEnd"/>
+            <w:r>
+              <w:rPr>
+                <w:rFonts w:ascii="Calibri" w:eastAsia="Times New Roman" w:hAnsi="Calibri" w:cs="Calibri"/>
+                <w:color w:val="000000"/>
+                <w:sz w:val="18"/>
+                <w:szCs w:val="18"/>
                 <w:lang w:eastAsia="en-PH"/>
               </w:rPr>
               <w:t>}</w:t>
@@ -2500,12 +2703,9 @@
         </w:tc>
         <w:tc>
           <w:tcPr>
-            <w:tcW w:w="9229" w:type="dxa"/>
+            <w:tcW w:w="8973" w:type="dxa"/>
             <w:tcBorders>
-              <w:top w:val="nil"/>
-              <w:left w:val="nil"/>
-              <w:bottom w:val="nil"/>
-              <w:right w:val="nil"/>
+              <w:left w:val="single" w:sz="4" w:space="0" w:color="auto"/>
             </w:tcBorders>
             <w:noWrap/>
             <w:vAlign w:val="center"/>
@@ -2552,46 +2752,54 @@
         </w:trPr>
         <w:tc>
           <w:tcPr>
-            <w:tcW w:w="311" w:type="dxa"/>
+            <w:tcW w:w="567" w:type="dxa"/>
             <w:tcBorders>
-              <w:top w:val="nil"/>
+              <w:top w:val="single" w:sz="4" w:space="0" w:color="auto"/>
               <w:left w:val="single" w:sz="4" w:space="0" w:color="auto"/>
               <w:bottom w:val="single" w:sz="4" w:space="0" w:color="auto"/>
               <w:right w:val="single" w:sz="4" w:space="0" w:color="auto"/>
             </w:tcBorders>
             <w:noWrap/>
-            <w:vAlign w:val="bottom"/>
+            <w:vAlign w:val="center"/>
           </w:tcPr>
           <w:p>
             <w:pPr>
               <w:spacing w:after="0" w:line="240" w:lineRule="auto"/>
-              <w:rPr>
-                <w:rFonts w:ascii="Segoe UI Symbol" w:eastAsia="Times New Roman" w:hAnsi="Segoe UI Symbol" w:cs="Calibri"/>
-                <w:color w:val="000000"/>
-                <w:lang w:eastAsia="en-PH"/>
-              </w:rPr>
-            </w:pPr>
-            <w:r>
-              <w:rPr>
-                <w:rFonts w:ascii="Segoe UI Symbol" w:eastAsia="Times New Roman" w:hAnsi="Segoe UI Symbol" w:cs="Calibri"/>
-                <w:color w:val="000000"/>
-                <w:lang w:eastAsia="en-PH"/>
-              </w:rPr>
-              <w:lastRenderedPageBreak/>
-              <w:t>{cb</w:t>
-            </w:r>
-            <w:r>
-              <w:rPr>
-                <w:rFonts w:ascii="Segoe UI Symbol" w:eastAsia="Times New Roman" w:hAnsi="Segoe UI Symbol" w:cs="Calibri"/>
-                <w:color w:val="000000"/>
-                <w:lang w:eastAsia="en-PH"/>
-              </w:rPr>
-              <w:t>9</w:t>
-            </w:r>
-            <w:r>
-              <w:rPr>
-                <w:rFonts w:ascii="Segoe UI Symbol" w:eastAsia="Times New Roman" w:hAnsi="Segoe UI Symbol" w:cs="Calibri"/>
-                <w:color w:val="000000"/>
+              <w:jc w:val="center"/>
+              <w:rPr>
+                <w:rFonts w:ascii="Segoe UI Symbol" w:eastAsia="Times New Roman" w:hAnsi="Segoe UI Symbol" w:cs="Calibri"/>
+                <w:color w:val="000000"/>
+                <w:sz w:val="18"/>
+                <w:szCs w:val="18"/>
+                <w:lang w:eastAsia="en-PH"/>
+              </w:rPr>
+            </w:pPr>
+            <w:r>
+              <w:rPr>
+                <w:rFonts w:ascii="Segoe UI Symbol" w:eastAsia="Times New Roman" w:hAnsi="Segoe UI Symbol" w:cs="Calibri"/>
+                <w:color w:val="000000"/>
+                <w:sz w:val="18"/>
+                <w:szCs w:val="18"/>
+                <w:lang w:eastAsia="en-PH"/>
+              </w:rPr>
+              <w:t>{</w:t>
+            </w:r>
+            <w:r>
+              <w:rPr>
+                <w:rFonts w:ascii="Segoe UI Symbol" w:eastAsia="Times New Roman" w:hAnsi="Segoe UI Symbol" w:cs="Calibri"/>
+                <w:color w:val="000000"/>
+                <w:sz w:val="18"/>
+                <w:szCs w:val="18"/>
+                <w:lang w:eastAsia="en-PH"/>
+              </w:rPr>
+              <w:t>j</w:t>
+            </w:r>
+            <w:r>
+              <w:rPr>
+                <w:rFonts w:ascii="Segoe UI Symbol" w:eastAsia="Times New Roman" w:hAnsi="Segoe UI Symbol" w:cs="Calibri"/>
+                <w:color w:val="000000"/>
+                <w:sz w:val="18"/>
+                <w:szCs w:val="18"/>
                 <w:lang w:eastAsia="en-PH"/>
               </w:rPr>
               <w:t>}</w:t>
@@ -2600,12 +2808,9 @@
         </w:tc>
         <w:tc>
           <w:tcPr>
-            <w:tcW w:w="9229" w:type="dxa"/>
+            <w:tcW w:w="8973" w:type="dxa"/>
             <w:tcBorders>
-              <w:top w:val="nil"/>
-              <w:left w:val="nil"/>
-              <w:bottom w:val="nil"/>
-              <w:right w:val="nil"/>
+              <w:left w:val="single" w:sz="4" w:space="0" w:color="auto"/>
             </w:tcBorders>
             <w:noWrap/>
             <w:vAlign w:val="center"/>
@@ -2652,12 +2857,9 @@
         </w:trPr>
         <w:tc>
           <w:tcPr>
-            <w:tcW w:w="311" w:type="dxa"/>
+            <w:tcW w:w="567" w:type="dxa"/>
             <w:tcBorders>
-              <w:top w:val="nil"/>
-              <w:left w:val="nil"/>
-              <w:bottom w:val="nil"/>
-              <w:right w:val="nil"/>
+              <w:top w:val="single" w:sz="4" w:space="0" w:color="auto"/>
             </w:tcBorders>
             <w:noWrap/>
             <w:vAlign w:val="bottom"/>
@@ -2679,12 +2881,9 @@
         </w:tc>
         <w:tc>
           <w:tcPr>
-            <w:tcW w:w="9229" w:type="dxa"/>
+            <w:tcW w:w="8973" w:type="dxa"/>
             <w:tcBorders>
-              <w:top w:val="nil"/>
               <w:left w:val="nil"/>
-              <w:bottom w:val="nil"/>
-              <w:right w:val="nil"/>
             </w:tcBorders>
             <w:noWrap/>
             <w:vAlign w:val="center"/>
@@ -2788,12 +2987,6 @@
           <w:tcPr>
             <w:tcW w:w="9540" w:type="dxa"/>
             <w:gridSpan w:val="2"/>
-            <w:tcBorders>
-              <w:top w:val="nil"/>
-              <w:left w:val="nil"/>
-              <w:bottom w:val="nil"/>
-              <w:right w:val="nil"/>
-            </w:tcBorders>
             <w:vAlign w:val="center"/>
             <w:hideMark/>
           </w:tcPr>
@@ -2831,7 +3024,7 @@
         </w:trPr>
         <w:tc>
           <w:tcPr>
-            <w:tcW w:w="311" w:type="dxa"/>
+            <w:tcW w:w="567" w:type="dxa"/>
             <w:tcBorders>
               <w:top w:val="single" w:sz="4" w:space="0" w:color="auto"/>
               <w:left w:val="single" w:sz="4" w:space="0" w:color="auto"/>
@@ -2839,37 +3032,46 @@
               <w:right w:val="single" w:sz="4" w:space="0" w:color="auto"/>
             </w:tcBorders>
             <w:noWrap/>
-            <w:vAlign w:val="bottom"/>
+            <w:vAlign w:val="center"/>
           </w:tcPr>
           <w:p>
             <w:pPr>
               <w:spacing w:after="0" w:line="240" w:lineRule="auto"/>
-              <w:rPr>
-                <w:rFonts w:ascii="Segoe UI Symbol" w:eastAsia="Times New Roman" w:hAnsi="Segoe UI Symbol" w:cs="Calibri"/>
-                <w:color w:val="000000"/>
-                <w:lang w:eastAsia="en-PH"/>
-              </w:rPr>
-            </w:pPr>
-            <w:r>
-              <w:rPr>
-                <w:rFonts w:ascii="Segoe UI Symbol" w:eastAsia="Times New Roman" w:hAnsi="Segoe UI Symbol" w:cs="Calibri"/>
-                <w:color w:val="000000"/>
-                <w:lang w:eastAsia="en-PH"/>
-              </w:rPr>
-              <w:t>{cb</w:t>
-            </w:r>
-            <w:r>
-              <w:rPr>
-                <w:rFonts w:ascii="Segoe UI Symbol" w:eastAsia="Times New Roman" w:hAnsi="Segoe UI Symbol" w:cs="Calibri"/>
-                <w:color w:val="000000"/>
-                <w:lang w:eastAsia="en-PH"/>
-              </w:rPr>
-              <w:t>10</w:t>
-            </w:r>
-            <w:r>
-              <w:rPr>
-                <w:rFonts w:ascii="Segoe UI Symbol" w:eastAsia="Times New Roman" w:hAnsi="Segoe UI Symbol" w:cs="Calibri"/>
-                <w:color w:val="000000"/>
+              <w:jc w:val="center"/>
+              <w:rPr>
+                <w:rFonts w:ascii="Segoe UI Symbol" w:eastAsia="Times New Roman" w:hAnsi="Segoe UI Symbol" w:cs="Calibri"/>
+                <w:color w:val="000000"/>
+                <w:sz w:val="18"/>
+                <w:szCs w:val="18"/>
+                <w:lang w:eastAsia="en-PH"/>
+              </w:rPr>
+            </w:pPr>
+            <w:r>
+              <w:rPr>
+                <w:rFonts w:ascii="Segoe UI Symbol" w:eastAsia="Times New Roman" w:hAnsi="Segoe UI Symbol" w:cs="Calibri"/>
+                <w:color w:val="000000"/>
+                <w:sz w:val="18"/>
+                <w:szCs w:val="18"/>
+                <w:lang w:eastAsia="en-PH"/>
+              </w:rPr>
+              <w:t>{</w:t>
+            </w:r>
+            <w:r>
+              <w:rPr>
+                <w:rFonts w:ascii="Segoe UI Symbol" w:eastAsia="Times New Roman" w:hAnsi="Segoe UI Symbol" w:cs="Calibri"/>
+                <w:color w:val="000000"/>
+                <w:sz w:val="18"/>
+                <w:szCs w:val="18"/>
+                <w:lang w:eastAsia="en-PH"/>
+              </w:rPr>
+              <w:t>k</w:t>
+            </w:r>
+            <w:r>
+              <w:rPr>
+                <w:rFonts w:ascii="Segoe UI Symbol" w:eastAsia="Times New Roman" w:hAnsi="Segoe UI Symbol" w:cs="Calibri"/>
+                <w:color w:val="000000"/>
+                <w:sz w:val="18"/>
+                <w:szCs w:val="18"/>
                 <w:lang w:eastAsia="en-PH"/>
               </w:rPr>
               <w:t>}</w:t>
@@ -2878,12 +3080,9 @@
         </w:tc>
         <w:tc>
           <w:tcPr>
-            <w:tcW w:w="9229" w:type="dxa"/>
+            <w:tcW w:w="8973" w:type="dxa"/>
             <w:tcBorders>
-              <w:top w:val="nil"/>
-              <w:left w:val="nil"/>
-              <w:bottom w:val="nil"/>
-              <w:right w:val="nil"/>
+              <w:left w:val="single" w:sz="4" w:space="0" w:color="auto"/>
             </w:tcBorders>
             <w:noWrap/>
             <w:vAlign w:val="center"/>
@@ -2930,45 +3129,54 @@
         </w:trPr>
         <w:tc>
           <w:tcPr>
-            <w:tcW w:w="311" w:type="dxa"/>
+            <w:tcW w:w="567" w:type="dxa"/>
             <w:tcBorders>
-              <w:top w:val="nil"/>
+              <w:top w:val="single" w:sz="4" w:space="0" w:color="auto"/>
               <w:left w:val="single" w:sz="4" w:space="0" w:color="auto"/>
               <w:bottom w:val="single" w:sz="4" w:space="0" w:color="auto"/>
               <w:right w:val="single" w:sz="4" w:space="0" w:color="auto"/>
             </w:tcBorders>
             <w:noWrap/>
-            <w:vAlign w:val="bottom"/>
+            <w:vAlign w:val="center"/>
           </w:tcPr>
           <w:p>
             <w:pPr>
               <w:spacing w:after="0" w:line="240" w:lineRule="auto"/>
-              <w:rPr>
-                <w:rFonts w:ascii="Segoe UI Symbol" w:eastAsia="Times New Roman" w:hAnsi="Segoe UI Symbol" w:cs="Calibri"/>
-                <w:color w:val="000000"/>
-                <w:lang w:eastAsia="en-PH"/>
-              </w:rPr>
-            </w:pPr>
-            <w:r>
-              <w:rPr>
-                <w:rFonts w:ascii="Segoe UI Symbol" w:eastAsia="Times New Roman" w:hAnsi="Segoe UI Symbol" w:cs="Calibri"/>
-                <w:color w:val="000000"/>
-                <w:lang w:eastAsia="en-PH"/>
-              </w:rPr>
-              <w:t>{cb1</w:t>
-            </w:r>
-            <w:r>
-              <w:rPr>
-                <w:rFonts w:ascii="Segoe UI Symbol" w:eastAsia="Times New Roman" w:hAnsi="Segoe UI Symbol" w:cs="Calibri"/>
-                <w:color w:val="000000"/>
-                <w:lang w:eastAsia="en-PH"/>
-              </w:rPr>
-              <w:t>1</w:t>
-            </w:r>
-            <w:r>
-              <w:rPr>
-                <w:rFonts w:ascii="Segoe UI Symbol" w:eastAsia="Times New Roman" w:hAnsi="Segoe UI Symbol" w:cs="Calibri"/>
-                <w:color w:val="000000"/>
+              <w:jc w:val="center"/>
+              <w:rPr>
+                <w:rFonts w:ascii="Segoe UI Symbol" w:eastAsia="Times New Roman" w:hAnsi="Segoe UI Symbol" w:cs="Calibri"/>
+                <w:color w:val="000000"/>
+                <w:sz w:val="18"/>
+                <w:szCs w:val="18"/>
+                <w:lang w:eastAsia="en-PH"/>
+              </w:rPr>
+            </w:pPr>
+            <w:r>
+              <w:rPr>
+                <w:rFonts w:ascii="Segoe UI Symbol" w:eastAsia="Times New Roman" w:hAnsi="Segoe UI Symbol" w:cs="Calibri"/>
+                <w:color w:val="000000"/>
+                <w:sz w:val="18"/>
+                <w:szCs w:val="18"/>
+                <w:lang w:eastAsia="en-PH"/>
+              </w:rPr>
+              <w:t>{</w:t>
+            </w:r>
+            <w:r>
+              <w:rPr>
+                <w:rFonts w:ascii="Segoe UI Symbol" w:eastAsia="Times New Roman" w:hAnsi="Segoe UI Symbol" w:cs="Calibri"/>
+                <w:color w:val="000000"/>
+                <w:sz w:val="18"/>
+                <w:szCs w:val="18"/>
+                <w:lang w:eastAsia="en-PH"/>
+              </w:rPr>
+              <w:t>l</w:t>
+            </w:r>
+            <w:r>
+              <w:rPr>
+                <w:rFonts w:ascii="Segoe UI Symbol" w:eastAsia="Times New Roman" w:hAnsi="Segoe UI Symbol" w:cs="Calibri"/>
+                <w:color w:val="000000"/>
+                <w:sz w:val="18"/>
+                <w:szCs w:val="18"/>
                 <w:lang w:eastAsia="en-PH"/>
               </w:rPr>
               <w:t>}</w:t>
@@ -2977,12 +3185,9 @@
         </w:tc>
         <w:tc>
           <w:tcPr>
-            <w:tcW w:w="9229" w:type="dxa"/>
+            <w:tcW w:w="8973" w:type="dxa"/>
             <w:tcBorders>
-              <w:top w:val="nil"/>
-              <w:left w:val="nil"/>
-              <w:bottom w:val="nil"/>
-              <w:right w:val="nil"/>
+              <w:left w:val="single" w:sz="4" w:space="0" w:color="auto"/>
             </w:tcBorders>
             <w:noWrap/>
             <w:vAlign w:val="center"/>
@@ -3029,45 +3234,55 @@
         </w:trPr>
         <w:tc>
           <w:tcPr>
-            <w:tcW w:w="311" w:type="dxa"/>
+            <w:tcW w:w="567" w:type="dxa"/>
             <w:tcBorders>
-              <w:top w:val="nil"/>
+              <w:top w:val="single" w:sz="4" w:space="0" w:color="auto"/>
               <w:left w:val="single" w:sz="4" w:space="0" w:color="auto"/>
               <w:bottom w:val="single" w:sz="4" w:space="0" w:color="auto"/>
               <w:right w:val="single" w:sz="4" w:space="0" w:color="auto"/>
             </w:tcBorders>
             <w:noWrap/>
-            <w:vAlign w:val="bottom"/>
+            <w:vAlign w:val="center"/>
           </w:tcPr>
           <w:p>
             <w:pPr>
               <w:spacing w:after="0" w:line="240" w:lineRule="auto"/>
-              <w:rPr>
-                <w:rFonts w:ascii="Segoe UI Symbol" w:eastAsia="Times New Roman" w:hAnsi="Segoe UI Symbol" w:cs="Calibri"/>
-                <w:color w:val="000000"/>
-                <w:lang w:eastAsia="en-PH"/>
-              </w:rPr>
-            </w:pPr>
-            <w:r>
-              <w:rPr>
-                <w:rFonts w:ascii="Segoe UI Symbol" w:eastAsia="Times New Roman" w:hAnsi="Segoe UI Symbol" w:cs="Calibri"/>
-                <w:color w:val="000000"/>
-                <w:lang w:eastAsia="en-PH"/>
-              </w:rPr>
-              <w:t>{cb1</w:t>
-            </w:r>
-            <w:r>
-              <w:rPr>
-                <w:rFonts w:ascii="Segoe UI Symbol" w:eastAsia="Times New Roman" w:hAnsi="Segoe UI Symbol" w:cs="Calibri"/>
-                <w:color w:val="000000"/>
-                <w:lang w:eastAsia="en-PH"/>
-              </w:rPr>
-              <w:t>2</w:t>
-            </w:r>
-            <w:r>
-              <w:rPr>
-                <w:rFonts w:ascii="Segoe UI Symbol" w:eastAsia="Times New Roman" w:hAnsi="Segoe UI Symbol" w:cs="Calibri"/>
-                <w:color w:val="000000"/>
+              <w:jc w:val="center"/>
+              <w:rPr>
+                <w:rFonts w:ascii="Segoe UI Symbol" w:eastAsia="Times New Roman" w:hAnsi="Segoe UI Symbol" w:cs="Calibri"/>
+                <w:color w:val="000000"/>
+                <w:sz w:val="18"/>
+                <w:szCs w:val="18"/>
+                <w:lang w:eastAsia="en-PH"/>
+              </w:rPr>
+            </w:pPr>
+            <w:r>
+              <w:rPr>
+                <w:rFonts w:ascii="Segoe UI Symbol" w:eastAsia="Times New Roman" w:hAnsi="Segoe UI Symbol" w:cs="Calibri"/>
+                <w:color w:val="000000"/>
+                <w:sz w:val="18"/>
+                <w:szCs w:val="18"/>
+                <w:lang w:eastAsia="en-PH"/>
+              </w:rPr>
+              <w:lastRenderedPageBreak/>
+              <w:t>{</w:t>
+            </w:r>
+            <w:r>
+              <w:rPr>
+                <w:rFonts w:ascii="Segoe UI Symbol" w:eastAsia="Times New Roman" w:hAnsi="Segoe UI Symbol" w:cs="Calibri"/>
+                <w:color w:val="000000"/>
+                <w:sz w:val="18"/>
+                <w:szCs w:val="18"/>
+                <w:lang w:eastAsia="en-PH"/>
+              </w:rPr>
+              <w:t>m</w:t>
+            </w:r>
+            <w:r>
+              <w:rPr>
+                <w:rFonts w:ascii="Segoe UI Symbol" w:eastAsia="Times New Roman" w:hAnsi="Segoe UI Symbol" w:cs="Calibri"/>
+                <w:color w:val="000000"/>
+                <w:sz w:val="18"/>
+                <w:szCs w:val="18"/>
                 <w:lang w:eastAsia="en-PH"/>
               </w:rPr>
               <w:t>}</w:t>
@@ -3076,12 +3291,9 @@
         </w:tc>
         <w:tc>
           <w:tcPr>
-            <w:tcW w:w="9229" w:type="dxa"/>
+            <w:tcW w:w="8973" w:type="dxa"/>
             <w:tcBorders>
-              <w:top w:val="nil"/>
-              <w:left w:val="nil"/>
-              <w:bottom w:val="nil"/>
-              <w:right w:val="nil"/>
+              <w:left w:val="single" w:sz="4" w:space="0" w:color="auto"/>
             </w:tcBorders>
             <w:noWrap/>
             <w:vAlign w:val="center"/>
@@ -3128,45 +3340,54 @@
         </w:trPr>
         <w:tc>
           <w:tcPr>
-            <w:tcW w:w="311" w:type="dxa"/>
+            <w:tcW w:w="567" w:type="dxa"/>
             <w:tcBorders>
-              <w:top w:val="nil"/>
+              <w:top w:val="single" w:sz="4" w:space="0" w:color="auto"/>
               <w:left w:val="single" w:sz="4" w:space="0" w:color="auto"/>
               <w:bottom w:val="single" w:sz="4" w:space="0" w:color="auto"/>
               <w:right w:val="single" w:sz="4" w:space="0" w:color="auto"/>
             </w:tcBorders>
             <w:noWrap/>
-            <w:vAlign w:val="bottom"/>
+            <w:vAlign w:val="center"/>
           </w:tcPr>
           <w:p>
             <w:pPr>
               <w:spacing w:after="0" w:line="240" w:lineRule="auto"/>
-              <w:rPr>
-                <w:rFonts w:ascii="Segoe UI Symbol" w:eastAsia="Times New Roman" w:hAnsi="Segoe UI Symbol" w:cs="Calibri"/>
-                <w:color w:val="000000"/>
-                <w:lang w:eastAsia="en-PH"/>
-              </w:rPr>
-            </w:pPr>
-            <w:r>
-              <w:rPr>
-                <w:rFonts w:ascii="Segoe UI Symbol" w:eastAsia="Times New Roman" w:hAnsi="Segoe UI Symbol" w:cs="Calibri"/>
-                <w:color w:val="000000"/>
-                <w:lang w:eastAsia="en-PH"/>
-              </w:rPr>
-              <w:t>{cb1</w:t>
-            </w:r>
-            <w:r>
-              <w:rPr>
-                <w:rFonts w:ascii="Segoe UI Symbol" w:eastAsia="Times New Roman" w:hAnsi="Segoe UI Symbol" w:cs="Calibri"/>
-                <w:color w:val="000000"/>
-                <w:lang w:eastAsia="en-PH"/>
-              </w:rPr>
-              <w:t>3</w:t>
-            </w:r>
-            <w:r>
-              <w:rPr>
-                <w:rFonts w:ascii="Segoe UI Symbol" w:eastAsia="Times New Roman" w:hAnsi="Segoe UI Symbol" w:cs="Calibri"/>
-                <w:color w:val="000000"/>
+              <w:jc w:val="center"/>
+              <w:rPr>
+                <w:rFonts w:ascii="Segoe UI Symbol" w:eastAsia="Times New Roman" w:hAnsi="Segoe UI Symbol" w:cs="Calibri"/>
+                <w:color w:val="000000"/>
+                <w:sz w:val="18"/>
+                <w:szCs w:val="18"/>
+                <w:lang w:eastAsia="en-PH"/>
+              </w:rPr>
+            </w:pPr>
+            <w:r>
+              <w:rPr>
+                <w:rFonts w:ascii="Segoe UI Symbol" w:eastAsia="Times New Roman" w:hAnsi="Segoe UI Symbol" w:cs="Calibri"/>
+                <w:color w:val="000000"/>
+                <w:sz w:val="18"/>
+                <w:szCs w:val="18"/>
+                <w:lang w:eastAsia="en-PH"/>
+              </w:rPr>
+              <w:t>{</w:t>
+            </w:r>
+            <w:r>
+              <w:rPr>
+                <w:rFonts w:ascii="Segoe UI Symbol" w:eastAsia="Times New Roman" w:hAnsi="Segoe UI Symbol" w:cs="Calibri"/>
+                <w:color w:val="000000"/>
+                <w:sz w:val="18"/>
+                <w:szCs w:val="18"/>
+                <w:lang w:eastAsia="en-PH"/>
+              </w:rPr>
+              <w:t>n</w:t>
+            </w:r>
+            <w:r>
+              <w:rPr>
+                <w:rFonts w:ascii="Segoe UI Symbol" w:eastAsia="Times New Roman" w:hAnsi="Segoe UI Symbol" w:cs="Calibri"/>
+                <w:color w:val="000000"/>
+                <w:sz w:val="18"/>
+                <w:szCs w:val="18"/>
                 <w:lang w:eastAsia="en-PH"/>
               </w:rPr>
               <w:t>}</w:t>
@@ -3175,12 +3396,9 @@
         </w:tc>
         <w:tc>
           <w:tcPr>
-            <w:tcW w:w="9229" w:type="dxa"/>
+            <w:tcW w:w="8973" w:type="dxa"/>
             <w:tcBorders>
-              <w:top w:val="nil"/>
-              <w:left w:val="nil"/>
-              <w:bottom w:val="nil"/>
-              <w:right w:val="nil"/>
+              <w:left w:val="single" w:sz="4" w:space="0" w:color="auto"/>
             </w:tcBorders>
             <w:noWrap/>
             <w:vAlign w:val="center"/>
@@ -3227,45 +3445,54 @@
         </w:trPr>
         <w:tc>
           <w:tcPr>
-            <w:tcW w:w="311" w:type="dxa"/>
+            <w:tcW w:w="567" w:type="dxa"/>
             <w:tcBorders>
-              <w:top w:val="nil"/>
+              <w:top w:val="single" w:sz="4" w:space="0" w:color="auto"/>
               <w:left w:val="single" w:sz="4" w:space="0" w:color="auto"/>
               <w:bottom w:val="single" w:sz="4" w:space="0" w:color="auto"/>
               <w:right w:val="single" w:sz="4" w:space="0" w:color="auto"/>
             </w:tcBorders>
             <w:noWrap/>
-            <w:vAlign w:val="bottom"/>
+            <w:vAlign w:val="center"/>
           </w:tcPr>
           <w:p>
             <w:pPr>
               <w:spacing w:after="0" w:line="240" w:lineRule="auto"/>
-              <w:rPr>
-                <w:rFonts w:ascii="Segoe UI Symbol" w:eastAsia="Times New Roman" w:hAnsi="Segoe UI Symbol" w:cs="Calibri"/>
-                <w:color w:val="000000"/>
-                <w:lang w:eastAsia="en-PH"/>
-              </w:rPr>
-            </w:pPr>
-            <w:r>
-              <w:rPr>
-                <w:rFonts w:ascii="Segoe UI Symbol" w:eastAsia="Times New Roman" w:hAnsi="Segoe UI Symbol" w:cs="Calibri"/>
-                <w:color w:val="000000"/>
-                <w:lang w:eastAsia="en-PH"/>
-              </w:rPr>
-              <w:t>{cb1</w:t>
-            </w:r>
-            <w:r>
-              <w:rPr>
-                <w:rFonts w:ascii="Segoe UI Symbol" w:eastAsia="Times New Roman" w:hAnsi="Segoe UI Symbol" w:cs="Calibri"/>
-                <w:color w:val="000000"/>
-                <w:lang w:eastAsia="en-PH"/>
-              </w:rPr>
-              <w:t>4</w:t>
-            </w:r>
-            <w:r>
-              <w:rPr>
-                <w:rFonts w:ascii="Segoe UI Symbol" w:eastAsia="Times New Roman" w:hAnsi="Segoe UI Symbol" w:cs="Calibri"/>
-                <w:color w:val="000000"/>
+              <w:jc w:val="center"/>
+              <w:rPr>
+                <w:rFonts w:ascii="Segoe UI Symbol" w:eastAsia="Times New Roman" w:hAnsi="Segoe UI Symbol" w:cs="Calibri"/>
+                <w:color w:val="000000"/>
+                <w:sz w:val="18"/>
+                <w:szCs w:val="18"/>
+                <w:lang w:eastAsia="en-PH"/>
+              </w:rPr>
+            </w:pPr>
+            <w:r>
+              <w:rPr>
+                <w:rFonts w:ascii="Segoe UI Symbol" w:eastAsia="Times New Roman" w:hAnsi="Segoe UI Symbol" w:cs="Calibri"/>
+                <w:color w:val="000000"/>
+                <w:sz w:val="18"/>
+                <w:szCs w:val="18"/>
+                <w:lang w:eastAsia="en-PH"/>
+              </w:rPr>
+              <w:t>{</w:t>
+            </w:r>
+            <w:r>
+              <w:rPr>
+                <w:rFonts w:ascii="Segoe UI Symbol" w:eastAsia="Times New Roman" w:hAnsi="Segoe UI Symbol" w:cs="Calibri"/>
+                <w:color w:val="000000"/>
+                <w:sz w:val="18"/>
+                <w:szCs w:val="18"/>
+                <w:lang w:eastAsia="en-PH"/>
+              </w:rPr>
+              <w:t>o</w:t>
+            </w:r>
+            <w:r>
+              <w:rPr>
+                <w:rFonts w:ascii="Segoe UI Symbol" w:eastAsia="Times New Roman" w:hAnsi="Segoe UI Symbol" w:cs="Calibri"/>
+                <w:color w:val="000000"/>
+                <w:sz w:val="18"/>
+                <w:szCs w:val="18"/>
                 <w:lang w:eastAsia="en-PH"/>
               </w:rPr>
               <w:t>}</w:t>
@@ -3274,12 +3501,9 @@
         </w:tc>
         <w:tc>
           <w:tcPr>
-            <w:tcW w:w="9229" w:type="dxa"/>
+            <w:tcW w:w="8973" w:type="dxa"/>
             <w:tcBorders>
-              <w:top w:val="nil"/>
-              <w:left w:val="nil"/>
-              <w:bottom w:val="nil"/>
-              <w:right w:val="nil"/>
+              <w:left w:val="single" w:sz="4" w:space="0" w:color="auto"/>
             </w:tcBorders>
             <w:noWrap/>
             <w:vAlign w:val="center"/>
@@ -3326,45 +3550,54 @@
         </w:trPr>
         <w:tc>
           <w:tcPr>
-            <w:tcW w:w="311" w:type="dxa"/>
+            <w:tcW w:w="567" w:type="dxa"/>
             <w:tcBorders>
-              <w:top w:val="nil"/>
+              <w:top w:val="single" w:sz="4" w:space="0" w:color="auto"/>
               <w:left w:val="single" w:sz="4" w:space="0" w:color="auto"/>
               <w:bottom w:val="single" w:sz="4" w:space="0" w:color="auto"/>
               <w:right w:val="single" w:sz="4" w:space="0" w:color="auto"/>
             </w:tcBorders>
             <w:noWrap/>
-            <w:vAlign w:val="bottom"/>
+            <w:vAlign w:val="center"/>
           </w:tcPr>
           <w:p>
             <w:pPr>
               <w:spacing w:after="0" w:line="240" w:lineRule="auto"/>
-              <w:rPr>
-                <w:rFonts w:ascii="Segoe UI Symbol" w:eastAsia="Times New Roman" w:hAnsi="Segoe UI Symbol" w:cs="Calibri"/>
-                <w:color w:val="000000"/>
-                <w:lang w:eastAsia="en-PH"/>
-              </w:rPr>
-            </w:pPr>
-            <w:r>
-              <w:rPr>
-                <w:rFonts w:ascii="Segoe UI Symbol" w:eastAsia="Times New Roman" w:hAnsi="Segoe UI Symbol" w:cs="Calibri"/>
-                <w:color w:val="000000"/>
-                <w:lang w:eastAsia="en-PH"/>
-              </w:rPr>
-              <w:t>{cb1</w:t>
-            </w:r>
-            <w:r>
-              <w:rPr>
-                <w:rFonts w:ascii="Segoe UI Symbol" w:eastAsia="Times New Roman" w:hAnsi="Segoe UI Symbol" w:cs="Calibri"/>
-                <w:color w:val="000000"/>
-                <w:lang w:eastAsia="en-PH"/>
-              </w:rPr>
-              <w:t>5</w:t>
-            </w:r>
-            <w:r>
-              <w:rPr>
-                <w:rFonts w:ascii="Segoe UI Symbol" w:eastAsia="Times New Roman" w:hAnsi="Segoe UI Symbol" w:cs="Calibri"/>
-                <w:color w:val="000000"/>
+              <w:jc w:val="center"/>
+              <w:rPr>
+                <w:rFonts w:ascii="Segoe UI Symbol" w:eastAsia="Times New Roman" w:hAnsi="Segoe UI Symbol" w:cs="Calibri"/>
+                <w:color w:val="000000"/>
+                <w:sz w:val="18"/>
+                <w:szCs w:val="18"/>
+                <w:lang w:eastAsia="en-PH"/>
+              </w:rPr>
+            </w:pPr>
+            <w:r>
+              <w:rPr>
+                <w:rFonts w:ascii="Segoe UI Symbol" w:eastAsia="Times New Roman" w:hAnsi="Segoe UI Symbol" w:cs="Calibri"/>
+                <w:color w:val="000000"/>
+                <w:sz w:val="18"/>
+                <w:szCs w:val="18"/>
+                <w:lang w:eastAsia="en-PH"/>
+              </w:rPr>
+              <w:t>{</w:t>
+            </w:r>
+            <w:r>
+              <w:rPr>
+                <w:rFonts w:ascii="Segoe UI Symbol" w:eastAsia="Times New Roman" w:hAnsi="Segoe UI Symbol" w:cs="Calibri"/>
+                <w:color w:val="000000"/>
+                <w:sz w:val="18"/>
+                <w:szCs w:val="18"/>
+                <w:lang w:eastAsia="en-PH"/>
+              </w:rPr>
+              <w:t>p</w:t>
+            </w:r>
+            <w:r>
+              <w:rPr>
+                <w:rFonts w:ascii="Segoe UI Symbol" w:eastAsia="Times New Roman" w:hAnsi="Segoe UI Symbol" w:cs="Calibri"/>
+                <w:color w:val="000000"/>
+                <w:sz w:val="18"/>
+                <w:szCs w:val="18"/>
                 <w:lang w:eastAsia="en-PH"/>
               </w:rPr>
               <w:t>}</w:t>
@@ -3373,12 +3606,9 @@
         </w:tc>
         <w:tc>
           <w:tcPr>
-            <w:tcW w:w="9229" w:type="dxa"/>
+            <w:tcW w:w="8973" w:type="dxa"/>
             <w:tcBorders>
-              <w:top w:val="nil"/>
-              <w:left w:val="nil"/>
-              <w:bottom w:val="nil"/>
-              <w:right w:val="nil"/>
+              <w:left w:val="single" w:sz="4" w:space="0" w:color="auto"/>
             </w:tcBorders>
             <w:noWrap/>
             <w:vAlign w:val="center"/>
@@ -3425,45 +3655,54 @@
         </w:trPr>
         <w:tc>
           <w:tcPr>
-            <w:tcW w:w="311" w:type="dxa"/>
+            <w:tcW w:w="567" w:type="dxa"/>
             <w:tcBorders>
-              <w:top w:val="nil"/>
+              <w:top w:val="single" w:sz="4" w:space="0" w:color="auto"/>
               <w:left w:val="single" w:sz="4" w:space="0" w:color="auto"/>
               <w:bottom w:val="single" w:sz="4" w:space="0" w:color="auto"/>
               <w:right w:val="single" w:sz="4" w:space="0" w:color="auto"/>
             </w:tcBorders>
             <w:noWrap/>
-            <w:vAlign w:val="bottom"/>
+            <w:vAlign w:val="center"/>
           </w:tcPr>
           <w:p>
             <w:pPr>
               <w:spacing w:after="0" w:line="240" w:lineRule="auto"/>
-              <w:rPr>
-                <w:rFonts w:ascii="Segoe UI Symbol" w:eastAsia="Times New Roman" w:hAnsi="Segoe UI Symbol" w:cs="Calibri"/>
-                <w:color w:val="000000"/>
-                <w:lang w:eastAsia="en-PH"/>
-              </w:rPr>
-            </w:pPr>
-            <w:r>
-              <w:rPr>
-                <w:rFonts w:ascii="Segoe UI Symbol" w:eastAsia="Times New Roman" w:hAnsi="Segoe UI Symbol" w:cs="Calibri"/>
-                <w:color w:val="000000"/>
-                <w:lang w:eastAsia="en-PH"/>
-              </w:rPr>
-              <w:t>{cb1</w:t>
-            </w:r>
-            <w:r>
-              <w:rPr>
-                <w:rFonts w:ascii="Segoe UI Symbol" w:eastAsia="Times New Roman" w:hAnsi="Segoe UI Symbol" w:cs="Calibri"/>
-                <w:color w:val="000000"/>
-                <w:lang w:eastAsia="en-PH"/>
-              </w:rPr>
-              <w:t>6</w:t>
-            </w:r>
-            <w:r>
-              <w:rPr>
-                <w:rFonts w:ascii="Segoe UI Symbol" w:eastAsia="Times New Roman" w:hAnsi="Segoe UI Symbol" w:cs="Calibri"/>
-                <w:color w:val="000000"/>
+              <w:jc w:val="center"/>
+              <w:rPr>
+                <w:rFonts w:ascii="Segoe UI Symbol" w:eastAsia="Times New Roman" w:hAnsi="Segoe UI Symbol" w:cs="Calibri"/>
+                <w:color w:val="000000"/>
+                <w:sz w:val="18"/>
+                <w:szCs w:val="18"/>
+                <w:lang w:eastAsia="en-PH"/>
+              </w:rPr>
+            </w:pPr>
+            <w:r>
+              <w:rPr>
+                <w:rFonts w:ascii="Segoe UI Symbol" w:eastAsia="Times New Roman" w:hAnsi="Segoe UI Symbol" w:cs="Calibri"/>
+                <w:color w:val="000000"/>
+                <w:sz w:val="18"/>
+                <w:szCs w:val="18"/>
+                <w:lang w:eastAsia="en-PH"/>
+              </w:rPr>
+              <w:t>{</w:t>
+            </w:r>
+            <w:r>
+              <w:rPr>
+                <w:rFonts w:ascii="Segoe UI Symbol" w:eastAsia="Times New Roman" w:hAnsi="Segoe UI Symbol" w:cs="Calibri"/>
+                <w:color w:val="000000"/>
+                <w:sz w:val="18"/>
+                <w:szCs w:val="18"/>
+                <w:lang w:eastAsia="en-PH"/>
+              </w:rPr>
+              <w:t>q</w:t>
+            </w:r>
+            <w:r>
+              <w:rPr>
+                <w:rFonts w:ascii="Segoe UI Symbol" w:eastAsia="Times New Roman" w:hAnsi="Segoe UI Symbol" w:cs="Calibri"/>
+                <w:color w:val="000000"/>
+                <w:sz w:val="18"/>
+                <w:szCs w:val="18"/>
                 <w:lang w:eastAsia="en-PH"/>
               </w:rPr>
               <w:t>}</w:t>
@@ -3472,12 +3711,9 @@
         </w:tc>
         <w:tc>
           <w:tcPr>
-            <w:tcW w:w="9229" w:type="dxa"/>
+            <w:tcW w:w="8973" w:type="dxa"/>
             <w:tcBorders>
-              <w:top w:val="nil"/>
-              <w:left w:val="nil"/>
-              <w:bottom w:val="nil"/>
-              <w:right w:val="nil"/>
+              <w:left w:val="single" w:sz="4" w:space="0" w:color="auto"/>
             </w:tcBorders>
             <w:noWrap/>
             <w:vAlign w:val="center"/>
@@ -3524,45 +3760,54 @@
         </w:trPr>
         <w:tc>
           <w:tcPr>
-            <w:tcW w:w="311" w:type="dxa"/>
+            <w:tcW w:w="567" w:type="dxa"/>
             <w:tcBorders>
-              <w:top w:val="nil"/>
+              <w:top w:val="single" w:sz="4" w:space="0" w:color="auto"/>
               <w:left w:val="single" w:sz="4" w:space="0" w:color="auto"/>
               <w:bottom w:val="single" w:sz="4" w:space="0" w:color="auto"/>
               <w:right w:val="single" w:sz="4" w:space="0" w:color="auto"/>
             </w:tcBorders>
             <w:noWrap/>
-            <w:vAlign w:val="bottom"/>
+            <w:vAlign w:val="center"/>
           </w:tcPr>
           <w:p>
             <w:pPr>
               <w:spacing w:after="0" w:line="240" w:lineRule="auto"/>
-              <w:rPr>
-                <w:rFonts w:ascii="Segoe UI Symbol" w:eastAsia="Times New Roman" w:hAnsi="Segoe UI Symbol" w:cs="Calibri"/>
-                <w:color w:val="000000"/>
-                <w:lang w:eastAsia="en-PH"/>
-              </w:rPr>
-            </w:pPr>
-            <w:r>
-              <w:rPr>
-                <w:rFonts w:ascii="Segoe UI Symbol" w:eastAsia="Times New Roman" w:hAnsi="Segoe UI Symbol" w:cs="Calibri"/>
-                <w:color w:val="000000"/>
-                <w:lang w:eastAsia="en-PH"/>
-              </w:rPr>
-              <w:t>{cb1</w:t>
-            </w:r>
-            <w:r>
-              <w:rPr>
-                <w:rFonts w:ascii="Segoe UI Symbol" w:eastAsia="Times New Roman" w:hAnsi="Segoe UI Symbol" w:cs="Calibri"/>
-                <w:color w:val="000000"/>
-                <w:lang w:eastAsia="en-PH"/>
-              </w:rPr>
-              <w:t>7</w:t>
-            </w:r>
-            <w:r>
-              <w:rPr>
-                <w:rFonts w:ascii="Segoe UI Symbol" w:eastAsia="Times New Roman" w:hAnsi="Segoe UI Symbol" w:cs="Calibri"/>
-                <w:color w:val="000000"/>
+              <w:jc w:val="center"/>
+              <w:rPr>
+                <w:rFonts w:ascii="Segoe UI Symbol" w:eastAsia="Times New Roman" w:hAnsi="Segoe UI Symbol" w:cs="Calibri"/>
+                <w:color w:val="000000"/>
+                <w:sz w:val="18"/>
+                <w:szCs w:val="18"/>
+                <w:lang w:eastAsia="en-PH"/>
+              </w:rPr>
+            </w:pPr>
+            <w:r>
+              <w:rPr>
+                <w:rFonts w:ascii="Segoe UI Symbol" w:eastAsia="Times New Roman" w:hAnsi="Segoe UI Symbol" w:cs="Calibri"/>
+                <w:color w:val="000000"/>
+                <w:sz w:val="18"/>
+                <w:szCs w:val="18"/>
+                <w:lang w:eastAsia="en-PH"/>
+              </w:rPr>
+              <w:t>{</w:t>
+            </w:r>
+            <w:r>
+              <w:rPr>
+                <w:rFonts w:ascii="Segoe UI Symbol" w:eastAsia="Times New Roman" w:hAnsi="Segoe UI Symbol" w:cs="Calibri"/>
+                <w:color w:val="000000"/>
+                <w:sz w:val="18"/>
+                <w:szCs w:val="18"/>
+                <w:lang w:eastAsia="en-PH"/>
+              </w:rPr>
+              <w:t>r</w:t>
+            </w:r>
+            <w:r>
+              <w:rPr>
+                <w:rFonts w:ascii="Segoe UI Symbol" w:eastAsia="Times New Roman" w:hAnsi="Segoe UI Symbol" w:cs="Calibri"/>
+                <w:color w:val="000000"/>
+                <w:sz w:val="18"/>
+                <w:szCs w:val="18"/>
                 <w:lang w:eastAsia="en-PH"/>
               </w:rPr>
               <w:t>}</w:t>
@@ -3571,12 +3816,9 @@
         </w:tc>
         <w:tc>
           <w:tcPr>
-            <w:tcW w:w="9229" w:type="dxa"/>
+            <w:tcW w:w="8973" w:type="dxa"/>
             <w:tcBorders>
-              <w:top w:val="nil"/>
-              <w:left w:val="nil"/>
-              <w:bottom w:val="nil"/>
-              <w:right w:val="nil"/>
+              <w:left w:val="single" w:sz="4" w:space="0" w:color="auto"/>
             </w:tcBorders>
             <w:noWrap/>
             <w:vAlign w:val="center"/>
@@ -3623,45 +3865,54 @@
         </w:trPr>
         <w:tc>
           <w:tcPr>
-            <w:tcW w:w="311" w:type="dxa"/>
+            <w:tcW w:w="567" w:type="dxa"/>
             <w:tcBorders>
-              <w:top w:val="nil"/>
+              <w:top w:val="single" w:sz="4" w:space="0" w:color="auto"/>
               <w:left w:val="single" w:sz="4" w:space="0" w:color="auto"/>
               <w:bottom w:val="single" w:sz="4" w:space="0" w:color="auto"/>
               <w:right w:val="single" w:sz="4" w:space="0" w:color="auto"/>
             </w:tcBorders>
             <w:noWrap/>
-            <w:vAlign w:val="bottom"/>
+            <w:vAlign w:val="center"/>
           </w:tcPr>
           <w:p>
             <w:pPr>
               <w:spacing w:after="0" w:line="240" w:lineRule="auto"/>
-              <w:rPr>
-                <w:rFonts w:ascii="Segoe UI Symbol" w:eastAsia="Times New Roman" w:hAnsi="Segoe UI Symbol" w:cs="Calibri"/>
-                <w:color w:val="000000"/>
-                <w:lang w:eastAsia="en-PH"/>
-              </w:rPr>
-            </w:pPr>
-            <w:r>
-              <w:rPr>
-                <w:rFonts w:ascii="Segoe UI Symbol" w:eastAsia="Times New Roman" w:hAnsi="Segoe UI Symbol" w:cs="Calibri"/>
-                <w:color w:val="000000"/>
-                <w:lang w:eastAsia="en-PH"/>
-              </w:rPr>
-              <w:t>{cb1</w:t>
-            </w:r>
-            <w:r>
-              <w:rPr>
-                <w:rFonts w:ascii="Segoe UI Symbol" w:eastAsia="Times New Roman" w:hAnsi="Segoe UI Symbol" w:cs="Calibri"/>
-                <w:color w:val="000000"/>
-                <w:lang w:eastAsia="en-PH"/>
-              </w:rPr>
-              <w:t>8</w:t>
-            </w:r>
-            <w:r>
-              <w:rPr>
-                <w:rFonts w:ascii="Segoe UI Symbol" w:eastAsia="Times New Roman" w:hAnsi="Segoe UI Symbol" w:cs="Calibri"/>
-                <w:color w:val="000000"/>
+              <w:jc w:val="center"/>
+              <w:rPr>
+                <w:rFonts w:ascii="Segoe UI Symbol" w:eastAsia="Times New Roman" w:hAnsi="Segoe UI Symbol" w:cs="Calibri"/>
+                <w:color w:val="000000"/>
+                <w:sz w:val="18"/>
+                <w:szCs w:val="18"/>
+                <w:lang w:eastAsia="en-PH"/>
+              </w:rPr>
+            </w:pPr>
+            <w:r>
+              <w:rPr>
+                <w:rFonts w:ascii="Segoe UI Symbol" w:eastAsia="Times New Roman" w:hAnsi="Segoe UI Symbol" w:cs="Calibri"/>
+                <w:color w:val="000000"/>
+                <w:sz w:val="18"/>
+                <w:szCs w:val="18"/>
+                <w:lang w:eastAsia="en-PH"/>
+              </w:rPr>
+              <w:t>{</w:t>
+            </w:r>
+            <w:r>
+              <w:rPr>
+                <w:rFonts w:ascii="Segoe UI Symbol" w:eastAsia="Times New Roman" w:hAnsi="Segoe UI Symbol" w:cs="Calibri"/>
+                <w:color w:val="000000"/>
+                <w:sz w:val="18"/>
+                <w:szCs w:val="18"/>
+                <w:lang w:eastAsia="en-PH"/>
+              </w:rPr>
+              <w:t>s</w:t>
+            </w:r>
+            <w:r>
+              <w:rPr>
+                <w:rFonts w:ascii="Segoe UI Symbol" w:eastAsia="Times New Roman" w:hAnsi="Segoe UI Symbol" w:cs="Calibri"/>
+                <w:color w:val="000000"/>
+                <w:sz w:val="18"/>
+                <w:szCs w:val="18"/>
                 <w:lang w:eastAsia="en-PH"/>
               </w:rPr>
               <w:t>}</w:t>
@@ -3670,12 +3921,9 @@
         </w:tc>
         <w:tc>
           <w:tcPr>
-            <w:tcW w:w="9229" w:type="dxa"/>
+            <w:tcW w:w="8973" w:type="dxa"/>
             <w:tcBorders>
-              <w:top w:val="nil"/>
-              <w:left w:val="nil"/>
-              <w:bottom w:val="nil"/>
-              <w:right w:val="nil"/>
+              <w:left w:val="single" w:sz="4" w:space="0" w:color="auto"/>
             </w:tcBorders>
             <w:noWrap/>
             <w:vAlign w:val="center"/>
@@ -3722,45 +3970,54 @@
         </w:trPr>
         <w:tc>
           <w:tcPr>
-            <w:tcW w:w="311" w:type="dxa"/>
+            <w:tcW w:w="567" w:type="dxa"/>
             <w:tcBorders>
-              <w:top w:val="nil"/>
+              <w:top w:val="single" w:sz="4" w:space="0" w:color="auto"/>
               <w:left w:val="single" w:sz="4" w:space="0" w:color="auto"/>
               <w:bottom w:val="single" w:sz="4" w:space="0" w:color="auto"/>
               <w:right w:val="single" w:sz="4" w:space="0" w:color="auto"/>
             </w:tcBorders>
             <w:noWrap/>
-            <w:vAlign w:val="bottom"/>
+            <w:vAlign w:val="center"/>
           </w:tcPr>
           <w:p>
             <w:pPr>
               <w:spacing w:after="0" w:line="240" w:lineRule="auto"/>
+              <w:jc w:val="center"/>
               <w:rPr>
                 <w:rFonts w:ascii="Calibri" w:eastAsia="Times New Roman" w:hAnsi="Calibri" w:cs="Calibri"/>
                 <w:color w:val="000000"/>
-                <w:lang w:eastAsia="en-PH"/>
-              </w:rPr>
-            </w:pPr>
-            <w:r>
-              <w:rPr>
-                <w:rFonts w:ascii="Segoe UI Symbol" w:eastAsia="Times New Roman" w:hAnsi="Segoe UI Symbol" w:cs="Calibri"/>
-                <w:color w:val="000000"/>
-                <w:lang w:eastAsia="en-PH"/>
-              </w:rPr>
-              <w:t>{c</w:t>
-            </w:r>
-            <w:r>
-              <w:rPr>
-                <w:rFonts w:ascii="Segoe UI Symbol" w:eastAsia="Times New Roman" w:hAnsi="Segoe UI Symbol" w:cs="Calibri"/>
-                <w:color w:val="000000"/>
-                <w:lang w:eastAsia="en-PH"/>
-              </w:rPr>
-              <w:t>b19</w:t>
-            </w:r>
-            <w:r>
-              <w:rPr>
-                <w:rFonts w:ascii="Segoe UI Symbol" w:eastAsia="Times New Roman" w:hAnsi="Segoe UI Symbol" w:cs="Calibri"/>
-                <w:color w:val="000000"/>
+                <w:sz w:val="18"/>
+                <w:szCs w:val="18"/>
+                <w:lang w:eastAsia="en-PH"/>
+              </w:rPr>
+            </w:pPr>
+            <w:r>
+              <w:rPr>
+                <w:rFonts w:ascii="Calibri" w:eastAsia="Times New Roman" w:hAnsi="Calibri" w:cs="Calibri"/>
+                <w:color w:val="000000"/>
+                <w:sz w:val="18"/>
+                <w:szCs w:val="18"/>
+                <w:lang w:eastAsia="en-PH"/>
+              </w:rPr>
+              <w:t>{</w:t>
+            </w:r>
+            <w:r>
+              <w:rPr>
+                <w:rFonts w:ascii="Calibri" w:eastAsia="Times New Roman" w:hAnsi="Calibri" w:cs="Calibri"/>
+                <w:color w:val="000000"/>
+                <w:sz w:val="18"/>
+                <w:szCs w:val="18"/>
+                <w:lang w:eastAsia="en-PH"/>
+              </w:rPr>
+              <w:t>t</w:t>
+            </w:r>
+            <w:r>
+              <w:rPr>
+                <w:rFonts w:ascii="Calibri" w:eastAsia="Times New Roman" w:hAnsi="Calibri" w:cs="Calibri"/>
+                <w:color w:val="000000"/>
+                <w:sz w:val="18"/>
+                <w:szCs w:val="18"/>
                 <w:lang w:eastAsia="en-PH"/>
               </w:rPr>
               <w:t>}</w:t>
@@ -3769,12 +4026,9 @@
         </w:tc>
         <w:tc>
           <w:tcPr>
-            <w:tcW w:w="9229" w:type="dxa"/>
+            <w:tcW w:w="8973" w:type="dxa"/>
             <w:tcBorders>
-              <w:top w:val="nil"/>
-              <w:left w:val="nil"/>
-              <w:bottom w:val="nil"/>
-              <w:right w:val="nil"/>
+              <w:left w:val="single" w:sz="4" w:space="0" w:color="auto"/>
             </w:tcBorders>
             <w:noWrap/>
             <w:vAlign w:val="center"/>
@@ -3821,7 +4075,7 @@
         </w:trPr>
         <w:tc>
           <w:tcPr>
-            <w:tcW w:w="311" w:type="dxa"/>
+            <w:tcW w:w="567" w:type="dxa"/>
             <w:tcBorders>
               <w:top w:val="single" w:sz="4" w:space="0" w:color="auto"/>
               <w:left w:val="single" w:sz="4" w:space="0" w:color="auto"/>
@@ -3829,21 +4083,26 @@
               <w:right w:val="single" w:sz="4" w:space="0" w:color="auto"/>
             </w:tcBorders>
             <w:noWrap/>
-            <w:vAlign w:val="bottom"/>
+            <w:vAlign w:val="center"/>
           </w:tcPr>
           <w:p>
             <w:pPr>
               <w:spacing w:after="0" w:line="240" w:lineRule="auto"/>
-              <w:rPr>
-                <w:rFonts w:ascii="Segoe UI Symbol" w:eastAsia="Times New Roman" w:hAnsi="Segoe UI Symbol" w:cs="Calibri"/>
-                <w:color w:val="000000"/>
-                <w:lang w:eastAsia="en-PH"/>
-              </w:rPr>
-            </w:pPr>
-            <w:r>
-              <w:rPr>
-                <w:rFonts w:ascii="Segoe UI Symbol" w:eastAsia="Times New Roman" w:hAnsi="Segoe UI Symbol" w:cs="Calibri"/>
-                <w:color w:val="000000"/>
+              <w:jc w:val="center"/>
+              <w:rPr>
+                <w:rFonts w:ascii="Segoe UI Symbol" w:eastAsia="Times New Roman" w:hAnsi="Segoe UI Symbol" w:cs="Calibri"/>
+                <w:color w:val="000000"/>
+                <w:sz w:val="18"/>
+                <w:szCs w:val="18"/>
+                <w:lang w:eastAsia="en-PH"/>
+              </w:rPr>
+            </w:pPr>
+            <w:r>
+              <w:rPr>
+                <w:rFonts w:ascii="Segoe UI Symbol" w:eastAsia="Times New Roman" w:hAnsi="Segoe UI Symbol" w:cs="Calibri"/>
+                <w:color w:val="000000"/>
+                <w:sz w:val="18"/>
+                <w:szCs w:val="18"/>
                 <w:lang w:eastAsia="en-PH"/>
               </w:rPr>
               <w:t>{</w:t>
@@ -3852,14 +4111,18 @@
               <w:rPr>
                 <w:rFonts w:ascii="Segoe UI Symbol" w:eastAsia="Times New Roman" w:hAnsi="Segoe UI Symbol" w:cs="Calibri"/>
                 <w:color w:val="000000"/>
-                <w:lang w:eastAsia="en-PH"/>
-              </w:rPr>
-              <w:t>damage</w:t>
-            </w:r>
-            <w:r>
-              <w:rPr>
-                <w:rFonts w:ascii="Segoe UI Symbol" w:eastAsia="Times New Roman" w:hAnsi="Segoe UI Symbol" w:cs="Calibri"/>
-                <w:color w:val="000000"/>
+                <w:sz w:val="18"/>
+                <w:szCs w:val="18"/>
+                <w:lang w:eastAsia="en-PH"/>
+              </w:rPr>
+              <w:t>u</w:t>
+            </w:r>
+            <w:r>
+              <w:rPr>
+                <w:rFonts w:ascii="Segoe UI Symbol" w:eastAsia="Times New Roman" w:hAnsi="Segoe UI Symbol" w:cs="Calibri"/>
+                <w:color w:val="000000"/>
+                <w:sz w:val="18"/>
+                <w:szCs w:val="18"/>
                 <w:lang w:eastAsia="en-PH"/>
               </w:rPr>
               <w:t>}</w:t>
@@ -3868,12 +4131,9 @@
         </w:tc>
         <w:tc>
           <w:tcPr>
-            <w:tcW w:w="9229" w:type="dxa"/>
+            <w:tcW w:w="8973" w:type="dxa"/>
             <w:tcBorders>
-              <w:top w:val="nil"/>
-              <w:left w:val="nil"/>
-              <w:bottom w:val="nil"/>
-              <w:right w:val="nil"/>
+              <w:left w:val="single" w:sz="4" w:space="0" w:color="auto"/>
             </w:tcBorders>
             <w:noWrap/>
             <w:vAlign w:val="center"/>
@@ -3960,7 +4220,7 @@
         </w:trPr>
         <w:tc>
           <w:tcPr>
-            <w:tcW w:w="311" w:type="dxa"/>
+            <w:tcW w:w="567" w:type="dxa"/>
             <w:tcBorders>
               <w:top w:val="single" w:sz="4" w:space="0" w:color="auto"/>
               <w:bottom w:val="single" w:sz="4" w:space="0" w:color="auto"/>
@@ -3981,13 +4241,7 @@
         </w:tc>
         <w:tc>
           <w:tcPr>
-            <w:tcW w:w="9229" w:type="dxa"/>
-            <w:tcBorders>
-              <w:top w:val="nil"/>
-              <w:left w:val="nil"/>
-              <w:bottom w:val="nil"/>
-              <w:right w:val="nil"/>
-            </w:tcBorders>
+            <w:tcW w:w="8973" w:type="dxa"/>
             <w:noWrap/>
             <w:vAlign w:val="center"/>
             <w:hideMark/>
@@ -3999,8 +4253,8 @@
               <w:rPr>
                 <w:rFonts w:ascii="Times New Roman" w:eastAsia="Times New Roman" w:hAnsi="Times New Roman" w:cs="Times New Roman"/>
                 <w:color w:val="000000"/>
-                <w:sz w:val="32"/>
-                <w:szCs w:val="32"/>
+                <w:sz w:val="24"/>
+                <w:szCs w:val="24"/>
                 <w:lang w:eastAsia="en-PH"/>
               </w:rPr>
             </w:pPr>
@@ -4022,17 +4276,32 @@
                 <w:szCs w:val="24"/>
                 <w:lang w:eastAsia="en-PH"/>
               </w:rPr>
-              <w:t>If yes, what damage(s) has been observed? __________________________________________________________________________________________________________________</w:t>
-            </w:r>
-            <w:r>
+              <w:t xml:space="preserve">If yes, what damage(s) has been observed? </w:t>
+            </w:r>
+          </w:p>
+          <w:p>
+            <w:pPr>
+              <w:spacing w:after="0" w:line="240" w:lineRule="auto"/>
+              <w:ind w:firstLineChars="200" w:firstLine="480"/>
               <w:rPr>
                 <w:rFonts w:ascii="Times New Roman" w:eastAsia="Times New Roman" w:hAnsi="Times New Roman" w:cs="Times New Roman"/>
                 <w:color w:val="000000"/>
                 <w:sz w:val="24"/>
                 <w:szCs w:val="24"/>
-                <w:lang w:eastAsia="en-PH"/>
-              </w:rPr>
-              <w:t>__________________________</w:t>
+                <w:u w:val="single"/>
+                <w:lang w:eastAsia="en-PH"/>
+              </w:rPr>
+            </w:pPr>
+            <w:r>
+              <w:rPr>
+                <w:rFonts w:ascii="Times New Roman" w:eastAsia="Times New Roman" w:hAnsi="Times New Roman" w:cs="Times New Roman"/>
+                <w:color w:val="000000"/>
+                <w:sz w:val="24"/>
+                <w:szCs w:val="24"/>
+                <w:u w:val="single"/>
+                <w:lang w:eastAsia="en-PH"/>
+              </w:rPr>
+              <w:t>{damage}</w:t>
             </w:r>
           </w:p>
         </w:tc>
@@ -4043,7 +4312,7 @@
         </w:trPr>
         <w:tc>
           <w:tcPr>
-            <w:tcW w:w="311" w:type="dxa"/>
+            <w:tcW w:w="567" w:type="dxa"/>
             <w:tcBorders>
               <w:top w:val="single" w:sz="4" w:space="0" w:color="auto"/>
               <w:left w:val="single" w:sz="4" w:space="0" w:color="auto"/>
@@ -4051,51 +4320,37 @@
               <w:right w:val="single" w:sz="4" w:space="0" w:color="auto"/>
             </w:tcBorders>
             <w:noWrap/>
-            <w:vAlign w:val="bottom"/>
+            <w:vAlign w:val="center"/>
           </w:tcPr>
           <w:p>
             <w:pPr>
               <w:spacing w:after="0" w:line="240" w:lineRule="auto"/>
+              <w:jc w:val="center"/>
               <w:rPr>
                 <w:rFonts w:ascii="Calibri" w:eastAsia="Times New Roman" w:hAnsi="Calibri" w:cs="Calibri"/>
                 <w:color w:val="000000"/>
-                <w:lang w:eastAsia="en-PH"/>
-              </w:rPr>
-            </w:pPr>
-            <w:r>
-              <w:rPr>
-                <w:rFonts w:ascii="Segoe UI Symbol" w:eastAsia="Times New Roman" w:hAnsi="Segoe UI Symbol" w:cs="Calibri"/>
-                <w:color w:val="000000"/>
-                <w:lang w:eastAsia="en-PH"/>
-              </w:rPr>
-              <w:t>{cb</w:t>
-            </w:r>
-            <w:r>
-              <w:rPr>
-                <w:rFonts w:ascii="Segoe UI Symbol" w:eastAsia="Times New Roman" w:hAnsi="Segoe UI Symbol" w:cs="Calibri"/>
-                <w:color w:val="000000"/>
-                <w:lang w:eastAsia="en-PH"/>
-              </w:rPr>
-              <w:t>20</w:t>
-            </w:r>
-            <w:r>
-              <w:rPr>
-                <w:rFonts w:ascii="Segoe UI Symbol" w:eastAsia="Times New Roman" w:hAnsi="Segoe UI Symbol" w:cs="Calibri"/>
-                <w:color w:val="000000"/>
-                <w:lang w:eastAsia="en-PH"/>
-              </w:rPr>
-              <w:t>}</w:t>
+                <w:sz w:val="18"/>
+                <w:szCs w:val="18"/>
+                <w:lang w:eastAsia="en-PH"/>
+              </w:rPr>
+            </w:pPr>
+            <w:r>
+              <w:rPr>
+                <w:rFonts w:ascii="Calibri" w:eastAsia="Times New Roman" w:hAnsi="Calibri" w:cs="Calibri"/>
+                <w:color w:val="000000"/>
+                <w:sz w:val="18"/>
+                <w:szCs w:val="18"/>
+                <w:lang w:eastAsia="en-PH"/>
+              </w:rPr>
+              <w:t>{v}</w:t>
             </w:r>
           </w:p>
         </w:tc>
         <w:tc>
           <w:tcPr>
-            <w:tcW w:w="9229" w:type="dxa"/>
+            <w:tcW w:w="8973" w:type="dxa"/>
             <w:tcBorders>
-              <w:top w:val="nil"/>
-              <w:left w:val="nil"/>
-              <w:bottom w:val="nil"/>
-              <w:right w:val="nil"/>
+              <w:left w:val="single" w:sz="4" w:space="0" w:color="auto"/>
             </w:tcBorders>
             <w:noWrap/>
             <w:vAlign w:val="center"/>
@@ -4142,59 +4397,45 @@
         </w:trPr>
         <w:tc>
           <w:tcPr>
-            <w:tcW w:w="311" w:type="dxa"/>
+            <w:tcW w:w="567" w:type="dxa"/>
             <w:tcBorders>
-              <w:top w:val="nil"/>
+              <w:top w:val="single" w:sz="4" w:space="0" w:color="auto"/>
               <w:left w:val="single" w:sz="4" w:space="0" w:color="auto"/>
               <w:bottom w:val="single" w:sz="4" w:space="0" w:color="auto"/>
               <w:right w:val="single" w:sz="4" w:space="0" w:color="auto"/>
             </w:tcBorders>
             <w:noWrap/>
-            <w:vAlign w:val="bottom"/>
+            <w:vAlign w:val="center"/>
           </w:tcPr>
           <w:p>
             <w:pPr>
               <w:spacing w:after="0" w:line="240" w:lineRule="auto"/>
-              <w:rPr>
-                <w:rFonts w:ascii="Segoe UI Symbol" w:eastAsia="Times New Roman" w:hAnsi="Segoe UI Symbol" w:cs="Calibri"/>
-                <w:color w:val="000000"/>
-                <w:lang w:eastAsia="en-PH"/>
-              </w:rPr>
-            </w:pPr>
-            <w:r>
-              <w:rPr>
-                <w:rFonts w:ascii="Segoe UI Symbol" w:eastAsia="Times New Roman" w:hAnsi="Segoe UI Symbol" w:cs="Calibri"/>
-                <w:color w:val="000000"/>
-                <w:lang w:eastAsia="en-PH"/>
-              </w:rPr>
-              <w:t>{cb</w:t>
-            </w:r>
-            <w:r>
-              <w:rPr>
-                <w:rFonts w:ascii="Segoe UI Symbol" w:eastAsia="Times New Roman" w:hAnsi="Segoe UI Symbol" w:cs="Calibri"/>
-                <w:color w:val="000000"/>
-                <w:lang w:eastAsia="en-PH"/>
-              </w:rPr>
-              <w:t>21</w:t>
-            </w:r>
-            <w:r>
-              <w:rPr>
-                <w:rFonts w:ascii="Segoe UI Symbol" w:eastAsia="Times New Roman" w:hAnsi="Segoe UI Symbol" w:cs="Calibri"/>
-                <w:color w:val="000000"/>
-                <w:lang w:eastAsia="en-PH"/>
-              </w:rPr>
-              <w:t>}</w:t>
+              <w:jc w:val="center"/>
+              <w:rPr>
+                <w:rFonts w:ascii="Segoe UI Symbol" w:eastAsia="Times New Roman" w:hAnsi="Segoe UI Symbol" w:cs="Calibri"/>
+                <w:color w:val="000000"/>
+                <w:sz w:val="18"/>
+                <w:szCs w:val="18"/>
+                <w:lang w:eastAsia="en-PH"/>
+              </w:rPr>
+            </w:pPr>
+            <w:r>
+              <w:rPr>
+                <w:rFonts w:ascii="Segoe UI Symbol" w:eastAsia="Times New Roman" w:hAnsi="Segoe UI Symbol" w:cs="Calibri"/>
+                <w:color w:val="000000"/>
+                <w:sz w:val="18"/>
+                <w:szCs w:val="18"/>
+                <w:lang w:eastAsia="en-PH"/>
+              </w:rPr>
+              <w:t>{w}</w:t>
             </w:r>
           </w:p>
         </w:tc>
         <w:tc>
           <w:tcPr>
-            <w:tcW w:w="9229" w:type="dxa"/>
+            <w:tcW w:w="8973" w:type="dxa"/>
             <w:tcBorders>
-              <w:top w:val="nil"/>
-              <w:left w:val="nil"/>
-              <w:bottom w:val="nil"/>
-              <w:right w:val="nil"/>
+              <w:left w:val="single" w:sz="4" w:space="0" w:color="auto"/>
             </w:tcBorders>
             <w:noWrap/>
             <w:vAlign w:val="center"/>
@@ -4241,45 +4482,54 @@
         </w:trPr>
         <w:tc>
           <w:tcPr>
-            <w:tcW w:w="311" w:type="dxa"/>
+            <w:tcW w:w="567" w:type="dxa"/>
             <w:tcBorders>
-              <w:top w:val="nil"/>
+              <w:top w:val="single" w:sz="4" w:space="0" w:color="auto"/>
               <w:left w:val="single" w:sz="4" w:space="0" w:color="auto"/>
               <w:bottom w:val="single" w:sz="4" w:space="0" w:color="auto"/>
               <w:right w:val="single" w:sz="4" w:space="0" w:color="auto"/>
             </w:tcBorders>
             <w:noWrap/>
-            <w:vAlign w:val="bottom"/>
+            <w:vAlign w:val="center"/>
           </w:tcPr>
           <w:p>
             <w:pPr>
               <w:spacing w:after="0" w:line="240" w:lineRule="auto"/>
-              <w:rPr>
-                <w:rFonts w:ascii="Segoe UI Symbol" w:eastAsia="Times New Roman" w:hAnsi="Segoe UI Symbol" w:cs="Calibri"/>
-                <w:color w:val="000000"/>
-                <w:lang w:eastAsia="en-PH"/>
-              </w:rPr>
-            </w:pPr>
-            <w:r>
-              <w:rPr>
-                <w:rFonts w:ascii="Segoe UI Symbol" w:eastAsia="Times New Roman" w:hAnsi="Segoe UI Symbol" w:cs="Calibri"/>
-                <w:color w:val="000000"/>
-                <w:lang w:eastAsia="en-PH"/>
-              </w:rPr>
-              <w:t>{c</w:t>
-            </w:r>
-            <w:r>
-              <w:rPr>
-                <w:rFonts w:ascii="Segoe UI Symbol" w:eastAsia="Times New Roman" w:hAnsi="Segoe UI Symbol" w:cs="Calibri"/>
-                <w:color w:val="000000"/>
-                <w:lang w:eastAsia="en-PH"/>
-              </w:rPr>
-              <w:t>b22</w:t>
-            </w:r>
-            <w:r>
-              <w:rPr>
-                <w:rFonts w:ascii="Segoe UI Symbol" w:eastAsia="Times New Roman" w:hAnsi="Segoe UI Symbol" w:cs="Calibri"/>
-                <w:color w:val="000000"/>
+              <w:jc w:val="center"/>
+              <w:rPr>
+                <w:rFonts w:ascii="Segoe UI Symbol" w:eastAsia="Times New Roman" w:hAnsi="Segoe UI Symbol" w:cs="Calibri"/>
+                <w:color w:val="000000"/>
+                <w:sz w:val="18"/>
+                <w:szCs w:val="18"/>
+                <w:lang w:eastAsia="en-PH"/>
+              </w:rPr>
+            </w:pPr>
+            <w:r>
+              <w:rPr>
+                <w:rFonts w:ascii="Segoe UI Symbol" w:eastAsia="Times New Roman" w:hAnsi="Segoe UI Symbol" w:cs="Calibri"/>
+                <w:color w:val="000000"/>
+                <w:sz w:val="18"/>
+                <w:szCs w:val="18"/>
+                <w:lang w:eastAsia="en-PH"/>
+              </w:rPr>
+              <w:t>{</w:t>
+            </w:r>
+            <w:r>
+              <w:rPr>
+                <w:rFonts w:ascii="Segoe UI Symbol" w:eastAsia="Times New Roman" w:hAnsi="Segoe UI Symbol" w:cs="Calibri"/>
+                <w:color w:val="000000"/>
+                <w:sz w:val="18"/>
+                <w:szCs w:val="18"/>
+                <w:lang w:eastAsia="en-PH"/>
+              </w:rPr>
+              <w:t>x</w:t>
+            </w:r>
+            <w:r>
+              <w:rPr>
+                <w:rFonts w:ascii="Segoe UI Symbol" w:eastAsia="Times New Roman" w:hAnsi="Segoe UI Symbol" w:cs="Calibri"/>
+                <w:color w:val="000000"/>
+                <w:sz w:val="18"/>
+                <w:szCs w:val="18"/>
                 <w:lang w:eastAsia="en-PH"/>
               </w:rPr>
               <w:t>}</w:t>
@@ -4288,12 +4538,9 @@
         </w:tc>
         <w:tc>
           <w:tcPr>
-            <w:tcW w:w="9229" w:type="dxa"/>
+            <w:tcW w:w="8973" w:type="dxa"/>
             <w:tcBorders>
-              <w:top w:val="nil"/>
-              <w:left w:val="nil"/>
-              <w:bottom w:val="nil"/>
-              <w:right w:val="nil"/>
+              <w:left w:val="single" w:sz="4" w:space="0" w:color="auto"/>
             </w:tcBorders>
             <w:noWrap/>
             <w:vAlign w:val="center"/>
@@ -4340,45 +4587,54 @@
         </w:trPr>
         <w:tc>
           <w:tcPr>
-            <w:tcW w:w="311" w:type="dxa"/>
+            <w:tcW w:w="567" w:type="dxa"/>
             <w:tcBorders>
-              <w:top w:val="nil"/>
+              <w:top w:val="single" w:sz="4" w:space="0" w:color="auto"/>
               <w:left w:val="single" w:sz="4" w:space="0" w:color="auto"/>
               <w:bottom w:val="single" w:sz="4" w:space="0" w:color="auto"/>
               <w:right w:val="single" w:sz="4" w:space="0" w:color="auto"/>
             </w:tcBorders>
             <w:noWrap/>
-            <w:vAlign w:val="bottom"/>
+            <w:vAlign w:val="center"/>
           </w:tcPr>
           <w:p>
             <w:pPr>
               <w:spacing w:after="0" w:line="240" w:lineRule="auto"/>
-              <w:rPr>
-                <w:rFonts w:ascii="Segoe UI Symbol" w:eastAsia="Times New Roman" w:hAnsi="Segoe UI Symbol" w:cs="Calibri"/>
-                <w:color w:val="000000"/>
-                <w:lang w:eastAsia="en-PH"/>
-              </w:rPr>
-            </w:pPr>
-            <w:r>
-              <w:rPr>
-                <w:rFonts w:ascii="Segoe UI Symbol" w:eastAsia="Times New Roman" w:hAnsi="Segoe UI Symbol" w:cs="Calibri"/>
-                <w:color w:val="000000"/>
-                <w:lang w:eastAsia="en-PH"/>
-              </w:rPr>
-              <w:t>{cb</w:t>
-            </w:r>
-            <w:r>
-              <w:rPr>
-                <w:rFonts w:ascii="Segoe UI Symbol" w:eastAsia="Times New Roman" w:hAnsi="Segoe UI Symbol" w:cs="Calibri"/>
-                <w:color w:val="000000"/>
-                <w:lang w:eastAsia="en-PH"/>
-              </w:rPr>
-              <w:t>23</w:t>
-            </w:r>
-            <w:r>
-              <w:rPr>
-                <w:rFonts w:ascii="Segoe UI Symbol" w:eastAsia="Times New Roman" w:hAnsi="Segoe UI Symbol" w:cs="Calibri"/>
-                <w:color w:val="000000"/>
+              <w:jc w:val="center"/>
+              <w:rPr>
+                <w:rFonts w:ascii="Segoe UI Symbol" w:eastAsia="Times New Roman" w:hAnsi="Segoe UI Symbol" w:cs="Calibri"/>
+                <w:color w:val="000000"/>
+                <w:sz w:val="18"/>
+                <w:szCs w:val="18"/>
+                <w:lang w:eastAsia="en-PH"/>
+              </w:rPr>
+            </w:pPr>
+            <w:r>
+              <w:rPr>
+                <w:rFonts w:ascii="Segoe UI Symbol" w:eastAsia="Times New Roman" w:hAnsi="Segoe UI Symbol" w:cs="Calibri"/>
+                <w:color w:val="000000"/>
+                <w:sz w:val="18"/>
+                <w:szCs w:val="18"/>
+                <w:lang w:eastAsia="en-PH"/>
+              </w:rPr>
+              <w:t>{</w:t>
+            </w:r>
+            <w:r>
+              <w:rPr>
+                <w:rFonts w:ascii="Segoe UI Symbol" w:eastAsia="Times New Roman" w:hAnsi="Segoe UI Symbol" w:cs="Calibri"/>
+                <w:color w:val="000000"/>
+                <w:sz w:val="18"/>
+                <w:szCs w:val="18"/>
+                <w:lang w:eastAsia="en-PH"/>
+              </w:rPr>
+              <w:t>y</w:t>
+            </w:r>
+            <w:r>
+              <w:rPr>
+                <w:rFonts w:ascii="Segoe UI Symbol" w:eastAsia="Times New Roman" w:hAnsi="Segoe UI Symbol" w:cs="Calibri"/>
+                <w:color w:val="000000"/>
+                <w:sz w:val="18"/>
+                <w:szCs w:val="18"/>
                 <w:lang w:eastAsia="en-PH"/>
               </w:rPr>
               <w:t>}</w:t>
@@ -4387,12 +4643,9 @@
         </w:tc>
         <w:tc>
           <w:tcPr>
-            <w:tcW w:w="9229" w:type="dxa"/>
+            <w:tcW w:w="8973" w:type="dxa"/>
             <w:tcBorders>
-              <w:top w:val="nil"/>
-              <w:left w:val="nil"/>
-              <w:bottom w:val="nil"/>
-              <w:right w:val="nil"/>
+              <w:left w:val="single" w:sz="4" w:space="0" w:color="auto"/>
             </w:tcBorders>
             <w:noWrap/>
             <w:vAlign w:val="center"/>
@@ -4439,45 +4692,54 @@
         </w:trPr>
         <w:tc>
           <w:tcPr>
-            <w:tcW w:w="311" w:type="dxa"/>
+            <w:tcW w:w="567" w:type="dxa"/>
             <w:tcBorders>
-              <w:top w:val="nil"/>
+              <w:top w:val="single" w:sz="4" w:space="0" w:color="auto"/>
               <w:left w:val="single" w:sz="4" w:space="0" w:color="auto"/>
               <w:bottom w:val="single" w:sz="4" w:space="0" w:color="auto"/>
               <w:right w:val="single" w:sz="4" w:space="0" w:color="auto"/>
             </w:tcBorders>
             <w:noWrap/>
-            <w:vAlign w:val="bottom"/>
+            <w:vAlign w:val="center"/>
           </w:tcPr>
           <w:p>
             <w:pPr>
               <w:spacing w:after="0" w:line="240" w:lineRule="auto"/>
-              <w:rPr>
-                <w:rFonts w:ascii="Segoe UI Symbol" w:eastAsia="Times New Roman" w:hAnsi="Segoe UI Symbol" w:cs="Calibri"/>
-                <w:color w:val="000000"/>
-                <w:lang w:eastAsia="en-PH"/>
-              </w:rPr>
-            </w:pPr>
-            <w:r>
-              <w:rPr>
-                <w:rFonts w:ascii="Segoe UI Symbol" w:eastAsia="Times New Roman" w:hAnsi="Segoe UI Symbol" w:cs="Calibri"/>
-                <w:color w:val="000000"/>
-                <w:lang w:eastAsia="en-PH"/>
-              </w:rPr>
-              <w:t>{cb</w:t>
-            </w:r>
-            <w:r>
-              <w:rPr>
-                <w:rFonts w:ascii="Segoe UI Symbol" w:eastAsia="Times New Roman" w:hAnsi="Segoe UI Symbol" w:cs="Calibri"/>
-                <w:color w:val="000000"/>
-                <w:lang w:eastAsia="en-PH"/>
-              </w:rPr>
-              <w:t>24</w:t>
-            </w:r>
-            <w:r>
-              <w:rPr>
-                <w:rFonts w:ascii="Segoe UI Symbol" w:eastAsia="Times New Roman" w:hAnsi="Segoe UI Symbol" w:cs="Calibri"/>
-                <w:color w:val="000000"/>
+              <w:jc w:val="center"/>
+              <w:rPr>
+                <w:rFonts w:ascii="Segoe UI Symbol" w:eastAsia="Times New Roman" w:hAnsi="Segoe UI Symbol" w:cs="Calibri"/>
+                <w:color w:val="000000"/>
+                <w:sz w:val="18"/>
+                <w:szCs w:val="18"/>
+                <w:lang w:eastAsia="en-PH"/>
+              </w:rPr>
+            </w:pPr>
+            <w:r>
+              <w:rPr>
+                <w:rFonts w:ascii="Segoe UI Symbol" w:eastAsia="Times New Roman" w:hAnsi="Segoe UI Symbol" w:cs="Calibri"/>
+                <w:color w:val="000000"/>
+                <w:sz w:val="18"/>
+                <w:szCs w:val="18"/>
+                <w:lang w:eastAsia="en-PH"/>
+              </w:rPr>
+              <w:t>{</w:t>
+            </w:r>
+            <w:r>
+              <w:rPr>
+                <w:rFonts w:ascii="Segoe UI Symbol" w:eastAsia="Times New Roman" w:hAnsi="Segoe UI Symbol" w:cs="Calibri"/>
+                <w:color w:val="000000"/>
+                <w:sz w:val="18"/>
+                <w:szCs w:val="18"/>
+                <w:lang w:eastAsia="en-PH"/>
+              </w:rPr>
+              <w:t>z</w:t>
+            </w:r>
+            <w:r>
+              <w:rPr>
+                <w:rFonts w:ascii="Segoe UI Symbol" w:eastAsia="Times New Roman" w:hAnsi="Segoe UI Symbol" w:cs="Calibri"/>
+                <w:color w:val="000000"/>
+                <w:sz w:val="18"/>
+                <w:szCs w:val="18"/>
                 <w:lang w:eastAsia="en-PH"/>
               </w:rPr>
               <w:t>}</w:t>
@@ -4486,12 +4748,9 @@
         </w:tc>
         <w:tc>
           <w:tcPr>
-            <w:tcW w:w="9229" w:type="dxa"/>
+            <w:tcW w:w="8973" w:type="dxa"/>
             <w:tcBorders>
-              <w:top w:val="nil"/>
-              <w:left w:val="nil"/>
-              <w:bottom w:val="nil"/>
-              <w:right w:val="nil"/>
+              <w:left w:val="single" w:sz="4" w:space="0" w:color="auto"/>
             </w:tcBorders>
             <w:noWrap/>
             <w:vAlign w:val="center"/>
@@ -4538,59 +4797,45 @@
         </w:trPr>
         <w:tc>
           <w:tcPr>
-            <w:tcW w:w="311" w:type="dxa"/>
+            <w:tcW w:w="567" w:type="dxa"/>
             <w:tcBorders>
-              <w:top w:val="nil"/>
+              <w:top w:val="single" w:sz="4" w:space="0" w:color="auto"/>
               <w:left w:val="single" w:sz="4" w:space="0" w:color="auto"/>
               <w:bottom w:val="single" w:sz="4" w:space="0" w:color="auto"/>
               <w:right w:val="single" w:sz="4" w:space="0" w:color="auto"/>
             </w:tcBorders>
             <w:noWrap/>
-            <w:vAlign w:val="bottom"/>
+            <w:vAlign w:val="center"/>
           </w:tcPr>
           <w:p>
             <w:pPr>
               <w:spacing w:after="0" w:line="240" w:lineRule="auto"/>
-              <w:rPr>
-                <w:rFonts w:ascii="Segoe UI Symbol" w:eastAsia="Times New Roman" w:hAnsi="Segoe UI Symbol" w:cs="Calibri"/>
-                <w:color w:val="000000"/>
-                <w:lang w:eastAsia="en-PH"/>
-              </w:rPr>
-            </w:pPr>
-            <w:r>
-              <w:rPr>
-                <w:rFonts w:ascii="Segoe UI Symbol" w:eastAsia="Times New Roman" w:hAnsi="Segoe UI Symbol" w:cs="Calibri"/>
-                <w:color w:val="000000"/>
-                <w:lang w:eastAsia="en-PH"/>
-              </w:rPr>
-              <w:t>{cb</w:t>
-            </w:r>
-            <w:r>
-              <w:rPr>
-                <w:rFonts w:ascii="Segoe UI Symbol" w:eastAsia="Times New Roman" w:hAnsi="Segoe UI Symbol" w:cs="Calibri"/>
-                <w:color w:val="000000"/>
-                <w:lang w:eastAsia="en-PH"/>
-              </w:rPr>
-              <w:t>25</w:t>
-            </w:r>
-            <w:r>
-              <w:rPr>
-                <w:rFonts w:ascii="Segoe UI Symbol" w:eastAsia="Times New Roman" w:hAnsi="Segoe UI Symbol" w:cs="Calibri"/>
-                <w:color w:val="000000"/>
-                <w:lang w:eastAsia="en-PH"/>
-              </w:rPr>
-              <w:t>}</w:t>
+              <w:jc w:val="center"/>
+              <w:rPr>
+                <w:rFonts w:ascii="Segoe UI Symbol" w:eastAsia="Times New Roman" w:hAnsi="Segoe UI Symbol" w:cs="Calibri"/>
+                <w:color w:val="000000"/>
+                <w:sz w:val="18"/>
+                <w:szCs w:val="18"/>
+                <w:lang w:eastAsia="en-PH"/>
+              </w:rPr>
+            </w:pPr>
+            <w:r>
+              <w:rPr>
+                <w:rFonts w:ascii="Segoe UI Symbol" w:eastAsia="Times New Roman" w:hAnsi="Segoe UI Symbol" w:cs="Calibri"/>
+                <w:color w:val="000000"/>
+                <w:sz w:val="18"/>
+                <w:szCs w:val="18"/>
+                <w:lang w:eastAsia="en-PH"/>
+              </w:rPr>
+              <w:t>{a1}</w:t>
             </w:r>
           </w:p>
         </w:tc>
         <w:tc>
           <w:tcPr>
-            <w:tcW w:w="9229" w:type="dxa"/>
+            <w:tcW w:w="8973" w:type="dxa"/>
             <w:tcBorders>
-              <w:top w:val="nil"/>
-              <w:left w:val="nil"/>
-              <w:bottom w:val="nil"/>
-              <w:right w:val="nil"/>
+              <w:left w:val="single" w:sz="4" w:space="0" w:color="auto"/>
             </w:tcBorders>
             <w:noWrap/>
             <w:vAlign w:val="center"/>
@@ -4637,12 +4882,9 @@
         </w:trPr>
         <w:tc>
           <w:tcPr>
-            <w:tcW w:w="311" w:type="dxa"/>
+            <w:tcW w:w="567" w:type="dxa"/>
             <w:tcBorders>
-              <w:top w:val="nil"/>
-              <w:left w:val="nil"/>
-              <w:bottom w:val="nil"/>
-              <w:right w:val="nil"/>
+              <w:top w:val="single" w:sz="4" w:space="0" w:color="auto"/>
             </w:tcBorders>
             <w:noWrap/>
             <w:vAlign w:val="bottom"/>
@@ -4664,13 +4906,7 @@
         </w:tc>
         <w:tc>
           <w:tcPr>
-            <w:tcW w:w="9229" w:type="dxa"/>
-            <w:tcBorders>
-              <w:top w:val="nil"/>
-              <w:left w:val="nil"/>
-              <w:bottom w:val="nil"/>
-              <w:right w:val="nil"/>
-            </w:tcBorders>
+            <w:tcW w:w="8973" w:type="dxa"/>
             <w:noWrap/>
             <w:vAlign w:val="center"/>
             <w:hideMark/>
@@ -4701,7 +4937,7 @@
                 <w:szCs w:val="20"/>
                 <w:lang w:val="pt-BR" w:eastAsia="en-PH"/>
               </w:rPr>
-              <w:t>GPU:</w:t>
+              <w:t>GPU</w:t>
             </w:r>
             <w:r>
               <w:rPr>
@@ -4710,29 +4946,8 @@
                 <w:szCs w:val="20"/>
                 <w:lang w:val="pt-BR" w:eastAsia="en-PH"/>
               </w:rPr>
-              <w:t xml:space="preserve"> </w:t>
-            </w:r>
-            <w:r>
-              <w:rPr>
-                <w:rFonts w:ascii="Times New Roman" w:eastAsia="Times New Roman" w:hAnsi="Times New Roman" w:cs="Times New Roman"/>
-                <w:sz w:val="20"/>
-                <w:szCs w:val="20"/>
-                <w:u w:val="single"/>
-                <w:lang w:val="pt-BR" w:eastAsia="en-PH"/>
-              </w:rPr>
-              <w:t>Intel(R) Core(TM) i7-7700 CPU @ 3.60GHz   3.60 GHz,</w:t>
-            </w:r>
-          </w:p>
-          <w:p>
-            <w:pPr>
-              <w:spacing w:after="0" w:line="240" w:lineRule="auto"/>
-              <w:rPr>
-                <w:rFonts w:ascii="Times New Roman" w:eastAsia="Times New Roman" w:hAnsi="Times New Roman" w:cs="Times New Roman"/>
-                <w:sz w:val="20"/>
-                <w:szCs w:val="20"/>
-                <w:lang w:eastAsia="en-PH"/>
-              </w:rPr>
-            </w:pPr>
+              <w:t>: {</w:t>
+            </w:r>
             <w:r>
               <w:rPr>
                 <w:rFonts w:ascii="Times New Roman" w:eastAsia="Times New Roman" w:hAnsi="Times New Roman" w:cs="Times New Roman"/>
@@ -4740,47 +4955,46 @@
                 <w:szCs w:val="20"/>
                 <w:lang w:val="pt-BR" w:eastAsia="en-PH"/>
               </w:rPr>
-              <w:t xml:space="preserve">              </w:t>
+              <w:t>gpu</w:t>
             </w:r>
             <w:r>
               <w:rPr>
                 <w:rFonts w:ascii="Times New Roman" w:eastAsia="Times New Roman" w:hAnsi="Times New Roman" w:cs="Times New Roman"/>
                 <w:sz w:val="20"/>
                 <w:szCs w:val="20"/>
-                <w:lang w:eastAsia="en-PH"/>
-              </w:rPr>
-              <w:t xml:space="preserve">RAM: </w:t>
-            </w:r>
-            <w:r>
+                <w:lang w:val="pt-BR" w:eastAsia="en-PH"/>
+              </w:rPr>
+              <w:t>}</w:t>
+            </w:r>
+          </w:p>
+          <w:p>
+            <w:pPr>
+              <w:spacing w:after="0" w:line="240" w:lineRule="auto"/>
               <w:rPr>
                 <w:rFonts w:ascii="Times New Roman" w:eastAsia="Times New Roman" w:hAnsi="Times New Roman" w:cs="Times New Roman"/>
                 <w:sz w:val="20"/>
                 <w:szCs w:val="20"/>
                 <w:lang w:eastAsia="en-PH"/>
               </w:rPr>
-              <w:t>16</w:t>
-            </w:r>
+            </w:pPr>
             <w:r>
               <w:rPr>
                 <w:rFonts w:ascii="Times New Roman" w:eastAsia="Times New Roman" w:hAnsi="Times New Roman" w:cs="Times New Roman"/>
                 <w:sz w:val="20"/>
                 <w:szCs w:val="20"/>
-                <w:u w:val="single"/>
-                <w:lang w:eastAsia="en-PH"/>
-              </w:rPr>
-              <w:t>gb</w:t>
-            </w:r>
-          </w:p>
-          <w:p>
-            <w:pPr>
-              <w:spacing w:after="0" w:line="240" w:lineRule="auto"/>
+                <w:lang w:val="pt-BR" w:eastAsia="en-PH"/>
+              </w:rPr>
+              <w:t xml:space="preserve">              </w:t>
+            </w:r>
+            <w:r>
               <w:rPr>
                 <w:rFonts w:ascii="Times New Roman" w:eastAsia="Times New Roman" w:hAnsi="Times New Roman" w:cs="Times New Roman"/>
                 <w:sz w:val="20"/>
                 <w:szCs w:val="20"/>
                 <w:lang w:eastAsia="en-PH"/>
               </w:rPr>
-            </w:pPr>
+              <w:t xml:space="preserve">RAM: </w:t>
+            </w:r>
             <w:r>
               <w:rPr>
                 <w:rFonts w:ascii="Times New Roman" w:eastAsia="Times New Roman" w:hAnsi="Times New Roman" w:cs="Times New Roman"/>
@@ -4788,7 +5002,7 @@
                 <w:szCs w:val="20"/>
                 <w:lang w:eastAsia="en-PH"/>
               </w:rPr>
-              <w:t xml:space="preserve">              </w:t>
+              <w:t>{</w:t>
             </w:r>
             <w:r>
               <w:rPr>
@@ -4797,7 +5011,7 @@
                 <w:szCs w:val="20"/>
                 <w:lang w:eastAsia="en-PH"/>
               </w:rPr>
-              <w:t>Keyboard</w:t>
+              <w:t>ram</w:t>
             </w:r>
             <w:r>
               <w:rPr>
@@ -4806,39 +5020,37 @@
                 <w:szCs w:val="20"/>
                 <w:lang w:eastAsia="en-PH"/>
               </w:rPr>
-              <w:t xml:space="preserve">: </w:t>
-            </w:r>
-            <w:r>
+              <w:t>}</w:t>
+            </w:r>
+          </w:p>
+          <w:p>
+            <w:pPr>
+              <w:spacing w:after="0" w:line="240" w:lineRule="auto"/>
               <w:rPr>
                 <w:rFonts w:ascii="Times New Roman" w:eastAsia="Times New Roman" w:hAnsi="Times New Roman" w:cs="Times New Roman"/>
                 <w:sz w:val="20"/>
                 <w:szCs w:val="20"/>
-                <w:u w:val="single"/>
-                <w:lang w:eastAsia="en-PH"/>
-              </w:rPr>
-              <w:t xml:space="preserve">Acer Keyboard S/N: </w:t>
-            </w:r>
+                <w:lang w:eastAsia="en-PH"/>
+              </w:rPr>
+            </w:pPr>
             <w:r>
               <w:rPr>
                 <w:rFonts w:ascii="Times New Roman" w:eastAsia="Times New Roman" w:hAnsi="Times New Roman" w:cs="Times New Roman"/>
                 <w:sz w:val="20"/>
                 <w:szCs w:val="20"/>
-                <w:u w:val="single"/>
-                <w:lang w:eastAsia="en-PH"/>
-              </w:rPr>
-              <w:t>DKUSB1P02D90280958K701</w:t>
-            </w:r>
-          </w:p>
-          <w:p>
-            <w:pPr>
-              <w:spacing w:after="0" w:line="240" w:lineRule="auto"/>
+                <w:lang w:eastAsia="en-PH"/>
+              </w:rPr>
+              <w:t xml:space="preserve">              </w:t>
+            </w:r>
+            <w:r>
               <w:rPr>
                 <w:rFonts w:ascii="Times New Roman" w:eastAsia="Times New Roman" w:hAnsi="Times New Roman" w:cs="Times New Roman"/>
                 <w:sz w:val="20"/>
                 <w:szCs w:val="20"/>
                 <w:lang w:eastAsia="en-PH"/>
               </w:rPr>
-            </w:pPr>
+              <w:t>Keyboard</w:t>
+            </w:r>
             <w:r>
               <w:rPr>
                 <w:rFonts w:ascii="Times New Roman" w:eastAsia="Times New Roman" w:hAnsi="Times New Roman" w:cs="Times New Roman"/>
@@ -4846,7 +5058,7 @@
                 <w:szCs w:val="20"/>
                 <w:lang w:eastAsia="en-PH"/>
               </w:rPr>
-              <w:t xml:space="preserve">              </w:t>
+              <w:t xml:space="preserve">: </w:t>
             </w:r>
             <w:r>
               <w:rPr>
@@ -4855,7 +5067,7 @@
                 <w:szCs w:val="20"/>
                 <w:lang w:eastAsia="en-PH"/>
               </w:rPr>
-              <w:t>Mouse</w:t>
+              <w:t>{</w:t>
             </w:r>
             <w:r>
               <w:rPr>
@@ -4864,39 +5076,37 @@
                 <w:szCs w:val="20"/>
                 <w:lang w:eastAsia="en-PH"/>
               </w:rPr>
-              <w:t xml:space="preserve">:  </w:t>
+              <w:t>keyboard</w:t>
             </w:r>
             <w:r>
               <w:rPr>
                 <w:rFonts w:ascii="Times New Roman" w:eastAsia="Times New Roman" w:hAnsi="Times New Roman" w:cs="Times New Roman"/>
                 <w:sz w:val="20"/>
                 <w:szCs w:val="20"/>
-                <w:u w:val="single"/>
-                <w:lang w:eastAsia="en-PH"/>
-              </w:rPr>
-              <w:t xml:space="preserve">Acer Mouse S/N: </w:t>
-            </w:r>
-            <w:r>
+                <w:lang w:eastAsia="en-PH"/>
+              </w:rPr>
+              <w:t>}</w:t>
+            </w:r>
+          </w:p>
+          <w:p>
+            <w:pPr>
+              <w:spacing w:after="0" w:line="240" w:lineRule="auto"/>
               <w:rPr>
                 <w:rFonts w:ascii="Times New Roman" w:eastAsia="Times New Roman" w:hAnsi="Times New Roman" w:cs="Times New Roman"/>
                 <w:sz w:val="20"/>
                 <w:szCs w:val="20"/>
-                <w:u w:val="single"/>
-                <w:lang w:eastAsia="en-PH"/>
-              </w:rPr>
-              <w:t>DKUSB1B0DL90501486K801</w:t>
-            </w:r>
-          </w:p>
-          <w:p>
-            <w:pPr>
-              <w:spacing w:after="0" w:line="240" w:lineRule="auto"/>
+                <w:lang w:eastAsia="en-PH"/>
+              </w:rPr>
+            </w:pPr>
+            <w:r>
               <w:rPr>
                 <w:rFonts w:ascii="Times New Roman" w:eastAsia="Times New Roman" w:hAnsi="Times New Roman" w:cs="Times New Roman"/>
                 <w:sz w:val="20"/>
                 <w:szCs w:val="20"/>
                 <w:lang w:eastAsia="en-PH"/>
               </w:rPr>
-            </w:pPr>
+              <w:t xml:space="preserve">              </w:t>
+            </w:r>
             <w:r>
               <w:rPr>
                 <w:rFonts w:ascii="Times New Roman" w:eastAsia="Times New Roman" w:hAnsi="Times New Roman" w:cs="Times New Roman"/>
@@ -4904,7 +5114,7 @@
                 <w:szCs w:val="20"/>
                 <w:lang w:eastAsia="en-PH"/>
               </w:rPr>
-              <w:t xml:space="preserve">              </w:t>
+              <w:t>Mouse</w:t>
             </w:r>
             <w:r>
               <w:rPr>
@@ -4913,7 +5123,7 @@
                 <w:szCs w:val="20"/>
                 <w:lang w:eastAsia="en-PH"/>
               </w:rPr>
-              <w:t>Ups</w:t>
+              <w:t xml:space="preserve">: </w:t>
             </w:r>
             <w:r>
               <w:rPr>
@@ -4922,37 +5132,55 @@
                 <w:szCs w:val="20"/>
                 <w:lang w:eastAsia="en-PH"/>
               </w:rPr>
-              <w:t xml:space="preserve">: </w:t>
-            </w:r>
-            <w:r>
+              <w:t>{mouse}</w:t>
+            </w:r>
+          </w:p>
+          <w:p>
+            <w:pPr>
+              <w:spacing w:after="0" w:line="240" w:lineRule="auto"/>
               <w:rPr>
                 <w:rFonts w:ascii="Times New Roman" w:eastAsia="Times New Roman" w:hAnsi="Times New Roman" w:cs="Times New Roman"/>
                 <w:sz w:val="20"/>
                 <w:szCs w:val="20"/>
-                <w:u w:val="single"/>
-                <w:lang w:eastAsia="en-PH"/>
-              </w:rPr>
-              <w:t xml:space="preserve">Prolink S/N: </w:t>
-            </w:r>
-            <w:r>
-              <w:rPr>
-                <w:rFonts w:ascii="Times New Roman" w:hAnsi="Times New Roman" w:cs="Times New Roman"/>
+                <w:lang w:eastAsia="en-PH"/>
+              </w:rPr>
+            </w:pPr>
+            <w:r>
+              <w:rPr>
+                <w:rFonts w:ascii="Times New Roman" w:eastAsia="Times New Roman" w:hAnsi="Times New Roman" w:cs="Times New Roman"/>
                 <w:sz w:val="20"/>
                 <w:szCs w:val="20"/>
-              </w:rPr>
-              <w:t>54781193501089</w:t>
-            </w:r>
-          </w:p>
-          <w:p>
-            <w:pPr>
-              <w:spacing w:after="0" w:line="240" w:lineRule="auto"/>
+                <w:lang w:eastAsia="en-PH"/>
+              </w:rPr>
+              <w:t xml:space="preserve">              </w:t>
+            </w:r>
+            <w:r>
               <w:rPr>
                 <w:rFonts w:ascii="Times New Roman" w:eastAsia="Times New Roman" w:hAnsi="Times New Roman" w:cs="Times New Roman"/>
                 <w:sz w:val="20"/>
                 <w:szCs w:val="20"/>
                 <w:lang w:eastAsia="en-PH"/>
               </w:rPr>
-            </w:pPr>
+              <w:t>Ups</w:t>
+            </w:r>
+            <w:r>
+              <w:rPr>
+                <w:rFonts w:ascii="Times New Roman" w:eastAsia="Times New Roman" w:hAnsi="Times New Roman" w:cs="Times New Roman"/>
+                <w:sz w:val="20"/>
+                <w:szCs w:val="20"/>
+                <w:lang w:eastAsia="en-PH"/>
+              </w:rPr>
+              <w:t xml:space="preserve">: </w:t>
+            </w:r>
+            <w:r>
+              <w:rPr>
+                <w:rFonts w:ascii="Times New Roman" w:eastAsia="Times New Roman" w:hAnsi="Times New Roman" w:cs="Times New Roman"/>
+                <w:sz w:val="20"/>
+                <w:szCs w:val="20"/>
+                <w:lang w:eastAsia="en-PH"/>
+              </w:rPr>
+              <w:t>{ups}</w:t>
+            </w:r>
           </w:p>
         </w:tc>
       </w:tr>
@@ -4964,12 +5192,6 @@
           <w:tcPr>
             <w:tcW w:w="9540" w:type="dxa"/>
             <w:gridSpan w:val="2"/>
-            <w:tcBorders>
-              <w:top w:val="nil"/>
-              <w:left w:val="nil"/>
-              <w:bottom w:val="nil"/>
-              <w:right w:val="nil"/>
-            </w:tcBorders>
             <w:vAlign w:val="center"/>
             <w:hideMark/>
           </w:tcPr>
@@ -5007,7 +5229,7 @@
         </w:trPr>
         <w:tc>
           <w:tcPr>
-            <w:tcW w:w="311" w:type="dxa"/>
+            <w:tcW w:w="567" w:type="dxa"/>
             <w:tcBorders>
               <w:top w:val="single" w:sz="4" w:space="0" w:color="auto"/>
               <w:left w:val="single" w:sz="4" w:space="0" w:color="auto"/>
@@ -5015,51 +5237,37 @@
               <w:right w:val="single" w:sz="4" w:space="0" w:color="auto"/>
             </w:tcBorders>
             <w:noWrap/>
-            <w:vAlign w:val="bottom"/>
+            <w:vAlign w:val="center"/>
           </w:tcPr>
           <w:p>
             <w:pPr>
               <w:spacing w:after="0" w:line="240" w:lineRule="auto"/>
-              <w:rPr>
-                <w:rFonts w:ascii="Segoe UI Symbol" w:eastAsia="Times New Roman" w:hAnsi="Segoe UI Symbol" w:cs="Calibri"/>
-                <w:color w:val="000000"/>
-                <w:lang w:eastAsia="en-PH"/>
-              </w:rPr>
-            </w:pPr>
-            <w:r>
-              <w:rPr>
-                <w:rFonts w:ascii="Segoe UI Symbol" w:eastAsia="Times New Roman" w:hAnsi="Segoe UI Symbol" w:cs="Calibri"/>
-                <w:color w:val="000000"/>
-                <w:lang w:eastAsia="en-PH"/>
-              </w:rPr>
-              <w:t>{cb</w:t>
-            </w:r>
-            <w:r>
-              <w:rPr>
-                <w:rFonts w:ascii="Segoe UI Symbol" w:eastAsia="Times New Roman" w:hAnsi="Segoe UI Symbol" w:cs="Calibri"/>
-                <w:color w:val="000000"/>
-                <w:lang w:eastAsia="en-PH"/>
-              </w:rPr>
-              <w:t>26</w:t>
-            </w:r>
-            <w:r>
-              <w:rPr>
-                <w:rFonts w:ascii="Segoe UI Symbol" w:eastAsia="Times New Roman" w:hAnsi="Segoe UI Symbol" w:cs="Calibri"/>
-                <w:color w:val="000000"/>
-                <w:lang w:eastAsia="en-PH"/>
-              </w:rPr>
-              <w:t>}</w:t>
+              <w:jc w:val="center"/>
+              <w:rPr>
+                <w:rFonts w:ascii="Segoe UI Symbol" w:eastAsia="Times New Roman" w:hAnsi="Segoe UI Symbol" w:cs="Calibri"/>
+                <w:color w:val="000000"/>
+                <w:sz w:val="18"/>
+                <w:szCs w:val="18"/>
+                <w:lang w:eastAsia="en-PH"/>
+              </w:rPr>
+            </w:pPr>
+            <w:r>
+              <w:rPr>
+                <w:rFonts w:ascii="Segoe UI Symbol" w:eastAsia="Times New Roman" w:hAnsi="Segoe UI Symbol" w:cs="Calibri"/>
+                <w:color w:val="000000"/>
+                <w:sz w:val="18"/>
+                <w:szCs w:val="18"/>
+                <w:lang w:eastAsia="en-PH"/>
+              </w:rPr>
+              <w:t>{a2}</w:t>
             </w:r>
           </w:p>
         </w:tc>
         <w:tc>
           <w:tcPr>
-            <w:tcW w:w="9229" w:type="dxa"/>
+            <w:tcW w:w="8973" w:type="dxa"/>
             <w:tcBorders>
-              <w:top w:val="nil"/>
-              <w:left w:val="nil"/>
-              <w:bottom w:val="nil"/>
-              <w:right w:val="nil"/>
+              <w:left w:val="single" w:sz="4" w:space="0" w:color="auto"/>
             </w:tcBorders>
             <w:noWrap/>
             <w:vAlign w:val="center"/>
@@ -5106,60 +5314,45 @@
         </w:trPr>
         <w:tc>
           <w:tcPr>
-            <w:tcW w:w="311" w:type="dxa"/>
+            <w:tcW w:w="567" w:type="dxa"/>
             <w:tcBorders>
-              <w:top w:val="nil"/>
+              <w:top w:val="single" w:sz="4" w:space="0" w:color="auto"/>
               <w:left w:val="single" w:sz="4" w:space="0" w:color="auto"/>
               <w:bottom w:val="single" w:sz="4" w:space="0" w:color="auto"/>
               <w:right w:val="single" w:sz="4" w:space="0" w:color="auto"/>
             </w:tcBorders>
             <w:noWrap/>
-            <w:vAlign w:val="bottom"/>
+            <w:vAlign w:val="center"/>
           </w:tcPr>
           <w:p>
             <w:pPr>
               <w:spacing w:after="0" w:line="240" w:lineRule="auto"/>
-              <w:rPr>
-                <w:rFonts w:ascii="Segoe UI Symbol" w:eastAsia="Times New Roman" w:hAnsi="Segoe UI Symbol" w:cs="Calibri"/>
-                <w:color w:val="000000"/>
-                <w:lang w:eastAsia="en-PH"/>
-              </w:rPr>
-            </w:pPr>
-            <w:r>
-              <w:rPr>
-                <w:rFonts w:ascii="Segoe UI Symbol" w:eastAsia="Times New Roman" w:hAnsi="Segoe UI Symbol" w:cs="Calibri"/>
-                <w:color w:val="000000"/>
-                <w:lang w:eastAsia="en-PH"/>
-              </w:rPr>
-              <w:lastRenderedPageBreak/>
-              <w:t>{cb</w:t>
-            </w:r>
-            <w:r>
-              <w:rPr>
-                <w:rFonts w:ascii="Segoe UI Symbol" w:eastAsia="Times New Roman" w:hAnsi="Segoe UI Symbol" w:cs="Calibri"/>
-                <w:color w:val="000000"/>
-                <w:lang w:eastAsia="en-PH"/>
-              </w:rPr>
-              <w:t>27</w:t>
-            </w:r>
-            <w:r>
-              <w:rPr>
-                <w:rFonts w:ascii="Segoe UI Symbol" w:eastAsia="Times New Roman" w:hAnsi="Segoe UI Symbol" w:cs="Calibri"/>
-                <w:color w:val="000000"/>
-                <w:lang w:eastAsia="en-PH"/>
-              </w:rPr>
-              <w:t>}</w:t>
+              <w:jc w:val="center"/>
+              <w:rPr>
+                <w:rFonts w:ascii="Segoe UI Symbol" w:eastAsia="Times New Roman" w:hAnsi="Segoe UI Symbol" w:cs="Calibri"/>
+                <w:color w:val="000000"/>
+                <w:sz w:val="18"/>
+                <w:szCs w:val="18"/>
+                <w:lang w:eastAsia="en-PH"/>
+              </w:rPr>
+            </w:pPr>
+            <w:r>
+              <w:rPr>
+                <w:rFonts w:ascii="Segoe UI Symbol" w:eastAsia="Times New Roman" w:hAnsi="Segoe UI Symbol" w:cs="Calibri"/>
+                <w:color w:val="000000"/>
+                <w:sz w:val="18"/>
+                <w:szCs w:val="18"/>
+                <w:lang w:eastAsia="en-PH"/>
+              </w:rPr>
+              <w:t>{a3}</w:t>
             </w:r>
           </w:p>
         </w:tc>
         <w:tc>
           <w:tcPr>
-            <w:tcW w:w="9229" w:type="dxa"/>
+            <w:tcW w:w="8973" w:type="dxa"/>
             <w:tcBorders>
-              <w:top w:val="nil"/>
-              <w:left w:val="nil"/>
-              <w:bottom w:val="nil"/>
-              <w:right w:val="nil"/>
+              <w:left w:val="single" w:sz="4" w:space="0" w:color="auto"/>
             </w:tcBorders>
             <w:noWrap/>
             <w:vAlign w:val="center"/>
@@ -5206,59 +5399,45 @@
         </w:trPr>
         <w:tc>
           <w:tcPr>
-            <w:tcW w:w="311" w:type="dxa"/>
+            <w:tcW w:w="567" w:type="dxa"/>
             <w:tcBorders>
-              <w:top w:val="nil"/>
+              <w:top w:val="single" w:sz="4" w:space="0" w:color="auto"/>
               <w:left w:val="single" w:sz="4" w:space="0" w:color="auto"/>
               <w:bottom w:val="single" w:sz="4" w:space="0" w:color="auto"/>
               <w:right w:val="single" w:sz="4" w:space="0" w:color="auto"/>
             </w:tcBorders>
             <w:noWrap/>
-            <w:vAlign w:val="bottom"/>
+            <w:vAlign w:val="center"/>
           </w:tcPr>
           <w:p>
             <w:pPr>
               <w:spacing w:after="0" w:line="240" w:lineRule="auto"/>
-              <w:rPr>
-                <w:rFonts w:ascii="Segoe UI Symbol" w:eastAsia="Times New Roman" w:hAnsi="Segoe UI Symbol" w:cs="Calibri"/>
-                <w:color w:val="000000"/>
-                <w:lang w:eastAsia="en-PH"/>
-              </w:rPr>
-            </w:pPr>
-            <w:r>
-              <w:rPr>
-                <w:rFonts w:ascii="Segoe UI Symbol" w:eastAsia="Times New Roman" w:hAnsi="Segoe UI Symbol" w:cs="Calibri"/>
-                <w:color w:val="000000"/>
-                <w:lang w:eastAsia="en-PH"/>
-              </w:rPr>
-              <w:t>{cb</w:t>
-            </w:r>
-            <w:r>
-              <w:rPr>
-                <w:rFonts w:ascii="Segoe UI Symbol" w:eastAsia="Times New Roman" w:hAnsi="Segoe UI Symbol" w:cs="Calibri"/>
-                <w:color w:val="000000"/>
-                <w:lang w:eastAsia="en-PH"/>
-              </w:rPr>
-              <w:t>28</w:t>
-            </w:r>
-            <w:r>
-              <w:rPr>
-                <w:rFonts w:ascii="Segoe UI Symbol" w:eastAsia="Times New Roman" w:hAnsi="Segoe UI Symbol" w:cs="Calibri"/>
-                <w:color w:val="000000"/>
-                <w:lang w:eastAsia="en-PH"/>
-              </w:rPr>
-              <w:t>}</w:t>
+              <w:jc w:val="center"/>
+              <w:rPr>
+                <w:rFonts w:ascii="Segoe UI Symbol" w:eastAsia="Times New Roman" w:hAnsi="Segoe UI Symbol" w:cs="Calibri"/>
+                <w:color w:val="000000"/>
+                <w:sz w:val="18"/>
+                <w:szCs w:val="18"/>
+                <w:lang w:eastAsia="en-PH"/>
+              </w:rPr>
+            </w:pPr>
+            <w:r>
+              <w:rPr>
+                <w:rFonts w:ascii="Segoe UI Symbol" w:eastAsia="Times New Roman" w:hAnsi="Segoe UI Symbol" w:cs="Calibri"/>
+                <w:color w:val="000000"/>
+                <w:sz w:val="18"/>
+                <w:szCs w:val="18"/>
+                <w:lang w:eastAsia="en-PH"/>
+              </w:rPr>
+              <w:t>{a4}</w:t>
             </w:r>
           </w:p>
         </w:tc>
         <w:tc>
           <w:tcPr>
-            <w:tcW w:w="9229" w:type="dxa"/>
+            <w:tcW w:w="8973" w:type="dxa"/>
             <w:tcBorders>
-              <w:top w:val="nil"/>
-              <w:left w:val="nil"/>
-              <w:bottom w:val="nil"/>
-              <w:right w:val="nil"/>
+              <w:left w:val="single" w:sz="4" w:space="0" w:color="auto"/>
             </w:tcBorders>
             <w:noWrap/>
             <w:vAlign w:val="center"/>
@@ -5305,59 +5484,45 @@
         </w:trPr>
         <w:tc>
           <w:tcPr>
-            <w:tcW w:w="311" w:type="dxa"/>
+            <w:tcW w:w="567" w:type="dxa"/>
             <w:tcBorders>
-              <w:top w:val="nil"/>
+              <w:top w:val="single" w:sz="4" w:space="0" w:color="auto"/>
               <w:left w:val="single" w:sz="4" w:space="0" w:color="auto"/>
               <w:bottom w:val="single" w:sz="4" w:space="0" w:color="auto"/>
               <w:right w:val="single" w:sz="4" w:space="0" w:color="auto"/>
             </w:tcBorders>
             <w:noWrap/>
-            <w:vAlign w:val="bottom"/>
+            <w:vAlign w:val="center"/>
           </w:tcPr>
           <w:p>
             <w:pPr>
               <w:spacing w:after="0" w:line="240" w:lineRule="auto"/>
-              <w:rPr>
-                <w:rFonts w:ascii="Segoe UI Symbol" w:eastAsia="Times New Roman" w:hAnsi="Segoe UI Symbol" w:cs="Calibri"/>
-                <w:color w:val="000000"/>
-                <w:lang w:eastAsia="en-PH"/>
-              </w:rPr>
-            </w:pPr>
-            <w:r>
-              <w:rPr>
-                <w:rFonts w:ascii="Segoe UI Symbol" w:eastAsia="Times New Roman" w:hAnsi="Segoe UI Symbol" w:cs="Calibri"/>
-                <w:color w:val="000000"/>
-                <w:lang w:eastAsia="en-PH"/>
-              </w:rPr>
-              <w:t>{cb</w:t>
-            </w:r>
-            <w:r>
-              <w:rPr>
-                <w:rFonts w:ascii="Segoe UI Symbol" w:eastAsia="Times New Roman" w:hAnsi="Segoe UI Symbol" w:cs="Calibri"/>
-                <w:color w:val="000000"/>
-                <w:lang w:eastAsia="en-PH"/>
-              </w:rPr>
-              <w:t>29</w:t>
-            </w:r>
-            <w:r>
-              <w:rPr>
-                <w:rFonts w:ascii="Segoe UI Symbol" w:eastAsia="Times New Roman" w:hAnsi="Segoe UI Symbol" w:cs="Calibri"/>
-                <w:color w:val="000000"/>
-                <w:lang w:eastAsia="en-PH"/>
-              </w:rPr>
-              <w:t>}</w:t>
+              <w:jc w:val="center"/>
+              <w:rPr>
+                <w:rFonts w:ascii="Segoe UI Symbol" w:eastAsia="Times New Roman" w:hAnsi="Segoe UI Symbol" w:cs="Calibri"/>
+                <w:color w:val="000000"/>
+                <w:sz w:val="18"/>
+                <w:szCs w:val="18"/>
+                <w:lang w:eastAsia="en-PH"/>
+              </w:rPr>
+            </w:pPr>
+            <w:r>
+              <w:rPr>
+                <w:rFonts w:ascii="Segoe UI Symbol" w:eastAsia="Times New Roman" w:hAnsi="Segoe UI Symbol" w:cs="Calibri"/>
+                <w:color w:val="000000"/>
+                <w:sz w:val="18"/>
+                <w:szCs w:val="18"/>
+                <w:lang w:eastAsia="en-PH"/>
+              </w:rPr>
+              <w:t>{a5}</w:t>
             </w:r>
           </w:p>
         </w:tc>
         <w:tc>
           <w:tcPr>
-            <w:tcW w:w="9229" w:type="dxa"/>
+            <w:tcW w:w="8973" w:type="dxa"/>
             <w:tcBorders>
-              <w:top w:val="nil"/>
-              <w:left w:val="nil"/>
-              <w:bottom w:val="nil"/>
-              <w:right w:val="nil"/>
+              <w:left w:val="single" w:sz="4" w:space="0" w:color="auto"/>
             </w:tcBorders>
             <w:noWrap/>
             <w:vAlign w:val="center"/>
@@ -5393,7 +5558,29 @@
                 <w:szCs w:val="24"/>
                 <w:lang w:eastAsia="en-PH"/>
               </w:rPr>
-              <w:t>Delete .tmp/.tilde files</w:t>
+              <w:t>Delete .</w:t>
+            </w:r>
+            <w:proofErr w:type="spellStart"/>
+            <w:r>
+              <w:rPr>
+                <w:rFonts w:ascii="Times New Roman" w:eastAsia="Times New Roman" w:hAnsi="Times New Roman" w:cs="Times New Roman"/>
+                <w:color w:val="000000"/>
+                <w:sz w:val="24"/>
+                <w:szCs w:val="24"/>
+                <w:lang w:eastAsia="en-PH"/>
+              </w:rPr>
+              <w:t>tmp</w:t>
+            </w:r>
+            <w:proofErr w:type="spellEnd"/>
+            <w:r>
+              <w:rPr>
+                <w:rFonts w:ascii="Times New Roman" w:eastAsia="Times New Roman" w:hAnsi="Times New Roman" w:cs="Times New Roman"/>
+                <w:color w:val="000000"/>
+                <w:sz w:val="24"/>
+                <w:szCs w:val="24"/>
+                <w:lang w:eastAsia="en-PH"/>
+              </w:rPr>
+              <w:t>/.tilde files</w:t>
             </w:r>
           </w:p>
         </w:tc>
@@ -5404,59 +5591,45 @@
         </w:trPr>
         <w:tc>
           <w:tcPr>
-            <w:tcW w:w="311" w:type="dxa"/>
+            <w:tcW w:w="567" w:type="dxa"/>
             <w:tcBorders>
-              <w:top w:val="nil"/>
+              <w:top w:val="single" w:sz="4" w:space="0" w:color="auto"/>
               <w:left w:val="single" w:sz="4" w:space="0" w:color="auto"/>
               <w:bottom w:val="single" w:sz="4" w:space="0" w:color="auto"/>
               <w:right w:val="single" w:sz="4" w:space="0" w:color="auto"/>
             </w:tcBorders>
             <w:noWrap/>
-            <w:vAlign w:val="bottom"/>
+            <w:vAlign w:val="center"/>
           </w:tcPr>
           <w:p>
             <w:pPr>
               <w:spacing w:after="0" w:line="240" w:lineRule="auto"/>
-              <w:rPr>
-                <w:rFonts w:ascii="Segoe UI Symbol" w:eastAsia="Times New Roman" w:hAnsi="Segoe UI Symbol" w:cs="Calibri"/>
-                <w:color w:val="000000"/>
-                <w:lang w:eastAsia="en-PH"/>
-              </w:rPr>
-            </w:pPr>
-            <w:r>
-              <w:rPr>
-                <w:rFonts w:ascii="Segoe UI Symbol" w:eastAsia="Times New Roman" w:hAnsi="Segoe UI Symbol" w:cs="Calibri"/>
-                <w:color w:val="000000"/>
-                <w:lang w:eastAsia="en-PH"/>
-              </w:rPr>
-              <w:t>{cb</w:t>
-            </w:r>
-            <w:r>
-              <w:rPr>
-                <w:rFonts w:ascii="Segoe UI Symbol" w:eastAsia="Times New Roman" w:hAnsi="Segoe UI Symbol" w:cs="Calibri"/>
-                <w:color w:val="000000"/>
-                <w:lang w:eastAsia="en-PH"/>
-              </w:rPr>
-              <w:t>30</w:t>
-            </w:r>
-            <w:r>
-              <w:rPr>
-                <w:rFonts w:ascii="Segoe UI Symbol" w:eastAsia="Times New Roman" w:hAnsi="Segoe UI Symbol" w:cs="Calibri"/>
-                <w:color w:val="000000"/>
-                <w:lang w:eastAsia="en-PH"/>
-              </w:rPr>
-              <w:t>}</w:t>
+              <w:jc w:val="center"/>
+              <w:rPr>
+                <w:rFonts w:ascii="Segoe UI Symbol" w:eastAsia="Times New Roman" w:hAnsi="Segoe UI Symbol" w:cs="Calibri"/>
+                <w:color w:val="000000"/>
+                <w:sz w:val="18"/>
+                <w:szCs w:val="18"/>
+                <w:lang w:eastAsia="en-PH"/>
+              </w:rPr>
+            </w:pPr>
+            <w:r>
+              <w:rPr>
+                <w:rFonts w:ascii="Segoe UI Symbol" w:eastAsia="Times New Roman" w:hAnsi="Segoe UI Symbol" w:cs="Calibri"/>
+                <w:color w:val="000000"/>
+                <w:sz w:val="18"/>
+                <w:szCs w:val="18"/>
+                <w:lang w:eastAsia="en-PH"/>
+              </w:rPr>
+              <w:t>{a6}</w:t>
             </w:r>
           </w:p>
         </w:tc>
         <w:tc>
           <w:tcPr>
-            <w:tcW w:w="9229" w:type="dxa"/>
+            <w:tcW w:w="8973" w:type="dxa"/>
             <w:tcBorders>
-              <w:top w:val="nil"/>
-              <w:left w:val="nil"/>
-              <w:bottom w:val="nil"/>
-              <w:right w:val="nil"/>
+              <w:left w:val="single" w:sz="4" w:space="0" w:color="auto"/>
             </w:tcBorders>
             <w:noWrap/>
             <w:vAlign w:val="center"/>
@@ -5503,59 +5676,45 @@
         </w:trPr>
         <w:tc>
           <w:tcPr>
-            <w:tcW w:w="311" w:type="dxa"/>
+            <w:tcW w:w="567" w:type="dxa"/>
             <w:tcBorders>
-              <w:top w:val="nil"/>
+              <w:top w:val="single" w:sz="4" w:space="0" w:color="auto"/>
               <w:left w:val="single" w:sz="4" w:space="0" w:color="auto"/>
               <w:bottom w:val="single" w:sz="4" w:space="0" w:color="auto"/>
               <w:right w:val="single" w:sz="4" w:space="0" w:color="auto"/>
             </w:tcBorders>
             <w:noWrap/>
-            <w:vAlign w:val="bottom"/>
+            <w:vAlign w:val="center"/>
           </w:tcPr>
           <w:p>
             <w:pPr>
               <w:spacing w:after="0" w:line="240" w:lineRule="auto"/>
-              <w:rPr>
-                <w:rFonts w:ascii="Segoe UI Symbol" w:eastAsia="Times New Roman" w:hAnsi="Segoe UI Symbol" w:cs="Calibri"/>
-                <w:color w:val="000000"/>
-                <w:lang w:eastAsia="en-PH"/>
-              </w:rPr>
-            </w:pPr>
-            <w:r>
-              <w:rPr>
-                <w:rFonts w:ascii="Segoe UI Symbol" w:eastAsia="Times New Roman" w:hAnsi="Segoe UI Symbol" w:cs="Calibri"/>
-                <w:color w:val="000000"/>
-                <w:lang w:eastAsia="en-PH"/>
-              </w:rPr>
-              <w:t>{cb</w:t>
-            </w:r>
-            <w:r>
-              <w:rPr>
-                <w:rFonts w:ascii="Segoe UI Symbol" w:eastAsia="Times New Roman" w:hAnsi="Segoe UI Symbol" w:cs="Calibri"/>
-                <w:color w:val="000000"/>
-                <w:lang w:eastAsia="en-PH"/>
-              </w:rPr>
-              <w:t>31</w:t>
-            </w:r>
-            <w:r>
-              <w:rPr>
-                <w:rFonts w:ascii="Segoe UI Symbol" w:eastAsia="Times New Roman" w:hAnsi="Segoe UI Symbol" w:cs="Calibri"/>
-                <w:color w:val="000000"/>
-                <w:lang w:eastAsia="en-PH"/>
-              </w:rPr>
-              <w:t>}</w:t>
+              <w:jc w:val="center"/>
+              <w:rPr>
+                <w:rFonts w:ascii="Segoe UI Symbol" w:eastAsia="Times New Roman" w:hAnsi="Segoe UI Symbol" w:cs="Calibri"/>
+                <w:color w:val="000000"/>
+                <w:sz w:val="18"/>
+                <w:szCs w:val="18"/>
+                <w:lang w:eastAsia="en-PH"/>
+              </w:rPr>
+            </w:pPr>
+            <w:r>
+              <w:rPr>
+                <w:rFonts w:ascii="Segoe UI Symbol" w:eastAsia="Times New Roman" w:hAnsi="Segoe UI Symbol" w:cs="Calibri"/>
+                <w:color w:val="000000"/>
+                <w:sz w:val="18"/>
+                <w:szCs w:val="18"/>
+                <w:lang w:eastAsia="en-PH"/>
+              </w:rPr>
+              <w:t>{a7}</w:t>
             </w:r>
           </w:p>
         </w:tc>
         <w:tc>
           <w:tcPr>
-            <w:tcW w:w="9229" w:type="dxa"/>
+            <w:tcW w:w="8973" w:type="dxa"/>
             <w:tcBorders>
-              <w:top w:val="nil"/>
-              <w:left w:val="nil"/>
-              <w:bottom w:val="nil"/>
-              <w:right w:val="nil"/>
+              <w:left w:val="single" w:sz="4" w:space="0" w:color="auto"/>
             </w:tcBorders>
             <w:noWrap/>
             <w:vAlign w:val="center"/>
@@ -5602,59 +5761,45 @@
         </w:trPr>
         <w:tc>
           <w:tcPr>
-            <w:tcW w:w="311" w:type="dxa"/>
+            <w:tcW w:w="567" w:type="dxa"/>
             <w:tcBorders>
-              <w:top w:val="nil"/>
+              <w:top w:val="single" w:sz="4" w:space="0" w:color="auto"/>
               <w:left w:val="single" w:sz="4" w:space="0" w:color="auto"/>
               <w:bottom w:val="single" w:sz="4" w:space="0" w:color="auto"/>
               <w:right w:val="single" w:sz="4" w:space="0" w:color="auto"/>
             </w:tcBorders>
             <w:noWrap/>
-            <w:vAlign w:val="bottom"/>
+            <w:vAlign w:val="center"/>
           </w:tcPr>
           <w:p>
             <w:pPr>
               <w:spacing w:after="0" w:line="240" w:lineRule="auto"/>
-              <w:rPr>
-                <w:rFonts w:ascii="Segoe UI Symbol" w:eastAsia="Times New Roman" w:hAnsi="Segoe UI Symbol" w:cs="Calibri"/>
-                <w:color w:val="000000"/>
-                <w:lang w:eastAsia="en-PH"/>
-              </w:rPr>
-            </w:pPr>
-            <w:r>
-              <w:rPr>
-                <w:rFonts w:ascii="Segoe UI Symbol" w:eastAsia="Times New Roman" w:hAnsi="Segoe UI Symbol" w:cs="Calibri"/>
-                <w:color w:val="000000"/>
-                <w:lang w:eastAsia="en-PH"/>
-              </w:rPr>
-              <w:t>{cb</w:t>
-            </w:r>
-            <w:r>
-              <w:rPr>
-                <w:rFonts w:ascii="Segoe UI Symbol" w:eastAsia="Times New Roman" w:hAnsi="Segoe UI Symbol" w:cs="Calibri"/>
-                <w:color w:val="000000"/>
-                <w:lang w:eastAsia="en-PH"/>
-              </w:rPr>
-              <w:t>32</w:t>
-            </w:r>
-            <w:r>
-              <w:rPr>
-                <w:rFonts w:ascii="Segoe UI Symbol" w:eastAsia="Times New Roman" w:hAnsi="Segoe UI Symbol" w:cs="Calibri"/>
-                <w:color w:val="000000"/>
-                <w:lang w:eastAsia="en-PH"/>
-              </w:rPr>
-              <w:t>}</w:t>
+              <w:jc w:val="center"/>
+              <w:rPr>
+                <w:rFonts w:ascii="Segoe UI Symbol" w:eastAsia="Times New Roman" w:hAnsi="Segoe UI Symbol" w:cs="Calibri"/>
+                <w:color w:val="000000"/>
+                <w:sz w:val="18"/>
+                <w:szCs w:val="18"/>
+                <w:lang w:eastAsia="en-PH"/>
+              </w:rPr>
+            </w:pPr>
+            <w:r>
+              <w:rPr>
+                <w:rFonts w:ascii="Segoe UI Symbol" w:eastAsia="Times New Roman" w:hAnsi="Segoe UI Symbol" w:cs="Calibri"/>
+                <w:color w:val="000000"/>
+                <w:sz w:val="18"/>
+                <w:szCs w:val="18"/>
+                <w:lang w:eastAsia="en-PH"/>
+              </w:rPr>
+              <w:t>{a8}</w:t>
             </w:r>
           </w:p>
         </w:tc>
         <w:tc>
           <w:tcPr>
-            <w:tcW w:w="9229" w:type="dxa"/>
+            <w:tcW w:w="8973" w:type="dxa"/>
             <w:tcBorders>
-              <w:top w:val="nil"/>
-              <w:left w:val="nil"/>
-              <w:bottom w:val="nil"/>
-              <w:right w:val="nil"/>
+              <w:left w:val="single" w:sz="4" w:space="0" w:color="auto"/>
             </w:tcBorders>
             <w:noWrap/>
             <w:vAlign w:val="center"/>
@@ -5701,59 +5846,45 @@
         </w:trPr>
         <w:tc>
           <w:tcPr>
-            <w:tcW w:w="311" w:type="dxa"/>
+            <w:tcW w:w="567" w:type="dxa"/>
             <w:tcBorders>
-              <w:top w:val="nil"/>
+              <w:top w:val="single" w:sz="4" w:space="0" w:color="auto"/>
               <w:left w:val="single" w:sz="4" w:space="0" w:color="auto"/>
               <w:bottom w:val="single" w:sz="4" w:space="0" w:color="auto"/>
               <w:right w:val="single" w:sz="4" w:space="0" w:color="auto"/>
             </w:tcBorders>
             <w:noWrap/>
-            <w:vAlign w:val="bottom"/>
+            <w:vAlign w:val="center"/>
           </w:tcPr>
           <w:p>
             <w:pPr>
               <w:spacing w:after="0" w:line="240" w:lineRule="auto"/>
-              <w:rPr>
-                <w:rFonts w:ascii="Segoe UI Symbol" w:eastAsia="Times New Roman" w:hAnsi="Segoe UI Symbol" w:cs="Calibri"/>
-                <w:color w:val="000000"/>
-                <w:lang w:eastAsia="en-PH"/>
-              </w:rPr>
-            </w:pPr>
-            <w:r>
-              <w:rPr>
-                <w:rFonts w:ascii="Segoe UI Symbol" w:eastAsia="Times New Roman" w:hAnsi="Segoe UI Symbol" w:cs="Calibri"/>
-                <w:color w:val="000000"/>
-                <w:lang w:eastAsia="en-PH"/>
-              </w:rPr>
-              <w:t>{cb</w:t>
-            </w:r>
-            <w:r>
-              <w:rPr>
-                <w:rFonts w:ascii="Segoe UI Symbol" w:eastAsia="Times New Roman" w:hAnsi="Segoe UI Symbol" w:cs="Calibri"/>
-                <w:color w:val="000000"/>
-                <w:lang w:eastAsia="en-PH"/>
-              </w:rPr>
-              <w:t>33</w:t>
-            </w:r>
-            <w:r>
-              <w:rPr>
-                <w:rFonts w:ascii="Segoe UI Symbol" w:eastAsia="Times New Roman" w:hAnsi="Segoe UI Symbol" w:cs="Calibri"/>
-                <w:color w:val="000000"/>
-                <w:lang w:eastAsia="en-PH"/>
-              </w:rPr>
-              <w:t>}</w:t>
+              <w:jc w:val="center"/>
+              <w:rPr>
+                <w:rFonts w:ascii="Segoe UI Symbol" w:eastAsia="Times New Roman" w:hAnsi="Segoe UI Symbol" w:cs="Calibri"/>
+                <w:color w:val="000000"/>
+                <w:sz w:val="18"/>
+                <w:szCs w:val="18"/>
+                <w:lang w:eastAsia="en-PH"/>
+              </w:rPr>
+            </w:pPr>
+            <w:r>
+              <w:rPr>
+                <w:rFonts w:ascii="Segoe UI Symbol" w:eastAsia="Times New Roman" w:hAnsi="Segoe UI Symbol" w:cs="Calibri"/>
+                <w:color w:val="000000"/>
+                <w:sz w:val="18"/>
+                <w:szCs w:val="18"/>
+                <w:lang w:eastAsia="en-PH"/>
+              </w:rPr>
+              <w:t>{a9}</w:t>
             </w:r>
           </w:p>
         </w:tc>
         <w:tc>
           <w:tcPr>
-            <w:tcW w:w="9229" w:type="dxa"/>
+            <w:tcW w:w="8973" w:type="dxa"/>
             <w:tcBorders>
-              <w:top w:val="nil"/>
-              <w:left w:val="nil"/>
-              <w:bottom w:val="nil"/>
-              <w:right w:val="nil"/>
+              <w:left w:val="single" w:sz="4" w:space="0" w:color="auto"/>
             </w:tcBorders>
             <w:noWrap/>
             <w:vAlign w:val="center"/>
@@ -5800,59 +5931,45 @@
         </w:trPr>
         <w:tc>
           <w:tcPr>
-            <w:tcW w:w="311" w:type="dxa"/>
+            <w:tcW w:w="567" w:type="dxa"/>
             <w:tcBorders>
-              <w:top w:val="nil"/>
+              <w:top w:val="single" w:sz="4" w:space="0" w:color="auto"/>
               <w:left w:val="single" w:sz="4" w:space="0" w:color="auto"/>
               <w:bottom w:val="single" w:sz="4" w:space="0" w:color="auto"/>
               <w:right w:val="single" w:sz="4" w:space="0" w:color="auto"/>
             </w:tcBorders>
             <w:noWrap/>
-            <w:vAlign w:val="bottom"/>
+            <w:vAlign w:val="center"/>
           </w:tcPr>
           <w:p>
             <w:pPr>
               <w:spacing w:after="0" w:line="240" w:lineRule="auto"/>
-              <w:rPr>
-                <w:rFonts w:ascii="Segoe UI Symbol" w:eastAsia="Times New Roman" w:hAnsi="Segoe UI Symbol" w:cs="Calibri"/>
-                <w:color w:val="000000"/>
-                <w:lang w:eastAsia="en-PH"/>
-              </w:rPr>
-            </w:pPr>
-            <w:r>
-              <w:rPr>
-                <w:rFonts w:ascii="Segoe UI Symbol" w:eastAsia="Times New Roman" w:hAnsi="Segoe UI Symbol" w:cs="Calibri"/>
-                <w:color w:val="000000"/>
-                <w:lang w:eastAsia="en-PH"/>
-              </w:rPr>
-              <w:t>{cb</w:t>
-            </w:r>
-            <w:r>
-              <w:rPr>
-                <w:rFonts w:ascii="Segoe UI Symbol" w:eastAsia="Times New Roman" w:hAnsi="Segoe UI Symbol" w:cs="Calibri"/>
-                <w:color w:val="000000"/>
-                <w:lang w:eastAsia="en-PH"/>
-              </w:rPr>
-              <w:t>34</w:t>
-            </w:r>
-            <w:r>
-              <w:rPr>
-                <w:rFonts w:ascii="Segoe UI Symbol" w:eastAsia="Times New Roman" w:hAnsi="Segoe UI Symbol" w:cs="Calibri"/>
-                <w:color w:val="000000"/>
-                <w:lang w:eastAsia="en-PH"/>
-              </w:rPr>
-              <w:t>}</w:t>
+              <w:jc w:val="center"/>
+              <w:rPr>
+                <w:rFonts w:ascii="Segoe UI Symbol" w:eastAsia="Times New Roman" w:hAnsi="Segoe UI Symbol" w:cs="Calibri"/>
+                <w:color w:val="000000"/>
+                <w:sz w:val="18"/>
+                <w:szCs w:val="18"/>
+                <w:lang w:eastAsia="en-PH"/>
+              </w:rPr>
+            </w:pPr>
+            <w:r>
+              <w:rPr>
+                <w:rFonts w:ascii="Segoe UI Symbol" w:eastAsia="Times New Roman" w:hAnsi="Segoe UI Symbol" w:cs="Calibri"/>
+                <w:color w:val="000000"/>
+                <w:sz w:val="18"/>
+                <w:szCs w:val="18"/>
+                <w:lang w:eastAsia="en-PH"/>
+              </w:rPr>
+              <w:t>{b1}</w:t>
             </w:r>
           </w:p>
         </w:tc>
         <w:tc>
           <w:tcPr>
-            <w:tcW w:w="9229" w:type="dxa"/>
+            <w:tcW w:w="8973" w:type="dxa"/>
             <w:tcBorders>
-              <w:top w:val="nil"/>
-              <w:left w:val="nil"/>
-              <w:bottom w:val="nil"/>
-              <w:right w:val="nil"/>
+              <w:left w:val="single" w:sz="4" w:space="0" w:color="auto"/>
             </w:tcBorders>
             <w:noWrap/>
             <w:vAlign w:val="center"/>
@@ -5899,59 +6016,45 @@
         </w:trPr>
         <w:tc>
           <w:tcPr>
-            <w:tcW w:w="311" w:type="dxa"/>
+            <w:tcW w:w="567" w:type="dxa"/>
             <w:tcBorders>
-              <w:top w:val="nil"/>
+              <w:top w:val="single" w:sz="4" w:space="0" w:color="auto"/>
               <w:left w:val="single" w:sz="4" w:space="0" w:color="auto"/>
               <w:bottom w:val="single" w:sz="4" w:space="0" w:color="auto"/>
               <w:right w:val="single" w:sz="4" w:space="0" w:color="auto"/>
             </w:tcBorders>
             <w:noWrap/>
-            <w:vAlign w:val="bottom"/>
+            <w:vAlign w:val="center"/>
           </w:tcPr>
           <w:p>
             <w:pPr>
               <w:spacing w:after="0" w:line="240" w:lineRule="auto"/>
-              <w:rPr>
-                <w:rFonts w:ascii="Segoe UI Symbol" w:eastAsia="Times New Roman" w:hAnsi="Segoe UI Symbol" w:cs="Calibri"/>
-                <w:color w:val="000000"/>
-                <w:lang w:eastAsia="en-PH"/>
-              </w:rPr>
-            </w:pPr>
-            <w:r>
-              <w:rPr>
-                <w:rFonts w:ascii="Segoe UI Symbol" w:eastAsia="Times New Roman" w:hAnsi="Segoe UI Symbol" w:cs="Calibri"/>
-                <w:color w:val="000000"/>
-                <w:lang w:eastAsia="en-PH"/>
-              </w:rPr>
-              <w:t>{cb</w:t>
-            </w:r>
-            <w:r>
-              <w:rPr>
-                <w:rFonts w:ascii="Segoe UI Symbol" w:eastAsia="Times New Roman" w:hAnsi="Segoe UI Symbol" w:cs="Calibri"/>
-                <w:color w:val="000000"/>
-                <w:lang w:eastAsia="en-PH"/>
-              </w:rPr>
-              <w:t>35</w:t>
-            </w:r>
-            <w:r>
-              <w:rPr>
-                <w:rFonts w:ascii="Segoe UI Symbol" w:eastAsia="Times New Roman" w:hAnsi="Segoe UI Symbol" w:cs="Calibri"/>
-                <w:color w:val="000000"/>
-                <w:lang w:eastAsia="en-PH"/>
-              </w:rPr>
-              <w:t>}</w:t>
+              <w:jc w:val="center"/>
+              <w:rPr>
+                <w:rFonts w:ascii="Segoe UI Symbol" w:eastAsia="Times New Roman" w:hAnsi="Segoe UI Symbol" w:cs="Calibri"/>
+                <w:color w:val="000000"/>
+                <w:sz w:val="18"/>
+                <w:szCs w:val="18"/>
+                <w:lang w:eastAsia="en-PH"/>
+              </w:rPr>
+            </w:pPr>
+            <w:r>
+              <w:rPr>
+                <w:rFonts w:ascii="Segoe UI Symbol" w:eastAsia="Times New Roman" w:hAnsi="Segoe UI Symbol" w:cs="Calibri"/>
+                <w:color w:val="000000"/>
+                <w:sz w:val="18"/>
+                <w:szCs w:val="18"/>
+                <w:lang w:eastAsia="en-PH"/>
+              </w:rPr>
+              <w:t>{b2}</w:t>
             </w:r>
           </w:p>
         </w:tc>
         <w:tc>
           <w:tcPr>
-            <w:tcW w:w="9229" w:type="dxa"/>
+            <w:tcW w:w="8973" w:type="dxa"/>
             <w:tcBorders>
-              <w:top w:val="nil"/>
-              <w:left w:val="nil"/>
-              <w:bottom w:val="nil"/>
-              <w:right w:val="nil"/>
+              <w:left w:val="single" w:sz="4" w:space="0" w:color="auto"/>
             </w:tcBorders>
             <w:noWrap/>
             <w:vAlign w:val="center"/>
@@ -5998,59 +6101,45 @@
         </w:trPr>
         <w:tc>
           <w:tcPr>
-            <w:tcW w:w="311" w:type="dxa"/>
+            <w:tcW w:w="567" w:type="dxa"/>
             <w:tcBorders>
-              <w:top w:val="nil"/>
+              <w:top w:val="single" w:sz="4" w:space="0" w:color="auto"/>
               <w:left w:val="single" w:sz="4" w:space="0" w:color="auto"/>
               <w:bottom w:val="single" w:sz="4" w:space="0" w:color="auto"/>
               <w:right w:val="single" w:sz="4" w:space="0" w:color="auto"/>
             </w:tcBorders>
             <w:noWrap/>
-            <w:vAlign w:val="bottom"/>
+            <w:vAlign w:val="center"/>
           </w:tcPr>
           <w:p>
             <w:pPr>
               <w:spacing w:after="0" w:line="240" w:lineRule="auto"/>
-              <w:rPr>
-                <w:rFonts w:ascii="Segoe UI Symbol" w:eastAsia="Times New Roman" w:hAnsi="Segoe UI Symbol" w:cs="Calibri"/>
-                <w:color w:val="000000"/>
-                <w:lang w:eastAsia="en-PH"/>
-              </w:rPr>
-            </w:pPr>
-            <w:r>
-              <w:rPr>
-                <w:rFonts w:ascii="Segoe UI Symbol" w:eastAsia="Times New Roman" w:hAnsi="Segoe UI Symbol" w:cs="Calibri"/>
-                <w:color w:val="000000"/>
-                <w:lang w:eastAsia="en-PH"/>
-              </w:rPr>
-              <w:t>{cb</w:t>
-            </w:r>
-            <w:r>
-              <w:rPr>
-                <w:rFonts w:ascii="Segoe UI Symbol" w:eastAsia="Times New Roman" w:hAnsi="Segoe UI Symbol" w:cs="Calibri"/>
-                <w:color w:val="000000"/>
-                <w:lang w:eastAsia="en-PH"/>
-              </w:rPr>
-              <w:t>36</w:t>
-            </w:r>
-            <w:r>
-              <w:rPr>
-                <w:rFonts w:ascii="Segoe UI Symbol" w:eastAsia="Times New Roman" w:hAnsi="Segoe UI Symbol" w:cs="Calibri"/>
-                <w:color w:val="000000"/>
-                <w:lang w:eastAsia="en-PH"/>
-              </w:rPr>
-              <w:t>}</w:t>
+              <w:jc w:val="center"/>
+              <w:rPr>
+                <w:rFonts w:ascii="Segoe UI Symbol" w:eastAsia="Times New Roman" w:hAnsi="Segoe UI Symbol" w:cs="Calibri"/>
+                <w:color w:val="000000"/>
+                <w:sz w:val="18"/>
+                <w:szCs w:val="18"/>
+                <w:lang w:eastAsia="en-PH"/>
+              </w:rPr>
+            </w:pPr>
+            <w:r>
+              <w:rPr>
+                <w:rFonts w:ascii="Segoe UI Symbol" w:eastAsia="Times New Roman" w:hAnsi="Segoe UI Symbol" w:cs="Calibri"/>
+                <w:color w:val="000000"/>
+                <w:sz w:val="18"/>
+                <w:szCs w:val="18"/>
+                <w:lang w:eastAsia="en-PH"/>
+              </w:rPr>
+              <w:t>{b3}</w:t>
             </w:r>
           </w:p>
         </w:tc>
         <w:tc>
           <w:tcPr>
-            <w:tcW w:w="9229" w:type="dxa"/>
+            <w:tcW w:w="8973" w:type="dxa"/>
             <w:tcBorders>
-              <w:top w:val="nil"/>
-              <w:left w:val="nil"/>
-              <w:bottom w:val="nil"/>
-              <w:right w:val="nil"/>
+              <w:left w:val="single" w:sz="4" w:space="0" w:color="auto"/>
             </w:tcBorders>
             <w:noWrap/>
             <w:vAlign w:val="center"/>
@@ -6126,7 +6215,29 @@
                 <w:szCs w:val="24"/>
                 <w:lang w:eastAsia="en-PH"/>
               </w:rPr>
-              <w:t>{startup_time}</w:t>
+              <w:t>{</w:t>
+            </w:r>
+            <w:proofErr w:type="spellStart"/>
+            <w:r>
+              <w:rPr>
+                <w:rFonts w:ascii="Times New Roman" w:eastAsia="Times New Roman" w:hAnsi="Times New Roman" w:cs="Times New Roman"/>
+                <w:color w:val="000000"/>
+                <w:sz w:val="24"/>
+                <w:szCs w:val="24"/>
+                <w:lang w:eastAsia="en-PH"/>
+              </w:rPr>
+              <w:t>startup_time</w:t>
+            </w:r>
+            <w:proofErr w:type="spellEnd"/>
+            <w:r>
+              <w:rPr>
+                <w:rFonts w:ascii="Times New Roman" w:eastAsia="Times New Roman" w:hAnsi="Times New Roman" w:cs="Times New Roman"/>
+                <w:color w:val="000000"/>
+                <w:sz w:val="24"/>
+                <w:szCs w:val="24"/>
+                <w:lang w:eastAsia="en-PH"/>
+              </w:rPr>
+              <w:t>}</w:t>
             </w:r>
             <w:r>
               <w:rPr>
@@ -6281,7 +6392,25 @@
           <w:sz w:val="24"/>
           <w:szCs w:val="24"/>
         </w:rPr>
-        <w:t>{overall_findings}</w:t>
+        <w:t>{</w:t>
+      </w:r>
+      <w:proofErr w:type="spellStart"/>
+      <w:r>
+        <w:rPr>
+          <w:rFonts w:ascii="Times New Roman" w:hAnsi="Times New Roman" w:cs="Times New Roman"/>
+          <w:sz w:val="24"/>
+          <w:szCs w:val="24"/>
+        </w:rPr>
+        <w:t>overall_findings</w:t>
+      </w:r>
+      <w:proofErr w:type="spellEnd"/>
+      <w:r>
+        <w:rPr>
+          <w:rFonts w:ascii="Times New Roman" w:hAnsi="Times New Roman" w:cs="Times New Roman"/>
+          <w:sz w:val="24"/>
+          <w:szCs w:val="24"/>
+        </w:rPr>
+        <w:t>}</w:t>
       </w:r>
     </w:p>
     <w:p>
@@ -6388,6 +6517,7 @@
           <w:rFonts w:ascii="Times New Roman" w:eastAsia="Times New Roman" w:hAnsi="Times New Roman" w:cs="Times New Roman"/>
           <w:sz w:val="24"/>
           <w:szCs w:val="24"/>
+          <w:u w:val="single"/>
           <w:lang w:eastAsia="en-PH"/>
         </w:rPr>
       </w:pPr>
@@ -6396,9 +6526,42 @@
           <w:rFonts w:ascii="Times New Roman" w:eastAsia="Times New Roman" w:hAnsi="Times New Roman" w:cs="Times New Roman"/>
           <w:sz w:val="24"/>
           <w:szCs w:val="24"/>
+          <w:u w:val="single"/>
           <w:lang w:eastAsia="en-PH"/>
         </w:rPr>
-        <w:t>{inspector}</w:t>
+        <w:t>{</w:t>
+      </w:r>
+      <w:proofErr w:type="spellStart"/>
+      <w:r>
+        <w:rPr>
+          <w:rFonts w:ascii="Times New Roman" w:eastAsia="Times New Roman" w:hAnsi="Times New Roman" w:cs="Times New Roman"/>
+          <w:sz w:val="24"/>
+          <w:szCs w:val="24"/>
+          <w:u w:val="single"/>
+          <w:lang w:eastAsia="en-PH"/>
+        </w:rPr>
+        <w:t>insp</w:t>
+      </w:r>
+      <w:r>
+        <w:rPr>
+          <w:rFonts w:ascii="Times New Roman" w:eastAsia="Times New Roman" w:hAnsi="Times New Roman" w:cs="Times New Roman"/>
+          <w:sz w:val="24"/>
+          <w:szCs w:val="24"/>
+          <w:u w:val="single"/>
+          <w:lang w:eastAsia="en-PH"/>
+        </w:rPr>
+        <w:t>ected_by</w:t>
+      </w:r>
+      <w:proofErr w:type="spellEnd"/>
+      <w:r>
+        <w:rPr>
+          <w:rFonts w:ascii="Times New Roman" w:eastAsia="Times New Roman" w:hAnsi="Times New Roman" w:cs="Times New Roman"/>
+          <w:sz w:val="24"/>
+          <w:szCs w:val="24"/>
+          <w:u w:val="single"/>
+          <w:lang w:eastAsia="en-PH"/>
+        </w:rPr>
+        <w:t>}</w:t>
       </w:r>
     </w:p>
     <w:p>
@@ -8718,6 +8881,7 @@
   <w:style w:type="character" w:default="1" w:styleId="DefaultParagraphFont">
     <w:name w:val="Default Paragraph Font"/>
     <w:uiPriority w:val="1"/>
+    <w:semiHidden/>
     <w:unhideWhenUsed/>
   </w:style>
   <w:style w:type="table" w:default="1" w:styleId="TableNormal">

</xml_diff>

<commit_message>
updates in the local for the iepmc
</commit_message>
<xml_diff>
--- a/public/IEPMC.docx
+++ b/public/IEPMC.docx
@@ -937,303 +937,6 @@
           <w:u w:val="single"/>
         </w:rPr>
         <w:t>monitor_brand_model</w:t>
-      </w:r>
-      <w:proofErr w:type="spellEnd"/>
-      <w:r>
-        <w:rPr>
-          <w:rFonts w:ascii="Times New Roman" w:hAnsi="Times New Roman" w:cs="Times New Roman"/>
-          <w:sz w:val="24"/>
-          <w:szCs w:val="24"/>
-          <w:u w:val="single"/>
-        </w:rPr>
-        <w:t>}</w:t>
-      </w:r>
-    </w:p>
-    <w:p>
-      <w:pPr>
-        <w:shd w:val="clear" w:color="auto" w:fill="FFFFFF"/>
-        <w:spacing w:after="0" w:line="276" w:lineRule="auto"/>
-        <w:rPr>
-          <w:rFonts w:ascii="Times New Roman" w:hAnsi="Times New Roman" w:cs="Times New Roman"/>
-          <w:sz w:val="24"/>
-          <w:szCs w:val="24"/>
-        </w:rPr>
-      </w:pPr>
-      <w:r>
-        <w:rPr>
-          <w:rFonts w:ascii="Times New Roman" w:hAnsi="Times New Roman" w:cs="Times New Roman"/>
-          <w:sz w:val="24"/>
-          <w:szCs w:val="24"/>
-        </w:rPr>
-        <w:t>UPS Brand/Model</w:t>
-      </w:r>
-      <w:r>
-        <w:rPr>
-          <w:rFonts w:ascii="Times New Roman" w:hAnsi="Times New Roman" w:cs="Times New Roman"/>
-          <w:sz w:val="24"/>
-          <w:szCs w:val="24"/>
-        </w:rPr>
-        <w:tab/>
-      </w:r>
-      <w:r>
-        <w:rPr>
-          <w:rFonts w:ascii="Times New Roman" w:hAnsi="Times New Roman" w:cs="Times New Roman"/>
-          <w:sz w:val="24"/>
-          <w:szCs w:val="24"/>
-        </w:rPr>
-        <w:tab/>
-        <w:t>:</w:t>
-      </w:r>
-      <w:r>
-        <w:rPr>
-          <w:rFonts w:ascii="Times New Roman" w:hAnsi="Times New Roman" w:cs="Times New Roman"/>
-          <w:sz w:val="24"/>
-          <w:szCs w:val="24"/>
-        </w:rPr>
-        <w:tab/>
-      </w:r>
-      <w:r>
-        <w:rPr>
-          <w:rFonts w:ascii="Times New Roman" w:hAnsi="Times New Roman" w:cs="Times New Roman"/>
-          <w:sz w:val="24"/>
-          <w:szCs w:val="24"/>
-          <w:u w:val="single"/>
-        </w:rPr>
-        <w:t>{</w:t>
-      </w:r>
-      <w:proofErr w:type="spellStart"/>
-      <w:r>
-        <w:rPr>
-          <w:rFonts w:ascii="Times New Roman" w:hAnsi="Times New Roman" w:cs="Times New Roman"/>
-          <w:sz w:val="24"/>
-          <w:szCs w:val="24"/>
-          <w:u w:val="single"/>
-        </w:rPr>
-        <w:t>ups_brand</w:t>
-      </w:r>
-      <w:r>
-        <w:rPr>
-          <w:rFonts w:ascii="Times New Roman" w:hAnsi="Times New Roman" w:cs="Times New Roman"/>
-          <w:sz w:val="24"/>
-          <w:szCs w:val="24"/>
-          <w:u w:val="single"/>
-        </w:rPr>
-        <w:t>_model</w:t>
-      </w:r>
-      <w:proofErr w:type="spellEnd"/>
-      <w:r>
-        <w:rPr>
-          <w:rFonts w:ascii="Times New Roman" w:hAnsi="Times New Roman" w:cs="Times New Roman"/>
-          <w:sz w:val="24"/>
-          <w:szCs w:val="24"/>
-          <w:u w:val="single"/>
-        </w:rPr>
-        <w:t>}</w:t>
-      </w:r>
-    </w:p>
-    <w:p>
-      <w:pPr>
-        <w:shd w:val="clear" w:color="auto" w:fill="FFFFFF"/>
-        <w:spacing w:after="0" w:line="276" w:lineRule="auto"/>
-        <w:rPr>
-          <w:rFonts w:ascii="Times New Roman" w:hAnsi="Times New Roman" w:cs="Times New Roman"/>
-          <w:sz w:val="24"/>
-          <w:szCs w:val="24"/>
-        </w:rPr>
-      </w:pPr>
-      <w:r>
-        <w:rPr>
-          <w:rFonts w:ascii="Times New Roman" w:hAnsi="Times New Roman" w:cs="Times New Roman"/>
-          <w:sz w:val="24"/>
-          <w:szCs w:val="24"/>
-        </w:rPr>
-        <w:t>Printer</w:t>
-      </w:r>
-      <w:r>
-        <w:rPr>
-          <w:rFonts w:ascii="Times New Roman" w:hAnsi="Times New Roman" w:cs="Times New Roman"/>
-          <w:sz w:val="24"/>
-          <w:szCs w:val="24"/>
-        </w:rPr>
-        <w:tab/>
-      </w:r>
-      <w:r>
-        <w:rPr>
-          <w:rFonts w:ascii="Times New Roman" w:hAnsi="Times New Roman" w:cs="Times New Roman"/>
-          <w:sz w:val="24"/>
-          <w:szCs w:val="24"/>
-        </w:rPr>
-        <w:tab/>
-      </w:r>
-      <w:r>
-        <w:rPr>
-          <w:rFonts w:ascii="Times New Roman" w:hAnsi="Times New Roman" w:cs="Times New Roman"/>
-          <w:sz w:val="24"/>
-          <w:szCs w:val="24"/>
-        </w:rPr>
-        <w:tab/>
-      </w:r>
-      <w:r>
-        <w:rPr>
-          <w:rFonts w:ascii="Times New Roman" w:hAnsi="Times New Roman" w:cs="Times New Roman"/>
-          <w:sz w:val="24"/>
-          <w:szCs w:val="24"/>
-        </w:rPr>
-        <w:tab/>
-        <w:t>:</w:t>
-      </w:r>
-      <w:r>
-        <w:rPr>
-          <w:rFonts w:ascii="Times New Roman" w:hAnsi="Times New Roman" w:cs="Times New Roman"/>
-          <w:sz w:val="24"/>
-          <w:szCs w:val="24"/>
-        </w:rPr>
-        <w:tab/>
-      </w:r>
-      <w:r>
-        <w:rPr>
-          <w:rFonts w:ascii="Times New Roman" w:hAnsi="Times New Roman" w:cs="Times New Roman"/>
-          <w:sz w:val="24"/>
-          <w:szCs w:val="24"/>
-          <w:u w:val="single"/>
-        </w:rPr>
-        <w:t>{printer}</w:t>
-      </w:r>
-    </w:p>
-    <w:p>
-      <w:pPr>
-        <w:shd w:val="clear" w:color="auto" w:fill="FFFFFF"/>
-        <w:spacing w:after="0" w:line="276" w:lineRule="auto"/>
-        <w:rPr>
-          <w:rFonts w:ascii="Times New Roman" w:hAnsi="Times New Roman" w:cs="Times New Roman"/>
-          <w:sz w:val="24"/>
-          <w:szCs w:val="24"/>
-        </w:rPr>
-      </w:pPr>
-      <w:r>
-        <w:rPr>
-          <w:rFonts w:ascii="Times New Roman" w:hAnsi="Times New Roman" w:cs="Times New Roman"/>
-          <w:sz w:val="24"/>
-          <w:szCs w:val="24"/>
-        </w:rPr>
-        <w:t>Printer Serial Number</w:t>
-      </w:r>
-      <w:r>
-        <w:rPr>
-          <w:rFonts w:ascii="Times New Roman" w:hAnsi="Times New Roman" w:cs="Times New Roman"/>
-          <w:sz w:val="24"/>
-          <w:szCs w:val="24"/>
-        </w:rPr>
-        <w:tab/>
-      </w:r>
-      <w:r>
-        <w:rPr>
-          <w:rFonts w:ascii="Times New Roman" w:hAnsi="Times New Roman" w:cs="Times New Roman"/>
-          <w:sz w:val="24"/>
-          <w:szCs w:val="24"/>
-        </w:rPr>
-        <w:tab/>
-        <w:t>:</w:t>
-      </w:r>
-      <w:r>
-        <w:rPr>
-          <w:rFonts w:ascii="Times New Roman" w:hAnsi="Times New Roman" w:cs="Times New Roman"/>
-          <w:sz w:val="24"/>
-          <w:szCs w:val="24"/>
-        </w:rPr>
-        <w:tab/>
-      </w:r>
-      <w:r>
-        <w:rPr>
-          <w:rFonts w:ascii="Times New Roman" w:hAnsi="Times New Roman" w:cs="Times New Roman"/>
-          <w:sz w:val="24"/>
-          <w:szCs w:val="24"/>
-          <w:u w:val="single"/>
-        </w:rPr>
-        <w:t>{</w:t>
-      </w:r>
-      <w:proofErr w:type="spellStart"/>
-      <w:r>
-        <w:rPr>
-          <w:rFonts w:ascii="Times New Roman" w:hAnsi="Times New Roman" w:cs="Times New Roman"/>
-          <w:sz w:val="24"/>
-          <w:szCs w:val="24"/>
-          <w:u w:val="single"/>
-        </w:rPr>
-        <w:t>printer_serial_number</w:t>
-      </w:r>
-      <w:proofErr w:type="spellEnd"/>
-      <w:r>
-        <w:rPr>
-          <w:rFonts w:ascii="Times New Roman" w:hAnsi="Times New Roman" w:cs="Times New Roman"/>
-          <w:sz w:val="24"/>
-          <w:szCs w:val="24"/>
-          <w:u w:val="single"/>
-        </w:rPr>
-        <w:t>}</w:t>
-      </w:r>
-    </w:p>
-    <w:p>
-      <w:pPr>
-        <w:shd w:val="clear" w:color="auto" w:fill="FFFFFF"/>
-        <w:spacing w:after="0" w:line="276" w:lineRule="auto"/>
-        <w:rPr>
-          <w:rFonts w:ascii="Times New Roman" w:hAnsi="Times New Roman" w:cs="Times New Roman"/>
-          <w:sz w:val="24"/>
-          <w:szCs w:val="24"/>
-        </w:rPr>
-      </w:pPr>
-      <w:r>
-        <w:rPr>
-          <w:rFonts w:ascii="Times New Roman" w:hAnsi="Times New Roman" w:cs="Times New Roman"/>
-          <w:sz w:val="24"/>
-          <w:szCs w:val="24"/>
-        </w:rPr>
-        <w:t>UPS Serial Number</w:t>
-      </w:r>
-      <w:r>
-        <w:rPr>
-          <w:rFonts w:ascii="Times New Roman" w:hAnsi="Times New Roman" w:cs="Times New Roman"/>
-          <w:sz w:val="24"/>
-          <w:szCs w:val="24"/>
-        </w:rPr>
-        <w:tab/>
-      </w:r>
-      <w:r>
-        <w:rPr>
-          <w:rFonts w:ascii="Times New Roman" w:hAnsi="Times New Roman" w:cs="Times New Roman"/>
-          <w:sz w:val="24"/>
-          <w:szCs w:val="24"/>
-        </w:rPr>
-        <w:tab/>
-        <w:t>:</w:t>
-      </w:r>
-      <w:r>
-        <w:rPr>
-          <w:rFonts w:ascii="Times New Roman" w:hAnsi="Times New Roman" w:cs="Times New Roman"/>
-          <w:sz w:val="24"/>
-          <w:szCs w:val="24"/>
-        </w:rPr>
-        <w:tab/>
-      </w:r>
-      <w:r>
-        <w:rPr>
-          <w:rFonts w:ascii="Times New Roman" w:hAnsi="Times New Roman" w:cs="Times New Roman"/>
-          <w:sz w:val="24"/>
-          <w:szCs w:val="24"/>
-          <w:u w:val="single"/>
-        </w:rPr>
-        <w:t>{</w:t>
-      </w:r>
-      <w:proofErr w:type="spellStart"/>
-      <w:r>
-        <w:rPr>
-          <w:rFonts w:ascii="Times New Roman" w:hAnsi="Times New Roman" w:cs="Times New Roman"/>
-          <w:sz w:val="24"/>
-          <w:szCs w:val="24"/>
-          <w:u w:val="single"/>
-        </w:rPr>
-        <w:t>ups_serial_number</w:t>
       </w:r>
       <w:proofErr w:type="spellEnd"/>
       <w:r>
@@ -3264,7 +2967,6 @@
                 <w:szCs w:val="18"/>
                 <w:lang w:eastAsia="en-PH"/>
               </w:rPr>
-              <w:lastRenderedPageBreak/>
               <w:t>{</w:t>
             </w:r>
             <w:r>
@@ -3580,6 +3282,7 @@
                 <w:szCs w:val="18"/>
                 <w:lang w:eastAsia="en-PH"/>
               </w:rPr>
+              <w:lastRenderedPageBreak/>
               <w:t>{</w:t>
             </w:r>
             <w:r>
@@ -5179,7 +4882,125 @@
                 <w:szCs w:val="20"/>
                 <w:lang w:eastAsia="en-PH"/>
               </w:rPr>
-              <w:t>{ups}</w:t>
+              <w:t>{</w:t>
+            </w:r>
+            <w:proofErr w:type="spellStart"/>
+            <w:r>
+              <w:rPr>
+                <w:rFonts w:ascii="Times New Roman" w:eastAsia="Times New Roman" w:hAnsi="Times New Roman" w:cs="Times New Roman"/>
+                <w:sz w:val="20"/>
+                <w:szCs w:val="20"/>
+                <w:lang w:eastAsia="en-PH"/>
+              </w:rPr>
+              <w:t>ups</w:t>
+            </w:r>
+            <w:r>
+              <w:rPr>
+                <w:rFonts w:ascii="Times New Roman" w:eastAsia="Times New Roman" w:hAnsi="Times New Roman" w:cs="Times New Roman"/>
+                <w:sz w:val="20"/>
+                <w:szCs w:val="20"/>
+                <w:lang w:eastAsia="en-PH"/>
+              </w:rPr>
+              <w:t>_brand_model</w:t>
+            </w:r>
+            <w:proofErr w:type="spellEnd"/>
+            <w:r>
+              <w:rPr>
+                <w:rFonts w:ascii="Times New Roman" w:eastAsia="Times New Roman" w:hAnsi="Times New Roman" w:cs="Times New Roman"/>
+                <w:sz w:val="20"/>
+                <w:szCs w:val="20"/>
+                <w:lang w:eastAsia="en-PH"/>
+              </w:rPr>
+              <w:t>}</w:t>
+            </w:r>
+            <w:r>
+              <w:rPr>
+                <w:rFonts w:ascii="Times New Roman" w:eastAsia="Times New Roman" w:hAnsi="Times New Roman" w:cs="Times New Roman"/>
+                <w:sz w:val="20"/>
+                <w:szCs w:val="20"/>
+                <w:lang w:eastAsia="en-PH"/>
+              </w:rPr>
+              <w:t xml:space="preserve"> | {</w:t>
+            </w:r>
+            <w:proofErr w:type="spellStart"/>
+            <w:r>
+              <w:rPr>
+                <w:rFonts w:ascii="Times New Roman" w:eastAsia="Times New Roman" w:hAnsi="Times New Roman" w:cs="Times New Roman"/>
+                <w:sz w:val="20"/>
+                <w:szCs w:val="20"/>
+                <w:lang w:eastAsia="en-PH"/>
+              </w:rPr>
+              <w:t>ups_serial_number</w:t>
+            </w:r>
+            <w:proofErr w:type="spellEnd"/>
+            <w:r>
+              <w:rPr>
+                <w:rFonts w:ascii="Times New Roman" w:eastAsia="Times New Roman" w:hAnsi="Times New Roman" w:cs="Times New Roman"/>
+                <w:sz w:val="20"/>
+                <w:szCs w:val="20"/>
+                <w:lang w:eastAsia="en-PH"/>
+              </w:rPr>
+              <w:t>}</w:t>
+            </w:r>
+          </w:p>
+          <w:p>
+            <w:pPr>
+              <w:spacing w:after="0" w:line="240" w:lineRule="auto"/>
+              <w:rPr>
+                <w:rFonts w:ascii="Times New Roman" w:eastAsia="Times New Roman" w:hAnsi="Times New Roman" w:cs="Times New Roman"/>
+                <w:sz w:val="20"/>
+                <w:szCs w:val="20"/>
+                <w:lang w:eastAsia="en-PH"/>
+              </w:rPr>
+            </w:pPr>
+            <w:r>
+              <w:rPr>
+                <w:rFonts w:ascii="Times New Roman" w:eastAsia="Times New Roman" w:hAnsi="Times New Roman" w:cs="Times New Roman"/>
+                <w:sz w:val="20"/>
+                <w:szCs w:val="20"/>
+                <w:lang w:eastAsia="en-PH"/>
+              </w:rPr>
+              <w:t xml:space="preserve">              Printer {</w:t>
+            </w:r>
+            <w:proofErr w:type="spellStart"/>
+            <w:r>
+              <w:rPr>
+                <w:rFonts w:ascii="Times New Roman" w:eastAsia="Times New Roman" w:hAnsi="Times New Roman" w:cs="Times New Roman"/>
+                <w:sz w:val="20"/>
+                <w:szCs w:val="20"/>
+                <w:lang w:eastAsia="en-PH"/>
+              </w:rPr>
+              <w:t>printer_bran_model</w:t>
+            </w:r>
+            <w:proofErr w:type="spellEnd"/>
+            <w:r>
+              <w:rPr>
+                <w:rFonts w:ascii="Times New Roman" w:eastAsia="Times New Roman" w:hAnsi="Times New Roman" w:cs="Times New Roman"/>
+                <w:sz w:val="20"/>
+                <w:szCs w:val="20"/>
+                <w:lang w:eastAsia="en-PH"/>
+              </w:rPr>
+              <w:t>} | {</w:t>
+            </w:r>
+            <w:proofErr w:type="spellStart"/>
+            <w:r>
+              <w:rPr>
+                <w:rFonts w:ascii="Times New Roman" w:eastAsia="Times New Roman" w:hAnsi="Times New Roman" w:cs="Times New Roman"/>
+                <w:sz w:val="20"/>
+                <w:szCs w:val="20"/>
+                <w:lang w:eastAsia="en-PH"/>
+              </w:rPr>
+              <w:t>printer_serial_number</w:t>
+            </w:r>
+            <w:proofErr w:type="spellEnd"/>
+            <w:r>
+              <w:rPr>
+                <w:rFonts w:ascii="Times New Roman" w:eastAsia="Times New Roman" w:hAnsi="Times New Roman" w:cs="Times New Roman"/>
+                <w:sz w:val="20"/>
+                <w:szCs w:val="20"/>
+                <w:lang w:eastAsia="en-PH"/>
+              </w:rPr>
+              <w:t>}</w:t>
             </w:r>
           </w:p>
         </w:tc>
@@ -5572,6 +5393,7 @@
               <w:t>tmp</w:t>
             </w:r>
             <w:proofErr w:type="spellEnd"/>
+            <w:proofErr w:type="gramStart"/>
             <w:r>
               <w:rPr>
                 <w:rFonts w:ascii="Times New Roman" w:eastAsia="Times New Roman" w:hAnsi="Times New Roman" w:cs="Times New Roman"/>
@@ -5580,7 +5402,18 @@
                 <w:szCs w:val="24"/>
                 <w:lang w:eastAsia="en-PH"/>
               </w:rPr>
-              <w:t>/.tilde files</w:t>
+              <w:t>/.tilde</w:t>
+            </w:r>
+            <w:proofErr w:type="gramEnd"/>
+            <w:r>
+              <w:rPr>
+                <w:rFonts w:ascii="Times New Roman" w:eastAsia="Times New Roman" w:hAnsi="Times New Roman" w:cs="Times New Roman"/>
+                <w:color w:val="000000"/>
+                <w:sz w:val="24"/>
+                <w:szCs w:val="24"/>
+                <w:lang w:eastAsia="en-PH"/>
+              </w:rPr>
+              <w:t xml:space="preserve"> files</w:t>
             </w:r>
           </w:p>
         </w:tc>
@@ -6639,7 +6472,7 @@
           <w:szCs w:val="24"/>
           <w:u w:val="single"/>
         </w:rPr>
-        <w:t>RECAH JULE C. SACEDA</w:t>
+        <w:t>JAY ARWIN J. LIPAYON</w:t>
       </w:r>
     </w:p>
     <w:p>
@@ -6657,8 +6490,98 @@
           <w:sz w:val="24"/>
           <w:szCs w:val="24"/>
         </w:rPr>
-        <w:t>MIS, ICT Coordinator</w:t>
-      </w:r>
+        <w:t>EMS II</w:t>
+      </w:r>
+    </w:p>
+    <w:p>
+      <w:pPr>
+        <w:pStyle w:val="NoSpacing"/>
+        <w:rPr>
+          <w:rFonts w:ascii="Times New Roman" w:hAnsi="Times New Roman" w:cs="Times New Roman"/>
+          <w:sz w:val="24"/>
+          <w:szCs w:val="24"/>
+        </w:rPr>
+      </w:pPr>
+    </w:p>
+    <w:p>
+      <w:pPr>
+        <w:pStyle w:val="NoSpacing"/>
+        <w:rPr>
+          <w:rFonts w:ascii="Times New Roman" w:hAnsi="Times New Roman" w:cs="Times New Roman"/>
+          <w:sz w:val="24"/>
+          <w:szCs w:val="24"/>
+        </w:rPr>
+      </w:pPr>
+      <w:r>
+        <w:rPr>
+          <w:rFonts w:ascii="Times New Roman" w:hAnsi="Times New Roman" w:cs="Times New Roman"/>
+          <w:sz w:val="24"/>
+          <w:szCs w:val="24"/>
+        </w:rPr>
+        <w:t>Noted by:</w:t>
+      </w:r>
+    </w:p>
+    <w:p>
+      <w:pPr>
+        <w:pStyle w:val="NoSpacing"/>
+        <w:rPr>
+          <w:rFonts w:ascii="Times New Roman" w:hAnsi="Times New Roman" w:cs="Times New Roman"/>
+          <w:b/>
+          <w:sz w:val="24"/>
+          <w:szCs w:val="24"/>
+          <w:u w:val="single"/>
+        </w:rPr>
+      </w:pPr>
+    </w:p>
+    <w:p>
+      <w:pPr>
+        <w:pStyle w:val="NoSpacing"/>
+        <w:rPr>
+          <w:rFonts w:ascii="Times New Roman" w:hAnsi="Times New Roman" w:cs="Times New Roman"/>
+          <w:b/>
+          <w:sz w:val="24"/>
+          <w:szCs w:val="24"/>
+          <w:u w:val="single"/>
+        </w:rPr>
+      </w:pPr>
+      <w:r>
+        <w:rPr>
+          <w:rFonts w:ascii="Times New Roman" w:hAnsi="Times New Roman" w:cs="Times New Roman"/>
+          <w:b/>
+          <w:sz w:val="24"/>
+          <w:szCs w:val="24"/>
+          <w:u w:val="single"/>
+        </w:rPr>
+        <w:t>RECAH JULE C. SACEDA</w:t>
+      </w:r>
+    </w:p>
+    <w:p>
+      <w:pPr>
+        <w:pStyle w:val="NoSpacing"/>
+        <w:rPr>
+          <w:rFonts w:ascii="Times New Roman" w:hAnsi="Times New Roman" w:cs="Times New Roman"/>
+          <w:sz w:val="24"/>
+          <w:szCs w:val="24"/>
+        </w:rPr>
+      </w:pPr>
+      <w:r>
+        <w:rPr>
+          <w:rFonts w:ascii="Times New Roman" w:hAnsi="Times New Roman" w:cs="Times New Roman"/>
+          <w:sz w:val="24"/>
+          <w:szCs w:val="24"/>
+        </w:rPr>
+        <w:t>PISMU HEAD, ICT Coordinator</w:t>
+      </w:r>
+    </w:p>
+    <w:p>
+      <w:pPr>
+        <w:pStyle w:val="NoSpacing"/>
+        <w:rPr>
+          <w:rFonts w:ascii="Times New Roman" w:hAnsi="Times New Roman" w:cs="Times New Roman"/>
+          <w:sz w:val="24"/>
+          <w:szCs w:val="24"/>
+        </w:rPr>
+      </w:pPr>
     </w:p>
     <w:sectPr>
       <w:headerReference w:type="even" r:id="rId10"/>
@@ -6768,6 +6691,7 @@
       </w:rPr>
       <w:tab/>
     </w:r>
+    <w:proofErr w:type="gramStart"/>
     <w:r>
       <w:rPr>
         <w:color w:val="FF0000"/>
@@ -6781,6 +6705,7 @@
       </w:rPr>
       <w:t>01</w:t>
     </w:r>
+    <w:proofErr w:type="gramEnd"/>
     <w:r>
       <w:rPr>
         <w:color w:val="FF0000"/>

</xml_diff>

<commit_message>
created eia corner feature
</commit_message>
<xml_diff>
--- a/public/IEPMC.docx
+++ b/public/IEPMC.docx
@@ -4960,27 +4960,7 @@
                 <w:szCs w:val="20"/>
                 <w:lang w:eastAsia="en-PH"/>
               </w:rPr>
-              <w:t xml:space="preserve">              Printer {</w:t>
-            </w:r>
-            <w:proofErr w:type="spellStart"/>
-            <w:r>
-              <w:rPr>
-                <w:rFonts w:ascii="Times New Roman" w:eastAsia="Times New Roman" w:hAnsi="Times New Roman" w:cs="Times New Roman"/>
-                <w:sz w:val="20"/>
-                <w:szCs w:val="20"/>
-                <w:lang w:eastAsia="en-PH"/>
-              </w:rPr>
-              <w:t>printer_bran_model</w:t>
-            </w:r>
-            <w:proofErr w:type="spellEnd"/>
-            <w:r>
-              <w:rPr>
-                <w:rFonts w:ascii="Times New Roman" w:eastAsia="Times New Roman" w:hAnsi="Times New Roman" w:cs="Times New Roman"/>
-                <w:sz w:val="20"/>
-                <w:szCs w:val="20"/>
-                <w:lang w:eastAsia="en-PH"/>
-              </w:rPr>
-              <w:t>} | {</w:t>
+              <w:t xml:space="preserve">              Printer {printer} | {</w:t>
             </w:r>
             <w:proofErr w:type="spellStart"/>
             <w:r>
@@ -5393,7 +5373,6 @@
               <w:t>tmp</w:t>
             </w:r>
             <w:proofErr w:type="spellEnd"/>
-            <w:proofErr w:type="gramStart"/>
             <w:r>
               <w:rPr>
                 <w:rFonts w:ascii="Times New Roman" w:eastAsia="Times New Roman" w:hAnsi="Times New Roman" w:cs="Times New Roman"/>
@@ -5402,18 +5381,7 @@
                 <w:szCs w:val="24"/>
                 <w:lang w:eastAsia="en-PH"/>
               </w:rPr>
-              <w:t>/.tilde</w:t>
-            </w:r>
-            <w:proofErr w:type="gramEnd"/>
-            <w:r>
-              <w:rPr>
-                <w:rFonts w:ascii="Times New Roman" w:eastAsia="Times New Roman" w:hAnsi="Times New Roman" w:cs="Times New Roman"/>
-                <w:color w:val="000000"/>
-                <w:sz w:val="24"/>
-                <w:szCs w:val="24"/>
-                <w:lang w:eastAsia="en-PH"/>
-              </w:rPr>
-              <w:t xml:space="preserve"> files</w:t>
+              <w:t>/.tilde files</w:t>
             </w:r>
           </w:p>
         </w:tc>
@@ -6348,6 +6316,8 @@
         <w:spacing w:after="0" w:line="276" w:lineRule="auto"/>
         <w:rPr>
           <w:rFonts w:ascii="Times New Roman" w:eastAsia="Times New Roman" w:hAnsi="Times New Roman" w:cs="Times New Roman"/>
+          <w:b/>
+          <w:bCs/>
           <w:sz w:val="24"/>
           <w:szCs w:val="24"/>
           <w:u w:val="single"/>
@@ -6357,6 +6327,8 @@
       <w:r>
         <w:rPr>
           <w:rFonts w:ascii="Times New Roman" w:eastAsia="Times New Roman" w:hAnsi="Times New Roman" w:cs="Times New Roman"/>
+          <w:b/>
+          <w:bCs/>
           <w:sz w:val="24"/>
           <w:szCs w:val="24"/>
           <w:u w:val="single"/>
@@ -6368,6 +6340,8 @@
       <w:r>
         <w:rPr>
           <w:rFonts w:ascii="Times New Roman" w:eastAsia="Times New Roman" w:hAnsi="Times New Roman" w:cs="Times New Roman"/>
+          <w:b/>
+          <w:bCs/>
           <w:sz w:val="24"/>
           <w:szCs w:val="24"/>
           <w:u w:val="single"/>
@@ -6378,6 +6352,8 @@
       <w:r>
         <w:rPr>
           <w:rFonts w:ascii="Times New Roman" w:eastAsia="Times New Roman" w:hAnsi="Times New Roman" w:cs="Times New Roman"/>
+          <w:b/>
+          <w:bCs/>
           <w:sz w:val="24"/>
           <w:szCs w:val="24"/>
           <w:u w:val="single"/>
@@ -6389,6 +6365,8 @@
       <w:r>
         <w:rPr>
           <w:rFonts w:ascii="Times New Roman" w:eastAsia="Times New Roman" w:hAnsi="Times New Roman" w:cs="Times New Roman"/>
+          <w:b/>
+          <w:bCs/>
           <w:sz w:val="24"/>
           <w:szCs w:val="24"/>
           <w:u w:val="single"/>
@@ -6691,7 +6669,6 @@
       </w:rPr>
       <w:tab/>
     </w:r>
-    <w:proofErr w:type="gramStart"/>
     <w:r>
       <w:rPr>
         <w:color w:val="FF0000"/>
@@ -6705,7 +6682,6 @@
       </w:rPr>
       <w:t>01</w:t>
     </w:r>
-    <w:proofErr w:type="gramEnd"/>
     <w:r>
       <w:rPr>
         <w:color w:val="FF0000"/>
@@ -9271,12 +9247,9 @@
 </file>
 
 <file path=customXml/item1.xml><?xml version="1.0" encoding="utf-8"?>
-<?mso-contentType ?>
-<FormTemplates xmlns="http://schemas.microsoft.com/sharepoint/v3/contenttype/forms">
-  <Display>DocumentLibraryForm</Display>
-  <Edit>DocumentLibraryForm</Edit>
-  <New>DocumentLibraryForm</New>
-</FormTemplates>
+<p:properties xmlns:p="http://schemas.microsoft.com/office/2006/metadata/properties" xmlns:xsi="http://www.w3.org/2001/XMLSchema-instance" xmlns:pc="http://schemas.microsoft.com/office/infopath/2007/PartnerControls">
+  <documentManagement/>
+</p:properties>
 </file>
 
 <file path=customXml/item2.xml><?xml version="1.0" encoding="utf-8"?>
@@ -9450,15 +9423,19 @@
 </file>
 
 <file path=customXml/item3.xml><?xml version="1.0" encoding="utf-8"?>
-<p:properties xmlns:p="http://schemas.microsoft.com/office/2006/metadata/properties" xmlns:xsi="http://www.w3.org/2001/XMLSchema-instance" xmlns:pc="http://schemas.microsoft.com/office/infopath/2007/PartnerControls">
-  <documentManagement/>
-</p:properties>
+<?mso-contentType ?>
+<FormTemplates xmlns="http://schemas.microsoft.com/sharepoint/v3/contenttype/forms">
+  <Display>DocumentLibraryForm</Display>
+  <Edit>DocumentLibraryForm</Edit>
+  <New>DocumentLibraryForm</New>
+</FormTemplates>
 </file>
 
 <file path=customXml/itemProps1.xml><?xml version="1.0" encoding="utf-8"?>
-<ds:datastoreItem xmlns:ds="http://schemas.openxmlformats.org/officeDocument/2006/customXml" ds:itemID="{D693F720-A94E-4375-B386-214489AC1556}">
+<ds:datastoreItem xmlns:ds="http://schemas.openxmlformats.org/officeDocument/2006/customXml" ds:itemID="{50AD4491-5813-4F1D-95F8-D96F79AB56D3}">
   <ds:schemaRefs>
-    <ds:schemaRef ds:uri="http://schemas.microsoft.com/sharepoint/v3/contenttype/forms"/>
+    <ds:schemaRef ds:uri="http://schemas.microsoft.com/office/2006/metadata/properties"/>
+    <ds:schemaRef ds:uri="http://schemas.microsoft.com/office/infopath/2007/PartnerControls"/>
   </ds:schemaRefs>
 </ds:datastoreItem>
 </file>
@@ -9482,10 +9459,9 @@
 </file>
 
 <file path=customXml/itemProps3.xml><?xml version="1.0" encoding="utf-8"?>
-<ds:datastoreItem xmlns:ds="http://schemas.openxmlformats.org/officeDocument/2006/customXml" ds:itemID="{50AD4491-5813-4F1D-95F8-D96F79AB56D3}">
+<ds:datastoreItem xmlns:ds="http://schemas.openxmlformats.org/officeDocument/2006/customXml" ds:itemID="{D693F720-A94E-4375-B386-214489AC1556}">
   <ds:schemaRefs>
-    <ds:schemaRef ds:uri="http://schemas.microsoft.com/office/2006/metadata/properties"/>
-    <ds:schemaRef ds:uri="http://schemas.microsoft.com/office/infopath/2007/PartnerControls"/>
+    <ds:schemaRef ds:uri="http://schemas.microsoft.com/sharepoint/v3/contenttype/forms"/>
   </ds:schemaRefs>
 </ds:datastoreItem>
 </file>
</xml_diff>

<commit_message>
production updates for routes and iepmc file
</commit_message>
<xml_diff>
--- a/public/IEPMC.docx
+++ b/public/IEPMC.docx
@@ -4960,27 +4960,7 @@
                 <w:szCs w:val="20"/>
                 <w:lang w:eastAsia="en-PH"/>
               </w:rPr>
-              <w:t xml:space="preserve">              Printer {</w:t>
-            </w:r>
-            <w:proofErr w:type="spellStart"/>
-            <w:r>
-              <w:rPr>
-                <w:rFonts w:ascii="Times New Roman" w:eastAsia="Times New Roman" w:hAnsi="Times New Roman" w:cs="Times New Roman"/>
-                <w:sz w:val="20"/>
-                <w:szCs w:val="20"/>
-                <w:lang w:eastAsia="en-PH"/>
-              </w:rPr>
-              <w:t>printer_bran_model</w:t>
-            </w:r>
-            <w:proofErr w:type="spellEnd"/>
-            <w:r>
-              <w:rPr>
-                <w:rFonts w:ascii="Times New Roman" w:eastAsia="Times New Roman" w:hAnsi="Times New Roman" w:cs="Times New Roman"/>
-                <w:sz w:val="20"/>
-                <w:szCs w:val="20"/>
-                <w:lang w:eastAsia="en-PH"/>
-              </w:rPr>
-              <w:t>} | {</w:t>
+              <w:t xml:space="preserve">              Printer {printer} | {</w:t>
             </w:r>
             <w:proofErr w:type="spellStart"/>
             <w:r>
@@ -5393,7 +5373,6 @@
               <w:t>tmp</w:t>
             </w:r>
             <w:proofErr w:type="spellEnd"/>
-            <w:proofErr w:type="gramStart"/>
             <w:r>
               <w:rPr>
                 <w:rFonts w:ascii="Times New Roman" w:eastAsia="Times New Roman" w:hAnsi="Times New Roman" w:cs="Times New Roman"/>
@@ -5402,18 +5381,7 @@
                 <w:szCs w:val="24"/>
                 <w:lang w:eastAsia="en-PH"/>
               </w:rPr>
-              <w:t>/.tilde</w:t>
-            </w:r>
-            <w:proofErr w:type="gramEnd"/>
-            <w:r>
-              <w:rPr>
-                <w:rFonts w:ascii="Times New Roman" w:eastAsia="Times New Roman" w:hAnsi="Times New Roman" w:cs="Times New Roman"/>
-                <w:color w:val="000000"/>
-                <w:sz w:val="24"/>
-                <w:szCs w:val="24"/>
-                <w:lang w:eastAsia="en-PH"/>
-              </w:rPr>
-              <w:t xml:space="preserve"> files</w:t>
+              <w:t>/.tilde files</w:t>
             </w:r>
           </w:p>
         </w:tc>
@@ -6348,6 +6316,8 @@
         <w:spacing w:after="0" w:line="276" w:lineRule="auto"/>
         <w:rPr>
           <w:rFonts w:ascii="Times New Roman" w:eastAsia="Times New Roman" w:hAnsi="Times New Roman" w:cs="Times New Roman"/>
+          <w:b/>
+          <w:bCs/>
           <w:sz w:val="24"/>
           <w:szCs w:val="24"/>
           <w:u w:val="single"/>
@@ -6357,6 +6327,8 @@
       <w:r>
         <w:rPr>
           <w:rFonts w:ascii="Times New Roman" w:eastAsia="Times New Roman" w:hAnsi="Times New Roman" w:cs="Times New Roman"/>
+          <w:b/>
+          <w:bCs/>
           <w:sz w:val="24"/>
           <w:szCs w:val="24"/>
           <w:u w:val="single"/>
@@ -6368,6 +6340,8 @@
       <w:r>
         <w:rPr>
           <w:rFonts w:ascii="Times New Roman" w:eastAsia="Times New Roman" w:hAnsi="Times New Roman" w:cs="Times New Roman"/>
+          <w:b/>
+          <w:bCs/>
           <w:sz w:val="24"/>
           <w:szCs w:val="24"/>
           <w:u w:val="single"/>
@@ -6378,6 +6352,8 @@
       <w:r>
         <w:rPr>
           <w:rFonts w:ascii="Times New Roman" w:eastAsia="Times New Roman" w:hAnsi="Times New Roman" w:cs="Times New Roman"/>
+          <w:b/>
+          <w:bCs/>
           <w:sz w:val="24"/>
           <w:szCs w:val="24"/>
           <w:u w:val="single"/>
@@ -6389,6 +6365,8 @@
       <w:r>
         <w:rPr>
           <w:rFonts w:ascii="Times New Roman" w:eastAsia="Times New Roman" w:hAnsi="Times New Roman" w:cs="Times New Roman"/>
+          <w:b/>
+          <w:bCs/>
           <w:sz w:val="24"/>
           <w:szCs w:val="24"/>
           <w:u w:val="single"/>
@@ -6691,7 +6669,6 @@
       </w:rPr>
       <w:tab/>
     </w:r>
-    <w:proofErr w:type="gramStart"/>
     <w:r>
       <w:rPr>
         <w:color w:val="FF0000"/>
@@ -6705,7 +6682,6 @@
       </w:rPr>
       <w:t>01</w:t>
     </w:r>
-    <w:proofErr w:type="gramEnd"/>
     <w:r>
       <w:rPr>
         <w:color w:val="FF0000"/>
@@ -9271,12 +9247,9 @@
 </file>
 
 <file path=customXml/item1.xml><?xml version="1.0" encoding="utf-8"?>
-<?mso-contentType ?>
-<FormTemplates xmlns="http://schemas.microsoft.com/sharepoint/v3/contenttype/forms">
-  <Display>DocumentLibraryForm</Display>
-  <Edit>DocumentLibraryForm</Edit>
-  <New>DocumentLibraryForm</New>
-</FormTemplates>
+<p:properties xmlns:p="http://schemas.microsoft.com/office/2006/metadata/properties" xmlns:xsi="http://www.w3.org/2001/XMLSchema-instance" xmlns:pc="http://schemas.microsoft.com/office/infopath/2007/PartnerControls">
+  <documentManagement/>
+</p:properties>
 </file>
 
 <file path=customXml/item2.xml><?xml version="1.0" encoding="utf-8"?>
@@ -9450,15 +9423,19 @@
 </file>
 
 <file path=customXml/item3.xml><?xml version="1.0" encoding="utf-8"?>
-<p:properties xmlns:p="http://schemas.microsoft.com/office/2006/metadata/properties" xmlns:xsi="http://www.w3.org/2001/XMLSchema-instance" xmlns:pc="http://schemas.microsoft.com/office/infopath/2007/PartnerControls">
-  <documentManagement/>
-</p:properties>
+<?mso-contentType ?>
+<FormTemplates xmlns="http://schemas.microsoft.com/sharepoint/v3/contenttype/forms">
+  <Display>DocumentLibraryForm</Display>
+  <Edit>DocumentLibraryForm</Edit>
+  <New>DocumentLibraryForm</New>
+</FormTemplates>
 </file>
 
 <file path=customXml/itemProps1.xml><?xml version="1.0" encoding="utf-8"?>
-<ds:datastoreItem xmlns:ds="http://schemas.openxmlformats.org/officeDocument/2006/customXml" ds:itemID="{D693F720-A94E-4375-B386-214489AC1556}">
+<ds:datastoreItem xmlns:ds="http://schemas.openxmlformats.org/officeDocument/2006/customXml" ds:itemID="{50AD4491-5813-4F1D-95F8-D96F79AB56D3}">
   <ds:schemaRefs>
-    <ds:schemaRef ds:uri="http://schemas.microsoft.com/sharepoint/v3/contenttype/forms"/>
+    <ds:schemaRef ds:uri="http://schemas.microsoft.com/office/2006/metadata/properties"/>
+    <ds:schemaRef ds:uri="http://schemas.microsoft.com/office/infopath/2007/PartnerControls"/>
   </ds:schemaRefs>
 </ds:datastoreItem>
 </file>
@@ -9482,10 +9459,9 @@
 </file>
 
 <file path=customXml/itemProps3.xml><?xml version="1.0" encoding="utf-8"?>
-<ds:datastoreItem xmlns:ds="http://schemas.openxmlformats.org/officeDocument/2006/customXml" ds:itemID="{50AD4491-5813-4F1D-95F8-D96F79AB56D3}">
+<ds:datastoreItem xmlns:ds="http://schemas.openxmlformats.org/officeDocument/2006/customXml" ds:itemID="{D693F720-A94E-4375-B386-214489AC1556}">
   <ds:schemaRefs>
-    <ds:schemaRef ds:uri="http://schemas.microsoft.com/office/2006/metadata/properties"/>
-    <ds:schemaRef ds:uri="http://schemas.microsoft.com/office/infopath/2007/PartnerControls"/>
+    <ds:schemaRef ds:uri="http://schemas.microsoft.com/sharepoint/v3/contenttype/forms"/>
   </ds:schemaRefs>
 </ds:datastoreItem>
 </file>
</xml_diff>